<commit_message>
docs: cria relatório da semama 3.3
</commit_message>
<xml_diff>
--- a/docs/Relatório Técnico Completo.docx
+++ b/docs/Relatório Técnico Completo.docx
@@ -6059,19 +6059,7 @@
         <w:pStyle w:val="Identificao"/>
       </w:pPr>
       <w:r>
-        <w:t xml:space="preserve">Relatório Técnico – Semana </w:t>
-      </w:r>
-      <w:r>
-        <w:t>3</w:t>
-      </w:r>
-      <w:r>
-        <w:t xml:space="preserve"> (</w:t>
-      </w:r>
-      <w:r>
-        <w:t>12 de novembro</w:t>
-      </w:r>
-      <w:r>
-        <w:t xml:space="preserve"> de 2025)</w:t>
+        <w:t>Relatório Técnico – Semana 3 (12 de novembro de 2025)</w:t>
       </w:r>
     </w:p>
     <w:p>
@@ -6117,8 +6105,14 @@
     <w:p>
       <w:pPr>
         <w:pStyle w:val="Ttulo1"/>
-      </w:pPr>
-      <w:r>
+        <w:rPr>
+          <w:lang w:val="pt-PT"/>
+        </w:rPr>
+      </w:pPr>
+      <w:r>
+        <w:rPr>
+          <w:lang w:val="pt-PT"/>
+        </w:rPr>
         <w:t>1 Introdução</w:t>
       </w:r>
     </w:p>
@@ -6284,21 +6278,74 @@
         <w:rPr>
           <w:lang w:val="pt-PT"/>
         </w:rPr>
-        <w:t xml:space="preserve">2. </w:t>
-      </w:r>
-      <w:proofErr w:type="spellStart"/>
-      <w:r>
-        <w:rPr>
-          <w:lang w:val="pt-PT"/>
-        </w:rPr>
-        <w:t>Prompt</w:t>
-      </w:r>
-      <w:proofErr w:type="spellEnd"/>
-      <w:r>
-        <w:rPr>
-          <w:lang w:val="pt-PT"/>
-        </w:rPr>
-        <w:t xml:space="preserve"> Utilizado para Execução da </w:t>
+        <w:t>2. Prompt Utilizado para Execução da Issue 3.2</w:t>
+      </w:r>
+    </w:p>
+    <w:p>
+      <w:pPr>
+        <w:rPr>
+          <w:lang w:val="pt-PT"/>
+        </w:rPr>
+      </w:pPr>
+      <w:r>
+        <w:rPr>
+          <w:lang w:val="pt-PT"/>
+        </w:rPr>
+        <w:t xml:space="preserve">Conforme exigido pelo professor, segue abaixo o </w:t>
+      </w:r>
+      <w:proofErr w:type="spellStart"/>
+      <w:r>
+        <w:rPr>
+          <w:lang w:val="pt-PT"/>
+        </w:rPr>
+        <w:t>prompt</w:t>
+      </w:r>
+      <w:proofErr w:type="spellEnd"/>
+      <w:r>
+        <w:rPr>
+          <w:lang w:val="pt-PT"/>
+        </w:rPr>
+        <w:t xml:space="preserve"> integral utilizado para orientar esta etapa do projeto:</w:t>
+      </w:r>
+    </w:p>
+    <w:p>
+      <w:pPr>
+        <w:rPr>
+          <w:lang w:val="pt-PT"/>
+        </w:rPr>
+      </w:pPr>
+      <w:r>
+        <w:rPr>
+          <w:lang w:val="pt-PT"/>
+        </w:rPr>
+        <w:t xml:space="preserve">Atue como um Cientista de Dados Sênior, especialista em análise interpretativa, </w:t>
+      </w:r>
+      <w:proofErr w:type="spellStart"/>
+      <w:r>
+        <w:rPr>
+          <w:lang w:val="pt-PT"/>
+        </w:rPr>
+        <w:t>storytelling</w:t>
+      </w:r>
+      <w:proofErr w:type="spellEnd"/>
+      <w:r>
+        <w:rPr>
+          <w:lang w:val="pt-PT"/>
+        </w:rPr>
+        <w:t xml:space="preserve"> com dados, estatística descritiva e análise cultural/mercadológica aplicada ao mercado musical.</w:t>
+      </w:r>
+    </w:p>
+    <w:p>
+      <w:pPr>
+        <w:rPr>
+          <w:lang w:val="pt-PT"/>
+        </w:rPr>
+      </w:pPr>
+      <w:r>
+        <w:rPr>
+          <w:lang w:val="pt-PT"/>
+        </w:rPr>
+        <w:t xml:space="preserve">Com base nas visualizações e análises produzidas na Semana 3.1 (EDA), quero que você realize a </w:t>
       </w:r>
       <w:proofErr w:type="spellStart"/>
       <w:r>
@@ -6312,101 +6359,28 @@
         <w:rPr>
           <w:lang w:val="pt-PT"/>
         </w:rPr>
-        <w:t xml:space="preserve"> 3.2</w:t>
-      </w:r>
-    </w:p>
-    <w:p>
-      <w:pPr>
-        <w:rPr>
-          <w:lang w:val="pt-PT"/>
-        </w:rPr>
-      </w:pPr>
-      <w:r>
-        <w:rPr>
-          <w:lang w:val="pt-PT"/>
-        </w:rPr>
-        <w:t xml:space="preserve">Conforme exigido pelo professor, segue abaixo o </w:t>
-      </w:r>
-      <w:proofErr w:type="spellStart"/>
-      <w:r>
-        <w:rPr>
-          <w:lang w:val="pt-PT"/>
-        </w:rPr>
-        <w:t>prompt</w:t>
-      </w:r>
-      <w:proofErr w:type="spellEnd"/>
-      <w:r>
-        <w:rPr>
-          <w:lang w:val="pt-PT"/>
-        </w:rPr>
-        <w:t xml:space="preserve"> integral utilizado para orientar esta etapa do projeto:</w:t>
-      </w:r>
-    </w:p>
-    <w:p>
-      <w:pPr>
-        <w:rPr>
-          <w:lang w:val="pt-PT"/>
-        </w:rPr>
-      </w:pPr>
-      <w:r>
-        <w:rPr>
-          <w:lang w:val="pt-PT"/>
-        </w:rPr>
-        <w:t xml:space="preserve">Atue como um Cientista de Dados Sênior, especialista em análise interpretativa, </w:t>
-      </w:r>
-      <w:proofErr w:type="spellStart"/>
-      <w:r>
-        <w:rPr>
-          <w:lang w:val="pt-PT"/>
-        </w:rPr>
-        <w:t>storytelling</w:t>
-      </w:r>
-      <w:proofErr w:type="spellEnd"/>
-      <w:r>
-        <w:rPr>
-          <w:lang w:val="pt-PT"/>
-        </w:rPr>
-        <w:t xml:space="preserve"> com dados, estatística descritiva e análise cultural/mercadológica aplicada ao mercado musical.</w:t>
-      </w:r>
-    </w:p>
-    <w:p>
-      <w:pPr>
-        <w:rPr>
-          <w:lang w:val="pt-PT"/>
-        </w:rPr>
-      </w:pPr>
-      <w:r>
-        <w:rPr>
-          <w:lang w:val="pt-PT"/>
-        </w:rPr>
-        <w:t xml:space="preserve">Com base nas visualizações e análises produzidas na Semana 3.1 (EDA), quero que você realize a </w:t>
-      </w:r>
-      <w:proofErr w:type="spellStart"/>
-      <w:r>
-        <w:rPr>
-          <w:lang w:val="pt-PT"/>
-        </w:rPr>
-        <w:t>Issue</w:t>
-      </w:r>
-      <w:proofErr w:type="spellEnd"/>
-      <w:r>
-        <w:rPr>
-          <w:lang w:val="pt-PT"/>
-        </w:rPr>
         <w:t xml:space="preserve"> da Semana 3.2, seguindo rigorosamente as etapas abaixo.</w:t>
       </w:r>
     </w:p>
     <w:p>
       <w:pPr>
         <w:rPr>
-          <w:lang w:val="pt-PT"/>
-        </w:rPr>
-      </w:pPr>
-      <w:r>
-        <w:rPr>
-          <w:lang w:val="pt-PT"/>
-        </w:rPr>
-        <w:t># 1. Interpretação Estatística Avançada</w:t>
+          <w:b/>
+          <w:bCs/>
+          <w:i/>
+          <w:iCs/>
+          <w:lang w:val="pt-PT"/>
+        </w:rPr>
+      </w:pPr>
+      <w:r>
+        <w:rPr>
+          <w:b/>
+          <w:bCs/>
+          <w:i/>
+          <w:iCs/>
+          <w:lang w:val="pt-PT"/>
+        </w:rPr>
+        <w:t>1. Interpretação Estatística Avançada</w:t>
       </w:r>
     </w:p>
     <w:p>
@@ -6495,14 +6469,22 @@
     <w:p>
       <w:pPr>
         <w:rPr>
-          <w:lang w:val="pt-PT"/>
-        </w:rPr>
-      </w:pPr>
-      <w:r>
-        <w:rPr>
-          <w:lang w:val="pt-PT"/>
-        </w:rPr>
-        <w:t># 2. Tendências e Correlações</w:t>
+          <w:b/>
+          <w:bCs/>
+          <w:i/>
+          <w:iCs/>
+          <w:lang w:val="pt-PT"/>
+        </w:rPr>
+      </w:pPr>
+      <w:r>
+        <w:rPr>
+          <w:b/>
+          <w:bCs/>
+          <w:i/>
+          <w:iCs/>
+          <w:lang w:val="pt-PT"/>
+        </w:rPr>
+        <w:t>2. Tendências e Correlações</w:t>
       </w:r>
     </w:p>
     <w:p>
@@ -6534,14 +6516,22 @@
     <w:p>
       <w:pPr>
         <w:rPr>
-          <w:lang w:val="pt-PT"/>
-        </w:rPr>
-      </w:pPr>
-      <w:r>
-        <w:rPr>
-          <w:lang w:val="pt-PT"/>
-        </w:rPr>
-        <w:t># 3. Classificação de Padrões</w:t>
+          <w:b/>
+          <w:bCs/>
+          <w:i/>
+          <w:iCs/>
+          <w:lang w:val="pt-PT"/>
+        </w:rPr>
+      </w:pPr>
+      <w:r>
+        <w:rPr>
+          <w:b/>
+          <w:bCs/>
+          <w:i/>
+          <w:iCs/>
+          <w:lang w:val="pt-PT"/>
+        </w:rPr>
+        <w:t>3. Classificação de Padrões</w:t>
       </w:r>
     </w:p>
     <w:p>
@@ -6573,14 +6563,18 @@
     <w:p>
       <w:pPr>
         <w:rPr>
-          <w:lang w:val="pt-PT"/>
-        </w:rPr>
-      </w:pPr>
-      <w:r>
-        <w:rPr>
-          <w:lang w:val="pt-PT"/>
-        </w:rPr>
-        <w:t># 4. Interpretação das Visualizações da EDA</w:t>
+          <w:b/>
+          <w:i/>
+          <w:lang w:val="pt-PT"/>
+        </w:rPr>
+      </w:pPr>
+      <w:r>
+        <w:rPr>
+          <w:b/>
+          <w:i/>
+          <w:lang w:val="pt-PT"/>
+        </w:rPr>
+        <w:t>4. Interpretação das Visualizações da EDA</w:t>
       </w:r>
     </w:p>
     <w:p>
@@ -6613,14 +6607,22 @@
     <w:p>
       <w:pPr>
         <w:rPr>
-          <w:lang w:val="pt-PT"/>
-        </w:rPr>
-      </w:pPr>
-      <w:r>
-        <w:rPr>
-          <w:lang w:val="pt-PT"/>
-        </w:rPr>
-        <w:t># 5. Análise Narrativa Final</w:t>
+          <w:b/>
+          <w:bCs/>
+          <w:i/>
+          <w:iCs/>
+          <w:lang w:val="pt-PT"/>
+        </w:rPr>
+      </w:pPr>
+      <w:r>
+        <w:rPr>
+          <w:b/>
+          <w:bCs/>
+          <w:i/>
+          <w:iCs/>
+          <w:lang w:val="pt-PT"/>
+        </w:rPr>
+        <w:t>5. Análise Narrativa Final</w:t>
       </w:r>
     </w:p>
     <w:p>
@@ -6667,14 +6669,22 @@
     <w:p>
       <w:pPr>
         <w:rPr>
-          <w:lang w:val="pt-PT"/>
-        </w:rPr>
-      </w:pPr>
-      <w:r>
-        <w:rPr>
-          <w:lang w:val="pt-PT"/>
-        </w:rPr>
-        <w:t># 6. Insights Culturais e Mercadológicos</w:t>
+          <w:b/>
+          <w:bCs/>
+          <w:i/>
+          <w:iCs/>
+          <w:lang w:val="pt-PT"/>
+        </w:rPr>
+      </w:pPr>
+      <w:r>
+        <w:rPr>
+          <w:b/>
+          <w:bCs/>
+          <w:i/>
+          <w:iCs/>
+          <w:lang w:val="pt-PT"/>
+        </w:rPr>
+        <w:t>6. Insights Culturais e Mercadológicos</w:t>
       </w:r>
     </w:p>
     <w:p>
@@ -6693,14 +6703,22 @@
     <w:p>
       <w:pPr>
         <w:rPr>
-          <w:lang w:val="pt-PT"/>
-        </w:rPr>
-      </w:pPr>
-      <w:r>
-        <w:rPr>
-          <w:lang w:val="pt-PT"/>
-        </w:rPr>
-        <w:t># 7. Entrega Consolidada</w:t>
+          <w:b/>
+          <w:bCs/>
+          <w:i/>
+          <w:iCs/>
+          <w:lang w:val="pt-PT"/>
+        </w:rPr>
+      </w:pPr>
+      <w:r>
+        <w:rPr>
+          <w:b/>
+          <w:bCs/>
+          <w:i/>
+          <w:iCs/>
+          <w:lang w:val="pt-PT"/>
+        </w:rPr>
+        <w:t>7. Entrega Consolidada</w:t>
       </w:r>
     </w:p>
     <w:p>
@@ -6828,22 +6846,27 @@
     </w:p>
     <w:p>
       <w:pPr>
-        <w:rPr>
-          <w:lang w:val="pt-PT"/>
-        </w:rPr>
-      </w:pPr>
-      <w:r>
-        <w:rPr>
-          <w:lang w:val="pt-PT"/>
-        </w:rPr>
-        <w:t>popularidade: bi</w:t>
-      </w:r>
-      <w:proofErr w:type="spellStart"/>
-      <w:r>
-        <w:rPr>
-          <w:lang w:val="pt-PT"/>
-        </w:rPr>
-        <w:t>modal</w:t>
+        <w:pStyle w:val="PargrafodaLista"/>
+        <w:numPr>
+          <w:ilvl w:val="0"/>
+          <w:numId w:val="11"/>
+        </w:numPr>
+        <w:rPr>
+          <w:lang w:val="pt-PT"/>
+        </w:rPr>
+      </w:pPr>
+      <w:r>
+        <w:rPr>
+          <w:lang w:val="pt-PT"/>
+        </w:rPr>
+        <w:t xml:space="preserve">popularidade: </w:t>
+      </w:r>
+      <w:proofErr w:type="spellStart"/>
+      <w:r>
+        <w:rPr>
+          <w:lang w:val="pt-PT"/>
+        </w:rPr>
+        <w:t>bimodal</w:t>
       </w:r>
       <w:proofErr w:type="spellEnd"/>
       <w:r>
@@ -6855,6 +6878,11 @@
     </w:p>
     <w:p>
       <w:pPr>
+        <w:pStyle w:val="PargrafodaLista"/>
+        <w:numPr>
+          <w:ilvl w:val="0"/>
+          <w:numId w:val="11"/>
+        </w:numPr>
         <w:rPr>
           <w:lang w:val="pt-PT"/>
         </w:rPr>
@@ -6890,6 +6918,11 @@
     </w:p>
     <w:p>
       <w:pPr>
+        <w:pStyle w:val="PargrafodaLista"/>
+        <w:numPr>
+          <w:ilvl w:val="0"/>
+          <w:numId w:val="11"/>
+        </w:numPr>
         <w:rPr>
           <w:lang w:val="pt-PT"/>
         </w:rPr>
@@ -6911,6 +6944,11 @@
     </w:p>
     <w:p>
       <w:pPr>
+        <w:pStyle w:val="PargrafodaLista"/>
+        <w:numPr>
+          <w:ilvl w:val="0"/>
+          <w:numId w:val="11"/>
+        </w:numPr>
         <w:rPr>
           <w:lang w:val="pt-PT"/>
         </w:rPr>
@@ -6932,6 +6970,11 @@
     </w:p>
     <w:p>
       <w:pPr>
+        <w:pStyle w:val="PargrafodaLista"/>
+        <w:numPr>
+          <w:ilvl w:val="0"/>
+          <w:numId w:val="11"/>
+        </w:numPr>
         <w:rPr>
           <w:lang w:val="pt-PT"/>
         </w:rPr>
@@ -6959,6 +7002,11 @@
     </w:p>
     <w:p>
       <w:pPr>
+        <w:pStyle w:val="PargrafodaLista"/>
+        <w:numPr>
+          <w:ilvl w:val="0"/>
+          <w:numId w:val="11"/>
+        </w:numPr>
         <w:rPr>
           <w:lang w:val="pt-PT"/>
         </w:rPr>
@@ -6994,6 +7042,11 @@
     </w:p>
     <w:p>
       <w:pPr>
+        <w:pStyle w:val="PargrafodaLista"/>
+        <w:numPr>
+          <w:ilvl w:val="0"/>
+          <w:numId w:val="11"/>
+        </w:numPr>
         <w:rPr>
           <w:lang w:val="pt-PT"/>
         </w:rPr>
@@ -7007,6 +7060,11 @@
     </w:p>
     <w:p>
       <w:pPr>
+        <w:pStyle w:val="PargrafodaLista"/>
+        <w:numPr>
+          <w:ilvl w:val="0"/>
+          <w:numId w:val="11"/>
+        </w:numPr>
         <w:rPr>
           <w:lang w:val="pt-PT"/>
         </w:rPr>
@@ -7020,6 +7078,11 @@
     </w:p>
     <w:p>
       <w:pPr>
+        <w:pStyle w:val="PargrafodaLista"/>
+        <w:numPr>
+          <w:ilvl w:val="0"/>
+          <w:numId w:val="11"/>
+        </w:numPr>
         <w:rPr>
           <w:lang w:val="pt-PT"/>
         </w:rPr>
@@ -7075,6 +7138,11 @@
     </w:p>
     <w:p>
       <w:pPr>
+        <w:pStyle w:val="PargrafodaLista"/>
+        <w:numPr>
+          <w:ilvl w:val="0"/>
+          <w:numId w:val="12"/>
+        </w:numPr>
         <w:rPr>
           <w:lang w:val="pt-PT"/>
         </w:rPr>
@@ -7088,6 +7156,11 @@
     </w:p>
     <w:p>
       <w:pPr>
+        <w:pStyle w:val="PargrafodaLista"/>
+        <w:numPr>
+          <w:ilvl w:val="0"/>
+          <w:numId w:val="12"/>
+        </w:numPr>
         <w:rPr>
           <w:lang w:val="pt-PT"/>
         </w:rPr>
@@ -7101,6 +7174,11 @@
     </w:p>
     <w:p>
       <w:pPr>
+        <w:pStyle w:val="PargrafodaLista"/>
+        <w:numPr>
+          <w:ilvl w:val="0"/>
+          <w:numId w:val="12"/>
+        </w:numPr>
         <w:rPr>
           <w:lang w:val="pt-PT"/>
         </w:rPr>
@@ -7128,6 +7206,11 @@
     </w:p>
     <w:p>
       <w:pPr>
+        <w:pStyle w:val="PargrafodaLista"/>
+        <w:numPr>
+          <w:ilvl w:val="0"/>
+          <w:numId w:val="12"/>
+        </w:numPr>
         <w:rPr>
           <w:lang w:val="pt-PT"/>
         </w:rPr>
@@ -7169,6 +7252,11 @@
     </w:p>
     <w:p>
       <w:pPr>
+        <w:pStyle w:val="PargrafodaLista"/>
+        <w:numPr>
+          <w:ilvl w:val="0"/>
+          <w:numId w:val="13"/>
+        </w:numPr>
         <w:rPr>
           <w:lang w:val="pt-PT"/>
         </w:rPr>
@@ -7196,33 +7284,48 @@
     </w:p>
     <w:p>
       <w:pPr>
-        <w:rPr>
-          <w:lang w:val="pt-PT"/>
-        </w:rPr>
-      </w:pPr>
-      <w:r>
-        <w:rPr>
-          <w:lang w:val="pt-PT"/>
-        </w:rPr>
+        <w:pStyle w:val="PargrafodaLista"/>
+        <w:numPr>
+          <w:ilvl w:val="0"/>
+          <w:numId w:val="13"/>
+        </w:numPr>
+        <w:rPr>
+          <w:lang w:val="pt-PT"/>
+        </w:rPr>
+      </w:pPr>
+      <w:r>
+        <w:rPr>
+          <w:lang w:val="pt-PT"/>
+        </w:rPr>
+        <w:lastRenderedPageBreak/>
         <w:t>por gênero (mainstream vs. nichados);</w:t>
       </w:r>
     </w:p>
     <w:p>
       <w:pPr>
-        <w:rPr>
-          <w:lang w:val="pt-PT"/>
-        </w:rPr>
-      </w:pPr>
-      <w:r>
-        <w:rPr>
-          <w:lang w:val="pt-PT"/>
-        </w:rPr>
-        <w:lastRenderedPageBreak/>
+        <w:pStyle w:val="PargrafodaLista"/>
+        <w:numPr>
+          <w:ilvl w:val="0"/>
+          <w:numId w:val="13"/>
+        </w:numPr>
+        <w:rPr>
+          <w:lang w:val="pt-PT"/>
+        </w:rPr>
+      </w:pPr>
+      <w:r>
+        <w:rPr>
+          <w:lang w:val="pt-PT"/>
+        </w:rPr>
         <w:t>por período histórico (pré-2000, 2000–2010, pós-2010);</w:t>
       </w:r>
     </w:p>
     <w:p>
       <w:pPr>
+        <w:pStyle w:val="PargrafodaLista"/>
+        <w:numPr>
+          <w:ilvl w:val="0"/>
+          <w:numId w:val="13"/>
+        </w:numPr>
         <w:rPr>
           <w:lang w:val="pt-PT"/>
         </w:rPr>
@@ -7277,6 +7380,11 @@
     </w:p>
     <w:p>
       <w:pPr>
+        <w:pStyle w:val="PargrafodaLista"/>
+        <w:numPr>
+          <w:ilvl w:val="0"/>
+          <w:numId w:val="14"/>
+        </w:numPr>
         <w:rPr>
           <w:lang w:val="pt-PT"/>
         </w:rPr>
@@ -7290,6 +7398,11 @@
     </w:p>
     <w:p>
       <w:pPr>
+        <w:pStyle w:val="PargrafodaLista"/>
+        <w:numPr>
+          <w:ilvl w:val="0"/>
+          <w:numId w:val="14"/>
+        </w:numPr>
         <w:rPr>
           <w:lang w:val="pt-PT"/>
         </w:rPr>
@@ -7303,6 +7416,11 @@
     </w:p>
     <w:p>
       <w:pPr>
+        <w:pStyle w:val="PargrafodaLista"/>
+        <w:numPr>
+          <w:ilvl w:val="0"/>
+          <w:numId w:val="14"/>
+        </w:numPr>
         <w:rPr>
           <w:lang w:val="pt-PT"/>
         </w:rPr>
@@ -7316,6 +7434,11 @@
     </w:p>
     <w:p>
       <w:pPr>
+        <w:pStyle w:val="PargrafodaLista"/>
+        <w:numPr>
+          <w:ilvl w:val="0"/>
+          <w:numId w:val="14"/>
+        </w:numPr>
         <w:rPr>
           <w:lang w:val="pt-PT"/>
         </w:rPr>
@@ -7329,6 +7452,11 @@
     </w:p>
     <w:p>
       <w:pPr>
+        <w:pStyle w:val="PargrafodaLista"/>
+        <w:numPr>
+          <w:ilvl w:val="0"/>
+          <w:numId w:val="14"/>
+        </w:numPr>
         <w:rPr>
           <w:lang w:val="pt-PT"/>
         </w:rPr>
@@ -7383,6 +7511,11 @@
     </w:p>
     <w:p>
       <w:pPr>
+        <w:pStyle w:val="PargrafodaLista"/>
+        <w:numPr>
+          <w:ilvl w:val="0"/>
+          <w:numId w:val="15"/>
+        </w:numPr>
         <w:rPr>
           <w:lang w:val="pt-PT"/>
         </w:rPr>
@@ -7396,6 +7529,11 @@
     </w:p>
     <w:p>
       <w:pPr>
+        <w:pStyle w:val="PargrafodaLista"/>
+        <w:numPr>
+          <w:ilvl w:val="0"/>
+          <w:numId w:val="15"/>
+        </w:numPr>
         <w:rPr>
           <w:lang w:val="pt-PT"/>
         </w:rPr>
@@ -7409,6 +7547,11 @@
     </w:p>
     <w:p>
       <w:pPr>
+        <w:pStyle w:val="PargrafodaLista"/>
+        <w:numPr>
+          <w:ilvl w:val="0"/>
+          <w:numId w:val="15"/>
+        </w:numPr>
         <w:rPr>
           <w:lang w:val="pt-PT"/>
         </w:rPr>
@@ -7422,6 +7565,11 @@
     </w:p>
     <w:p>
       <w:pPr>
+        <w:pStyle w:val="PargrafodaLista"/>
+        <w:numPr>
+          <w:ilvl w:val="0"/>
+          <w:numId w:val="15"/>
+        </w:numPr>
         <w:rPr>
           <w:lang w:val="pt-PT"/>
         </w:rPr>
@@ -7435,6 +7583,11 @@
     </w:p>
     <w:p>
       <w:pPr>
+        <w:pStyle w:val="PargrafodaLista"/>
+        <w:numPr>
+          <w:ilvl w:val="0"/>
+          <w:numId w:val="15"/>
+        </w:numPr>
         <w:rPr>
           <w:lang w:val="pt-PT"/>
         </w:rPr>
@@ -7503,6 +7656,11 @@
     </w:p>
     <w:p>
       <w:pPr>
+        <w:pStyle w:val="PargrafodaLista"/>
+        <w:numPr>
+          <w:ilvl w:val="0"/>
+          <w:numId w:val="16"/>
+        </w:numPr>
         <w:rPr>
           <w:lang w:val="pt-PT"/>
         </w:rPr>
@@ -7530,19 +7688,30 @@
     </w:p>
     <w:p>
       <w:pPr>
-        <w:rPr>
-          <w:lang w:val="pt-PT"/>
-        </w:rPr>
-      </w:pPr>
-      <w:r>
-        <w:rPr>
-          <w:lang w:val="pt-PT"/>
-        </w:rPr>
+        <w:pStyle w:val="PargrafodaLista"/>
+        <w:numPr>
+          <w:ilvl w:val="0"/>
+          <w:numId w:val="16"/>
+        </w:numPr>
+        <w:rPr>
+          <w:lang w:val="pt-PT"/>
+        </w:rPr>
+      </w:pPr>
+      <w:r>
+        <w:rPr>
+          <w:lang w:val="pt-PT"/>
+        </w:rPr>
+        <w:lastRenderedPageBreak/>
         <w:t>fortalecimento de gêneros globais na construção de campanhas,</w:t>
       </w:r>
     </w:p>
     <w:p>
       <w:pPr>
+        <w:pStyle w:val="PargrafodaLista"/>
+        <w:numPr>
+          <w:ilvl w:val="0"/>
+          <w:numId w:val="16"/>
+        </w:numPr>
         <w:rPr>
           <w:lang w:val="pt-PT"/>
         </w:rPr>
@@ -7570,15 +7739,19 @@
     </w:p>
     <w:p>
       <w:pPr>
-        <w:rPr>
-          <w:lang w:val="pt-PT"/>
-        </w:rPr>
-      </w:pPr>
-      <w:r>
-        <w:rPr>
-          <w:lang w:val="pt-PT"/>
-        </w:rPr>
-        <w:lastRenderedPageBreak/>
+        <w:pStyle w:val="PargrafodaLista"/>
+        <w:numPr>
+          <w:ilvl w:val="0"/>
+          <w:numId w:val="16"/>
+        </w:numPr>
+        <w:rPr>
+          <w:lang w:val="pt-PT"/>
+        </w:rPr>
+      </w:pPr>
+      <w:r>
+        <w:rPr>
+          <w:lang w:val="pt-PT"/>
+        </w:rPr>
         <w:t>importância de segmentação de artistas por consistência ou volatilidade.</w:t>
       </w:r>
     </w:p>
@@ -7626,6 +7799,11 @@
     </w:p>
     <w:p>
       <w:pPr>
+        <w:pStyle w:val="PargrafodaLista"/>
+        <w:numPr>
+          <w:ilvl w:val="0"/>
+          <w:numId w:val="17"/>
+        </w:numPr>
         <w:rPr>
           <w:lang w:val="pt-PT"/>
         </w:rPr>
@@ -7653,6 +7831,11 @@
     </w:p>
     <w:p>
       <w:pPr>
+        <w:pStyle w:val="PargrafodaLista"/>
+        <w:numPr>
+          <w:ilvl w:val="0"/>
+          <w:numId w:val="17"/>
+        </w:numPr>
         <w:rPr>
           <w:lang w:val="pt-PT"/>
         </w:rPr>
@@ -7666,6 +7849,11 @@
     </w:p>
     <w:p>
       <w:pPr>
+        <w:pStyle w:val="PargrafodaLista"/>
+        <w:numPr>
+          <w:ilvl w:val="0"/>
+          <w:numId w:val="17"/>
+        </w:numPr>
         <w:rPr>
           <w:lang w:val="pt-PT"/>
         </w:rPr>
@@ -7693,6 +7881,11 @@
     </w:p>
     <w:p>
       <w:pPr>
+        <w:pStyle w:val="PargrafodaLista"/>
+        <w:numPr>
+          <w:ilvl w:val="0"/>
+          <w:numId w:val="17"/>
+        </w:numPr>
         <w:rPr>
           <w:lang w:val="pt-PT"/>
         </w:rPr>
@@ -7775,6 +7968,11 @@
     </w:p>
     <w:p>
       <w:pPr>
+        <w:pStyle w:val="PargrafodaLista"/>
+        <w:numPr>
+          <w:ilvl w:val="0"/>
+          <w:numId w:val="18"/>
+        </w:numPr>
         <w:rPr>
           <w:lang w:val="pt-PT"/>
         </w:rPr>
@@ -7802,6 +8000,11 @@
     </w:p>
     <w:p>
       <w:pPr>
+        <w:pStyle w:val="PargrafodaLista"/>
+        <w:numPr>
+          <w:ilvl w:val="0"/>
+          <w:numId w:val="18"/>
+        </w:numPr>
         <w:rPr>
           <w:lang w:val="pt-PT"/>
         </w:rPr>
@@ -7815,6 +8018,11 @@
     </w:p>
     <w:p>
       <w:pPr>
+        <w:pStyle w:val="PargrafodaLista"/>
+        <w:numPr>
+          <w:ilvl w:val="0"/>
+          <w:numId w:val="18"/>
+        </w:numPr>
         <w:rPr>
           <w:lang w:val="pt-PT"/>
         </w:rPr>
@@ -7828,6 +8036,11 @@
     </w:p>
     <w:p>
       <w:pPr>
+        <w:pStyle w:val="PargrafodaLista"/>
+        <w:numPr>
+          <w:ilvl w:val="0"/>
+          <w:numId w:val="18"/>
+        </w:numPr>
         <w:rPr>
           <w:lang w:val="pt-PT"/>
         </w:rPr>
@@ -7855,6 +8068,11 @@
     </w:p>
     <w:p>
       <w:pPr>
+        <w:pStyle w:val="PargrafodaLista"/>
+        <w:numPr>
+          <w:ilvl w:val="0"/>
+          <w:numId w:val="18"/>
+        </w:numPr>
         <w:rPr>
           <w:lang w:val="pt-PT"/>
         </w:rPr>
@@ -7868,6 +8086,11 @@
     </w:p>
     <w:p>
       <w:pPr>
+        <w:pStyle w:val="PargrafodaLista"/>
+        <w:numPr>
+          <w:ilvl w:val="0"/>
+          <w:numId w:val="18"/>
+        </w:numPr>
         <w:rPr>
           <w:lang w:val="pt-PT"/>
         </w:rPr>
@@ -7944,6 +8167,1561 @@
         <w:rPr>
           <w:lang w:val="pt-PT"/>
         </w:rPr>
+        <w:t xml:space="preserve">A </w:t>
+      </w:r>
+      <w:proofErr w:type="spellStart"/>
+      <w:r>
+        <w:rPr>
+          <w:lang w:val="pt-PT"/>
+        </w:rPr>
+        <w:t>Issue</w:t>
+      </w:r>
+      <w:proofErr w:type="spellEnd"/>
+      <w:r>
+        <w:rPr>
+          <w:lang w:val="pt-PT"/>
+        </w:rPr>
+        <w:t xml:space="preserve"> 3.2 atingiu integralmente seus objetivos, convertendo resultados quantitativos em narrativa de valor interpretativo e mercadológico. A Célula 25 sintetiza esse processo com rigor técnico e clareza metodológica.</w:t>
+      </w:r>
+    </w:p>
+    <w:p>
+      <w:pPr>
+        <w:rPr>
+          <w:lang w:val="pt-PT"/>
+        </w:rPr>
+      </w:pPr>
+      <w:r>
+        <w:rPr>
+          <w:lang w:val="pt-PT"/>
+        </w:rPr>
+        <w:t xml:space="preserve">Este conteúdo permitirá avançar para a </w:t>
+      </w:r>
+      <w:proofErr w:type="spellStart"/>
+      <w:r>
+        <w:rPr>
+          <w:lang w:val="pt-PT"/>
+        </w:rPr>
+        <w:t>Issue</w:t>
+      </w:r>
+      <w:proofErr w:type="spellEnd"/>
+      <w:r>
+        <w:rPr>
+          <w:lang w:val="pt-PT"/>
+        </w:rPr>
+        <w:t xml:space="preserve"> 3.3 com entendimento profundo dos padrões musicais, gerando um </w:t>
+      </w:r>
+      <w:proofErr w:type="spellStart"/>
+      <w:r>
+        <w:rPr>
+          <w:lang w:val="pt-PT"/>
+        </w:rPr>
+        <w:t>dashboard</w:t>
+      </w:r>
+      <w:proofErr w:type="spellEnd"/>
+      <w:r>
+        <w:rPr>
+          <w:lang w:val="pt-PT"/>
+        </w:rPr>
+        <w:t xml:space="preserve"> mais coerente, interpretativo e orientado a decisões.</w:t>
+      </w:r>
+    </w:p>
+    <w:p>
+      <w:pPr>
+        <w:spacing w:after="200" w:line="276" w:lineRule="auto"/>
+        <w:ind w:firstLine="0"/>
+        <w:jc w:val="left"/>
+        <w:rPr>
+          <w:lang w:val="pt-PT"/>
+        </w:rPr>
+      </w:pPr>
+      <w:r>
+        <w:rPr>
+          <w:lang w:val="pt-PT"/>
+        </w:rPr>
+        <w:lastRenderedPageBreak/>
+        <w:br w:type="page"/>
+      </w:r>
+    </w:p>
+    <w:p>
+      <w:pPr>
+        <w:pStyle w:val="Identificao"/>
+      </w:pPr>
+      <w:r>
+        <w:lastRenderedPageBreak/>
+        <w:t>FAC SENAC DF – Curso de Ciência de Dados</w:t>
+      </w:r>
+    </w:p>
+    <w:p>
+      <w:pPr>
+        <w:pStyle w:val="Identificao"/>
+      </w:pPr>
+      <w:r>
+        <w:t>Projeto Interdisciplinar: Análise de Dados com Python, IA e Engenharia de Prompt</w:t>
+      </w:r>
+    </w:p>
+    <w:p>
+      <w:pPr>
+        <w:pStyle w:val="Identificao"/>
+      </w:pPr>
+      <w:r>
+        <w:t>Relatório Técnico – Semana 3 (1</w:t>
+      </w:r>
+      <w:r>
+        <w:t>4</w:t>
+      </w:r>
+      <w:r>
+        <w:t xml:space="preserve"> de novembro de 2025)</w:t>
+      </w:r>
+    </w:p>
+    <w:p>
+      <w:pPr>
+        <w:pStyle w:val="Identificao"/>
+      </w:pPr>
+      <w:r>
+        <w:t>Aluno: Anderson de Matos Guimarães</w:t>
+      </w:r>
+    </w:p>
+    <w:p>
+      <w:pPr>
+        <w:pStyle w:val="Identificao"/>
+      </w:pPr>
+      <w:r>
+        <w:t>Professor: Alexsander Barreto</w:t>
+      </w:r>
+    </w:p>
+    <w:p>
+      <w:pPr>
+        <w:pStyle w:val="Identificao"/>
+      </w:pPr>
+      <w:r>
+        <w:t>Instituição: Faculdade de Tecnologia e Inovação Senac DF</w:t>
+      </w:r>
+    </w:p>
+    <w:p>
+      <w:pPr>
+        <w:pStyle w:val="Identificao"/>
+      </w:pPr>
+      <w:r>
+        <w:t xml:space="preserve">Conta Google utilizada nesta semana: </w:t>
+      </w:r>
+      <w:hyperlink r:id="rId8" w:history="1">
+        <w:r>
+          <w:rPr>
+            <w:rStyle w:val="Hyperlink"/>
+          </w:rPr>
+          <w:t>anderson.m.guimaraes@icloud.com</w:t>
+        </w:r>
+      </w:hyperlink>
+    </w:p>
+    <w:p>
+      <w:pPr>
+        <w:pStyle w:val="Ttulo1"/>
+        <w:rPr>
+          <w:lang w:val="pt-BR"/>
+        </w:rPr>
+      </w:pPr>
+      <w:r>
+        <w:rPr>
+          <w:lang w:val="pt-BR"/>
+        </w:rPr>
+        <w:t>1. Introdução</w:t>
+      </w:r>
+    </w:p>
+    <w:p>
+      <w:pPr>
+        <w:rPr>
+          <w:lang w:val="pt-BR"/>
+        </w:rPr>
+      </w:pPr>
+      <w:r>
+        <w:rPr>
+          <w:lang w:val="pt-BR"/>
+        </w:rPr>
+        <w:t xml:space="preserve">A </w:t>
+      </w:r>
+      <w:proofErr w:type="spellStart"/>
+      <w:r>
+        <w:rPr>
+          <w:lang w:val="pt-BR"/>
+        </w:rPr>
+        <w:t>Issue</w:t>
+      </w:r>
+      <w:proofErr w:type="spellEnd"/>
+      <w:r>
+        <w:rPr>
+          <w:lang w:val="pt-BR"/>
+        </w:rPr>
+        <w:t xml:space="preserve"> 3.3 marcou a etapa de transformação das análises quantitativas e interpretativas realizadas nas </w:t>
+      </w:r>
+      <w:proofErr w:type="spellStart"/>
+      <w:r>
+        <w:rPr>
+          <w:lang w:val="pt-BR"/>
+        </w:rPr>
+        <w:t>Issues</w:t>
+      </w:r>
+      <w:proofErr w:type="spellEnd"/>
+      <w:r>
+        <w:rPr>
+          <w:lang w:val="pt-BR"/>
+        </w:rPr>
+        <w:t xml:space="preserve"> 3.1 (EDA) e 3.2 (</w:t>
+      </w:r>
+      <w:proofErr w:type="spellStart"/>
+      <w:r>
+        <w:rPr>
+          <w:lang w:val="pt-BR"/>
+        </w:rPr>
+        <w:t>Storytelling</w:t>
+      </w:r>
+      <w:proofErr w:type="spellEnd"/>
+      <w:r>
+        <w:rPr>
+          <w:lang w:val="pt-BR"/>
+        </w:rPr>
+        <w:t xml:space="preserve"> Analítico) em um protótipo funcional de dashboard interativo. Essa fase estabeleceu a ponte entre os resultados da investigação de dados e sua apresentação em formato visual, navegável e orientado a usuários.</w:t>
+      </w:r>
+    </w:p>
+    <w:p>
+      <w:pPr>
+        <w:rPr>
+          <w:lang w:val="pt-BR"/>
+        </w:rPr>
+      </w:pPr>
+      <w:r>
+        <w:rPr>
+          <w:lang w:val="pt-BR"/>
+        </w:rPr>
+        <w:t xml:space="preserve">O objetivo principal foi construir uma interface inicial que reunisse os principais insights do </w:t>
+      </w:r>
+      <w:proofErr w:type="spellStart"/>
+      <w:r>
+        <w:rPr>
+          <w:lang w:val="pt-BR"/>
+        </w:rPr>
+        <w:t>dataset</w:t>
+      </w:r>
+      <w:proofErr w:type="spellEnd"/>
+      <w:r>
+        <w:rPr>
+          <w:lang w:val="pt-BR"/>
+        </w:rPr>
+        <w:t xml:space="preserve"> e permitisse exploração dinâmica das métricas de popularidade, gêneros, artistas e evolução temporal no Spotify. Essa versão será expandida e refinada na Semana 4 para compor o dashboard final.</w:t>
+      </w:r>
+    </w:p>
+    <w:p>
+      <w:pPr>
+        <w:pStyle w:val="Ttulo1"/>
+        <w:rPr>
+          <w:lang w:val="pt-BR"/>
+        </w:rPr>
+      </w:pPr>
+      <w:r>
+        <w:rPr>
+          <w:lang w:val="pt-BR"/>
+        </w:rPr>
+        <w:t xml:space="preserve">2. Prompt Utilizado na Execução da </w:t>
+      </w:r>
+      <w:proofErr w:type="spellStart"/>
+      <w:r>
+        <w:rPr>
+          <w:lang w:val="pt-BR"/>
+        </w:rPr>
+        <w:t>Issue</w:t>
+      </w:r>
+      <w:proofErr w:type="spellEnd"/>
+      <w:r>
+        <w:rPr>
+          <w:lang w:val="pt-BR"/>
+        </w:rPr>
+        <w:t xml:space="preserve"> 3.3</w:t>
+      </w:r>
+    </w:p>
+    <w:p>
+      <w:pPr>
+        <w:rPr>
+          <w:lang w:val="pt-BR"/>
+        </w:rPr>
+      </w:pPr>
+      <w:r>
+        <w:rPr>
+          <w:lang w:val="pt-BR"/>
+        </w:rPr>
+        <w:t>Conforme solicitado pelo professor, segue o prompt integral utilizado para realizar a atividade:</w:t>
+      </w:r>
+    </w:p>
+    <w:p>
+      <w:pPr>
+        <w:rPr>
+          <w:lang w:val="pt-BR"/>
+        </w:rPr>
+      </w:pPr>
+      <w:r>
+        <w:rPr>
+          <w:lang w:val="pt-BR"/>
+        </w:rPr>
+        <w:t xml:space="preserve">Atue como um Cientista de Dados Sênior, especialista em </w:t>
+      </w:r>
+      <w:proofErr w:type="spellStart"/>
+      <w:r>
+        <w:rPr>
+          <w:lang w:val="pt-BR"/>
+        </w:rPr>
+        <w:t>Storytelling</w:t>
+      </w:r>
+      <w:proofErr w:type="spellEnd"/>
+      <w:r>
+        <w:rPr>
+          <w:lang w:val="pt-BR"/>
+        </w:rPr>
+        <w:t xml:space="preserve"> Visual, Design de Dashboards e prototipação rápida usando ferramentas como </w:t>
+      </w:r>
+      <w:proofErr w:type="spellStart"/>
+      <w:r>
+        <w:rPr>
+          <w:lang w:val="pt-BR"/>
+        </w:rPr>
+        <w:t>Lovable</w:t>
+      </w:r>
+      <w:proofErr w:type="spellEnd"/>
+      <w:r>
+        <w:rPr>
+          <w:lang w:val="pt-BR"/>
+        </w:rPr>
+        <w:t xml:space="preserve">, </w:t>
+      </w:r>
+      <w:proofErr w:type="spellStart"/>
+      <w:r>
+        <w:rPr>
+          <w:lang w:val="pt-BR"/>
+        </w:rPr>
+        <w:t>Streamlit</w:t>
+      </w:r>
+      <w:proofErr w:type="spellEnd"/>
+      <w:r>
+        <w:rPr>
+          <w:lang w:val="pt-BR"/>
+        </w:rPr>
+        <w:t xml:space="preserve"> ou Bolt.</w:t>
+      </w:r>
+    </w:p>
+    <w:p>
+      <w:pPr>
+        <w:rPr>
+          <w:lang w:val="pt-BR"/>
+        </w:rPr>
+      </w:pPr>
+      <w:r>
+        <w:rPr>
+          <w:lang w:val="pt-BR"/>
+        </w:rPr>
+        <w:t xml:space="preserve">Agora quero que você desenvolva o PROTÓTIPO INICIAL DO DASHBOARD da Semana 3, integrando as análises e visualizações que construímos nas </w:t>
+      </w:r>
+      <w:proofErr w:type="spellStart"/>
+      <w:r>
+        <w:rPr>
+          <w:lang w:val="pt-BR"/>
+        </w:rPr>
+        <w:t>Issues</w:t>
+      </w:r>
+      <w:proofErr w:type="spellEnd"/>
+      <w:r>
+        <w:rPr>
+          <w:lang w:val="pt-BR"/>
+        </w:rPr>
+        <w:t xml:space="preserve"> 3.1 e 3.2.</w:t>
+      </w:r>
+    </w:p>
+    <w:p>
+      <w:pPr>
+        <w:rPr>
+          <w:lang w:val="pt-BR"/>
+        </w:rPr>
+      </w:pPr>
+      <w:r>
+        <w:rPr>
+          <w:lang w:val="pt-BR"/>
+        </w:rPr>
+        <w:t>Siga rigorosamente as etapas abaixo.</w:t>
+      </w:r>
+    </w:p>
+    <w:p>
+      <w:pPr>
+        <w:rPr>
+          <w:lang w:val="pt-BR"/>
+        </w:rPr>
+      </w:pPr>
+      <w:r>
+        <w:rPr>
+          <w:lang w:val="pt-BR"/>
+        </w:rPr>
+        <w:t>1. Escolha da ferramenta de prototipação</w:t>
+      </w:r>
+    </w:p>
+    <w:p>
+      <w:pPr>
+        <w:rPr>
+          <w:lang w:val="pt-BR"/>
+        </w:rPr>
+      </w:pPr>
+      <w:r>
+        <w:rPr>
+          <w:lang w:val="pt-BR"/>
+        </w:rPr>
+        <w:t>2. Seleção das visualizações essenciais</w:t>
+      </w:r>
+    </w:p>
+    <w:p>
+      <w:pPr>
+        <w:rPr>
+          <w:lang w:val="pt-BR"/>
+        </w:rPr>
+      </w:pPr>
+      <w:r>
+        <w:rPr>
+          <w:lang w:val="pt-BR"/>
+        </w:rPr>
+        <w:t xml:space="preserve">3. Definição do </w:t>
+      </w:r>
+      <w:proofErr w:type="spellStart"/>
+      <w:r>
+        <w:rPr>
+          <w:lang w:val="pt-BR"/>
+        </w:rPr>
+        <w:t>storytelling</w:t>
+      </w:r>
+      <w:proofErr w:type="spellEnd"/>
+      <w:r>
+        <w:rPr>
+          <w:lang w:val="pt-BR"/>
+        </w:rPr>
+        <w:t xml:space="preserve"> visual</w:t>
+      </w:r>
+    </w:p>
+    <w:p>
+      <w:pPr>
+        <w:rPr>
+          <w:lang w:val="pt-BR"/>
+        </w:rPr>
+      </w:pPr>
+      <w:r>
+        <w:rPr>
+          <w:lang w:val="pt-BR"/>
+        </w:rPr>
+        <w:t>4. Inserção das visualizações no protótipo</w:t>
+      </w:r>
+    </w:p>
+    <w:p>
+      <w:pPr>
+        <w:rPr>
+          <w:lang w:val="pt-BR"/>
+        </w:rPr>
+      </w:pPr>
+      <w:r>
+        <w:rPr>
+          <w:lang w:val="pt-BR"/>
+        </w:rPr>
+        <w:lastRenderedPageBreak/>
+        <w:t xml:space="preserve">5. Bloco de </w:t>
+      </w:r>
+      <w:proofErr w:type="spellStart"/>
+      <w:r>
+        <w:rPr>
+          <w:lang w:val="pt-BR"/>
+        </w:rPr>
+        <w:t>storytelling</w:t>
+      </w:r>
+      <w:proofErr w:type="spellEnd"/>
+      <w:r>
+        <w:rPr>
+          <w:lang w:val="pt-BR"/>
+        </w:rPr>
+        <w:t xml:space="preserve"> automático dentro do dashboard</w:t>
+      </w:r>
+    </w:p>
+    <w:p>
+      <w:pPr>
+        <w:rPr>
+          <w:lang w:val="pt-BR"/>
+        </w:rPr>
+      </w:pPr>
+      <w:r>
+        <w:rPr>
+          <w:lang w:val="pt-BR"/>
+        </w:rPr>
+        <w:t>6. Garantir design limpo e intuitivo</w:t>
+      </w:r>
+    </w:p>
+    <w:p>
+      <w:pPr>
+        <w:rPr>
+          <w:lang w:val="pt-BR"/>
+        </w:rPr>
+      </w:pPr>
+      <w:r>
+        <w:rPr>
+          <w:lang w:val="pt-BR"/>
+        </w:rPr>
+        <w:t>7. Gerar o protótipo final exportável</w:t>
+      </w:r>
+    </w:p>
+    <w:p>
+      <w:pPr>
+        <w:rPr>
+          <w:lang w:val="pt-BR"/>
+        </w:rPr>
+      </w:pPr>
+      <w:r>
+        <w:rPr>
+          <w:lang w:val="pt-BR"/>
+        </w:rPr>
+        <w:t>8. Redigir o texto de documentação para o relatório técnico</w:t>
+      </w:r>
+    </w:p>
+    <w:p>
+      <w:pPr>
+        <w:rPr>
+          <w:lang w:val="pt-BR"/>
+        </w:rPr>
+      </w:pPr>
+      <w:r>
+        <w:rPr>
+          <w:lang w:val="pt-BR"/>
+        </w:rPr>
+        <w:t>Cumprir TODAS AS ETAPAS acima.</w:t>
+      </w:r>
+    </w:p>
+    <w:p>
+      <w:pPr>
+        <w:pStyle w:val="Ttulo1"/>
+        <w:rPr>
+          <w:lang w:val="pt-PT"/>
+        </w:rPr>
+      </w:pPr>
+      <w:r>
+        <w:rPr>
+          <w:lang w:val="pt-PT"/>
+        </w:rPr>
+        <w:t>3. Desenvolvimento das Atividades</w:t>
+      </w:r>
+    </w:p>
+    <w:p>
+      <w:pPr>
+        <w:rPr>
+          <w:lang w:val="pt-PT"/>
+        </w:rPr>
+      </w:pPr>
+      <w:r>
+        <w:rPr>
+          <w:lang w:val="pt-PT"/>
+        </w:rPr>
+        <w:t xml:space="preserve">A execução da </w:t>
+      </w:r>
+      <w:proofErr w:type="spellStart"/>
+      <w:r>
+        <w:rPr>
+          <w:lang w:val="pt-PT"/>
+        </w:rPr>
+        <w:t>Issue</w:t>
+      </w:r>
+      <w:proofErr w:type="spellEnd"/>
+      <w:r>
+        <w:rPr>
+          <w:lang w:val="pt-PT"/>
+        </w:rPr>
+        <w:t xml:space="preserve"> 3.3 ocorreu em três frentes principais: seleção da ferramenta, desenvolvimento do protótipo e documentação no </w:t>
+      </w:r>
+      <w:proofErr w:type="spellStart"/>
+      <w:r>
+        <w:rPr>
+          <w:lang w:val="pt-PT"/>
+        </w:rPr>
+        <w:t>notebook</w:t>
+      </w:r>
+      <w:proofErr w:type="spellEnd"/>
+      <w:r>
+        <w:rPr>
+          <w:lang w:val="pt-PT"/>
+        </w:rPr>
+        <w:t>.</w:t>
+      </w:r>
+    </w:p>
+    <w:p>
+      <w:pPr>
+        <w:pStyle w:val="Ttulo2"/>
+        <w:spacing w:before="360" w:after="360"/>
+        <w:rPr>
+          <w:lang w:val="pt-PT"/>
+        </w:rPr>
+      </w:pPr>
+      <w:r>
+        <w:rPr>
+          <w:lang w:val="pt-PT"/>
+        </w:rPr>
+        <w:t>3.1 Escolha da Ferramenta</w:t>
+      </w:r>
+    </w:p>
+    <w:p>
+      <w:pPr>
+        <w:rPr>
+          <w:lang w:val="pt-PT"/>
+        </w:rPr>
+      </w:pPr>
+      <w:r>
+        <w:rPr>
+          <w:lang w:val="pt-PT"/>
+        </w:rPr>
+        <w:t xml:space="preserve">Após comparar </w:t>
+      </w:r>
+      <w:proofErr w:type="spellStart"/>
+      <w:r>
+        <w:rPr>
+          <w:lang w:val="pt-PT"/>
+        </w:rPr>
+        <w:t>Lovable</w:t>
+      </w:r>
+      <w:proofErr w:type="spellEnd"/>
+      <w:r>
+        <w:rPr>
+          <w:lang w:val="pt-PT"/>
+        </w:rPr>
+        <w:t xml:space="preserve">, </w:t>
+      </w:r>
+      <w:proofErr w:type="spellStart"/>
+      <w:r>
+        <w:rPr>
+          <w:lang w:val="pt-PT"/>
+        </w:rPr>
+        <w:t>Bolt</w:t>
+      </w:r>
+      <w:proofErr w:type="spellEnd"/>
+      <w:r>
+        <w:rPr>
+          <w:lang w:val="pt-PT"/>
+        </w:rPr>
+        <w:t xml:space="preserve"> e </w:t>
+      </w:r>
+      <w:proofErr w:type="spellStart"/>
+      <w:r>
+        <w:rPr>
+          <w:lang w:val="pt-PT"/>
+        </w:rPr>
+        <w:t>Streamlit</w:t>
+      </w:r>
+      <w:proofErr w:type="spellEnd"/>
+      <w:r>
+        <w:rPr>
+          <w:lang w:val="pt-PT"/>
+        </w:rPr>
+        <w:t>, a solução escolhida foi:</w:t>
+      </w:r>
+    </w:p>
+    <w:p>
+      <w:pPr>
+        <w:rPr>
+          <w:lang w:val="pt-PT"/>
+        </w:rPr>
+      </w:pPr>
+      <w:proofErr w:type="spellStart"/>
+      <w:r>
+        <w:rPr>
+          <w:lang w:val="pt-PT"/>
+        </w:rPr>
+        <w:t>Streamlit</w:t>
+      </w:r>
+      <w:proofErr w:type="spellEnd"/>
+      <w:r>
+        <w:rPr>
+          <w:lang w:val="pt-PT"/>
+        </w:rPr>
+        <w:t xml:space="preserve"> – pela capacidade de integrar </w:t>
+      </w:r>
+      <w:proofErr w:type="spellStart"/>
+      <w:r>
+        <w:rPr>
+          <w:lang w:val="pt-PT"/>
+        </w:rPr>
+        <w:t>Python</w:t>
+      </w:r>
+      <w:proofErr w:type="spellEnd"/>
+      <w:r>
+        <w:rPr>
+          <w:lang w:val="pt-PT"/>
+        </w:rPr>
+        <w:t xml:space="preserve">, </w:t>
+      </w:r>
+      <w:proofErr w:type="spellStart"/>
+      <w:r>
+        <w:rPr>
+          <w:lang w:val="pt-PT"/>
+        </w:rPr>
+        <w:t>Plotly</w:t>
+      </w:r>
+      <w:proofErr w:type="spellEnd"/>
+      <w:r>
+        <w:rPr>
+          <w:lang w:val="pt-PT"/>
+        </w:rPr>
+        <w:t xml:space="preserve"> e interatividade em uma interface simples, modular e de rápida </w:t>
+      </w:r>
+      <w:proofErr w:type="spellStart"/>
+      <w:r>
+        <w:rPr>
+          <w:lang w:val="pt-PT"/>
+        </w:rPr>
+        <w:t>prototipação</w:t>
+      </w:r>
+      <w:proofErr w:type="spellEnd"/>
+      <w:r>
+        <w:rPr>
+          <w:lang w:val="pt-PT"/>
+        </w:rPr>
+        <w:t>.</w:t>
+      </w:r>
+    </w:p>
+    <w:p>
+      <w:pPr>
+        <w:rPr>
+          <w:lang w:val="pt-PT"/>
+        </w:rPr>
+      </w:pPr>
+      <w:r>
+        <w:rPr>
+          <w:lang w:val="pt-PT"/>
+        </w:rPr>
+        <w:t>Foi considerada a ferramenta mais adequada para:</w:t>
+      </w:r>
+    </w:p>
+    <w:p>
+      <w:pPr>
+        <w:pStyle w:val="PargrafodaLista"/>
+        <w:numPr>
+          <w:ilvl w:val="0"/>
+          <w:numId w:val="19"/>
+        </w:numPr>
+        <w:rPr>
+          <w:lang w:val="pt-PT"/>
+        </w:rPr>
+      </w:pPr>
+      <w:r>
+        <w:rPr>
+          <w:lang w:val="pt-PT"/>
+        </w:rPr>
+        <w:t xml:space="preserve">manter o fluxo do </w:t>
+      </w:r>
+      <w:proofErr w:type="spellStart"/>
+      <w:r>
+        <w:rPr>
+          <w:lang w:val="pt-PT"/>
+        </w:rPr>
+        <w:t>notebook</w:t>
+      </w:r>
+      <w:proofErr w:type="spellEnd"/>
+      <w:r>
+        <w:rPr>
+          <w:lang w:val="pt-PT"/>
+        </w:rPr>
+        <w:t>,</w:t>
+      </w:r>
+    </w:p>
+    <w:p>
+      <w:pPr>
+        <w:pStyle w:val="PargrafodaLista"/>
+        <w:numPr>
+          <w:ilvl w:val="0"/>
+          <w:numId w:val="19"/>
+        </w:numPr>
+        <w:rPr>
+          <w:lang w:val="pt-PT"/>
+        </w:rPr>
+      </w:pPr>
+      <w:r>
+        <w:rPr>
+          <w:lang w:val="pt-PT"/>
+        </w:rPr>
+        <w:t>permitir reprodutibilidade,</w:t>
+      </w:r>
+    </w:p>
+    <w:p>
+      <w:pPr>
+        <w:pStyle w:val="PargrafodaLista"/>
+        <w:numPr>
+          <w:ilvl w:val="0"/>
+          <w:numId w:val="19"/>
+        </w:numPr>
+        <w:rPr>
+          <w:lang w:val="pt-PT"/>
+        </w:rPr>
+      </w:pPr>
+      <w:r>
+        <w:rPr>
+          <w:lang w:val="pt-PT"/>
+        </w:rPr>
+        <w:t xml:space="preserve">criar um </w:t>
+      </w:r>
+      <w:proofErr w:type="spellStart"/>
+      <w:r>
+        <w:rPr>
+          <w:lang w:val="pt-PT"/>
+        </w:rPr>
+        <w:t>dashboard</w:t>
+      </w:r>
+      <w:proofErr w:type="spellEnd"/>
+      <w:r>
+        <w:rPr>
+          <w:lang w:val="pt-PT"/>
+        </w:rPr>
+        <w:t xml:space="preserve"> flexível com abas,</w:t>
+      </w:r>
+    </w:p>
+    <w:p>
+      <w:pPr>
+        <w:pStyle w:val="PargrafodaLista"/>
+        <w:numPr>
+          <w:ilvl w:val="0"/>
+          <w:numId w:val="19"/>
+        </w:numPr>
+        <w:rPr>
+          <w:lang w:val="pt-PT"/>
+        </w:rPr>
+      </w:pPr>
+      <w:r>
+        <w:rPr>
+          <w:lang w:val="pt-PT"/>
+        </w:rPr>
+        <w:t>facilitar a avaliação e evolução do protótipo.</w:t>
+      </w:r>
+    </w:p>
+    <w:p>
+      <w:pPr>
+        <w:pStyle w:val="Ttulo2"/>
+        <w:spacing w:before="360" w:after="360"/>
+        <w:rPr>
+          <w:lang w:val="pt-PT"/>
+        </w:rPr>
+      </w:pPr>
+      <w:r>
+        <w:rPr>
+          <w:lang w:val="pt-PT"/>
+        </w:rPr>
+        <w:t>3.2 Desenvolvimento do Arquivo spotify_dashboard_app.py</w:t>
+      </w:r>
+    </w:p>
+    <w:p>
+      <w:pPr>
+        <w:rPr>
+          <w:lang w:val="pt-PT"/>
+        </w:rPr>
+      </w:pPr>
+      <w:r>
+        <w:rPr>
+          <w:lang w:val="pt-PT"/>
+        </w:rPr>
+        <w:t xml:space="preserve">Foi criado o arquivo spotify_dashboard_app.py contendo toda a estrutura do </w:t>
+      </w:r>
+      <w:proofErr w:type="spellStart"/>
+      <w:r>
+        <w:rPr>
+          <w:lang w:val="pt-PT"/>
+        </w:rPr>
+        <w:t>dashboard</w:t>
+      </w:r>
+      <w:proofErr w:type="spellEnd"/>
+      <w:r>
+        <w:rPr>
+          <w:lang w:val="pt-PT"/>
+        </w:rPr>
+        <w:t>, utilizando:</w:t>
+      </w:r>
+    </w:p>
+    <w:p>
+      <w:pPr>
+        <w:pStyle w:val="PargrafodaLista"/>
+        <w:numPr>
+          <w:ilvl w:val="0"/>
+          <w:numId w:val="20"/>
+        </w:numPr>
+        <w:rPr>
+          <w:lang w:val="pt-PT"/>
+        </w:rPr>
+      </w:pPr>
+      <w:r>
+        <w:rPr>
+          <w:lang w:val="pt-PT"/>
+        </w:rPr>
+        <w:t>abas temáticas (Visão Geral, Gêneros, Artistas, Linha do Tempo),</w:t>
+      </w:r>
+    </w:p>
+    <w:p>
+      <w:pPr>
+        <w:pStyle w:val="PargrafodaLista"/>
+        <w:numPr>
+          <w:ilvl w:val="0"/>
+          <w:numId w:val="20"/>
+        </w:numPr>
+        <w:rPr>
+          <w:lang w:val="pt-PT"/>
+        </w:rPr>
+      </w:pPr>
+      <w:proofErr w:type="spellStart"/>
+      <w:r>
+        <w:rPr>
+          <w:lang w:val="pt-PT"/>
+        </w:rPr>
+        <w:t>KPIs</w:t>
+      </w:r>
+      <w:proofErr w:type="spellEnd"/>
+      <w:r>
+        <w:rPr>
+          <w:lang w:val="pt-PT"/>
+        </w:rPr>
+        <w:t xml:space="preserve"> importantes,</w:t>
+      </w:r>
+    </w:p>
+    <w:p>
+      <w:pPr>
+        <w:pStyle w:val="PargrafodaLista"/>
+        <w:numPr>
+          <w:ilvl w:val="0"/>
+          <w:numId w:val="20"/>
+        </w:numPr>
+        <w:rPr>
+          <w:lang w:val="pt-PT"/>
+        </w:rPr>
+      </w:pPr>
+      <w:r>
+        <w:rPr>
+          <w:lang w:val="pt-PT"/>
+        </w:rPr>
+        <w:t>filtros interativos,</w:t>
+      </w:r>
+    </w:p>
+    <w:p>
+      <w:pPr>
+        <w:pStyle w:val="PargrafodaLista"/>
+        <w:numPr>
+          <w:ilvl w:val="0"/>
+          <w:numId w:val="20"/>
+        </w:numPr>
+        <w:rPr>
+          <w:lang w:val="pt-PT"/>
+        </w:rPr>
+      </w:pPr>
+      <w:r>
+        <w:rPr>
+          <w:lang w:val="pt-PT"/>
+        </w:rPr>
+        <w:t xml:space="preserve">gráficos </w:t>
+      </w:r>
+      <w:proofErr w:type="spellStart"/>
+      <w:r>
+        <w:rPr>
+          <w:lang w:val="pt-PT"/>
+        </w:rPr>
+        <w:t>Plotly</w:t>
+      </w:r>
+      <w:proofErr w:type="spellEnd"/>
+      <w:r>
+        <w:rPr>
+          <w:lang w:val="pt-PT"/>
+        </w:rPr>
+        <w:t xml:space="preserve"> dinâmicos,</w:t>
+      </w:r>
+    </w:p>
+    <w:p>
+      <w:pPr>
+        <w:pStyle w:val="PargrafodaLista"/>
+        <w:numPr>
+          <w:ilvl w:val="0"/>
+          <w:numId w:val="20"/>
+        </w:numPr>
+        <w:rPr>
+          <w:lang w:val="pt-PT"/>
+        </w:rPr>
+      </w:pPr>
+      <w:r>
+        <w:rPr>
+          <w:lang w:val="pt-PT"/>
+        </w:rPr>
+        <w:t>explicações narrativas,</w:t>
+      </w:r>
+    </w:p>
+    <w:p>
+      <w:pPr>
+        <w:pStyle w:val="PargrafodaLista"/>
+        <w:numPr>
+          <w:ilvl w:val="0"/>
+          <w:numId w:val="20"/>
+        </w:numPr>
+        <w:rPr>
+          <w:lang w:val="pt-PT"/>
+        </w:rPr>
+      </w:pPr>
+      <w:proofErr w:type="spellStart"/>
+      <w:r>
+        <w:rPr>
+          <w:lang w:val="pt-PT"/>
+        </w:rPr>
+        <w:t>storytelling</w:t>
+      </w:r>
+      <w:proofErr w:type="spellEnd"/>
+      <w:r>
+        <w:rPr>
+          <w:lang w:val="pt-PT"/>
+        </w:rPr>
+        <w:t xml:space="preserve"> inicial dentro da própria interface.</w:t>
+      </w:r>
+    </w:p>
+    <w:p>
+      <w:pPr>
+        <w:rPr>
+          <w:lang w:val="pt-PT"/>
+        </w:rPr>
+      </w:pPr>
+      <w:r>
+        <w:rPr>
+          <w:lang w:val="pt-PT"/>
+        </w:rPr>
+        <w:lastRenderedPageBreak/>
+        <w:t>O código foi gerado e salvo no ambiente utilizando a Célula 27, revisado para evitar erros Unicode e garantir a integridade do arquivo .</w:t>
+      </w:r>
+      <w:proofErr w:type="spellStart"/>
+      <w:r>
+        <w:rPr>
+          <w:lang w:val="pt-PT"/>
+        </w:rPr>
+        <w:t>py</w:t>
+      </w:r>
+      <w:proofErr w:type="spellEnd"/>
+      <w:r>
+        <w:rPr>
+          <w:lang w:val="pt-PT"/>
+        </w:rPr>
+        <w:t>.</w:t>
+      </w:r>
+    </w:p>
+    <w:p>
+      <w:pPr>
+        <w:pStyle w:val="Ttulo2"/>
+        <w:spacing w:before="360" w:after="360"/>
+        <w:rPr>
+          <w:lang w:val="pt-PT"/>
+        </w:rPr>
+      </w:pPr>
+      <w:r>
+        <w:rPr>
+          <w:lang w:val="pt-PT"/>
+        </w:rPr>
+        <w:t>3.3 Estrutura e Funcionalidades do Protótipo</w:t>
+      </w:r>
+    </w:p>
+    <w:p>
+      <w:pPr>
+        <w:rPr>
+          <w:lang w:val="pt-PT"/>
+        </w:rPr>
+      </w:pPr>
+      <w:r>
+        <w:rPr>
+          <w:lang w:val="pt-PT"/>
+        </w:rPr>
+        <w:t xml:space="preserve">O </w:t>
+      </w:r>
+      <w:proofErr w:type="spellStart"/>
+      <w:r>
+        <w:rPr>
+          <w:lang w:val="pt-PT"/>
+        </w:rPr>
+        <w:t>dashboard</w:t>
+      </w:r>
+      <w:proofErr w:type="spellEnd"/>
+      <w:r>
+        <w:rPr>
+          <w:lang w:val="pt-PT"/>
+        </w:rPr>
+        <w:t xml:space="preserve"> foi organizado em quatro abas principais:</w:t>
+      </w:r>
+    </w:p>
+    <w:p>
+      <w:pPr>
+        <w:rPr>
+          <w:b/>
+          <w:bCs/>
+          <w:i/>
+          <w:iCs/>
+          <w:lang w:val="pt-PT"/>
+        </w:rPr>
+      </w:pPr>
+      <w:r>
+        <w:rPr>
+          <w:b/>
+          <w:bCs/>
+          <w:i/>
+          <w:iCs/>
+          <w:lang w:val="pt-PT"/>
+        </w:rPr>
+        <w:t>Aba 1 – Visão Geral</w:t>
+      </w:r>
+    </w:p>
+    <w:p>
+      <w:pPr>
+        <w:pStyle w:val="PargrafodaLista"/>
+        <w:numPr>
+          <w:ilvl w:val="0"/>
+          <w:numId w:val="21"/>
+        </w:numPr>
+        <w:rPr>
+          <w:lang w:val="pt-PT"/>
+        </w:rPr>
+      </w:pPr>
+      <w:r>
+        <w:rPr>
+          <w:lang w:val="pt-PT"/>
+        </w:rPr>
+        <w:t>histograma de popularidade</w:t>
+      </w:r>
+    </w:p>
+    <w:p>
+      <w:pPr>
+        <w:pStyle w:val="PargrafodaLista"/>
+        <w:numPr>
+          <w:ilvl w:val="0"/>
+          <w:numId w:val="21"/>
+        </w:numPr>
+        <w:rPr>
+          <w:lang w:val="pt-PT"/>
+        </w:rPr>
+      </w:pPr>
+      <w:r>
+        <w:rPr>
+          <w:lang w:val="pt-PT"/>
+        </w:rPr>
+        <w:t>dispersão duração × popularidade</w:t>
+      </w:r>
+    </w:p>
+    <w:p>
+      <w:pPr>
+        <w:pStyle w:val="PargrafodaLista"/>
+        <w:numPr>
+          <w:ilvl w:val="0"/>
+          <w:numId w:val="21"/>
+        </w:numPr>
+        <w:rPr>
+          <w:lang w:val="pt-PT"/>
+        </w:rPr>
+      </w:pPr>
+      <w:proofErr w:type="spellStart"/>
+      <w:r>
+        <w:rPr>
+          <w:lang w:val="pt-PT"/>
+        </w:rPr>
+        <w:t>KPIs</w:t>
+      </w:r>
+      <w:proofErr w:type="spellEnd"/>
+      <w:r>
+        <w:rPr>
+          <w:lang w:val="pt-PT"/>
+        </w:rPr>
+        <w:t>: total filtrado, popularidade média, % de faixas zero, duração média</w:t>
+      </w:r>
+    </w:p>
+    <w:p>
+      <w:pPr>
+        <w:rPr>
+          <w:b/>
+          <w:bCs/>
+          <w:i/>
+          <w:iCs/>
+          <w:lang w:val="pt-PT"/>
+        </w:rPr>
+      </w:pPr>
+      <w:r>
+        <w:rPr>
+          <w:b/>
+          <w:bCs/>
+          <w:i/>
+          <w:iCs/>
+          <w:lang w:val="pt-PT"/>
+        </w:rPr>
+        <w:t>Aba 2 – Gêneros</w:t>
+      </w:r>
+    </w:p>
+    <w:p>
+      <w:pPr>
+        <w:pStyle w:val="PargrafodaLista"/>
+        <w:numPr>
+          <w:ilvl w:val="0"/>
+          <w:numId w:val="22"/>
+        </w:numPr>
+        <w:rPr>
+          <w:lang w:val="pt-PT"/>
+        </w:rPr>
+      </w:pPr>
+      <w:proofErr w:type="spellStart"/>
+      <w:r>
+        <w:rPr>
+          <w:lang w:val="pt-PT"/>
+        </w:rPr>
+        <w:t>boxplot</w:t>
+      </w:r>
+      <w:proofErr w:type="spellEnd"/>
+      <w:r>
+        <w:rPr>
+          <w:lang w:val="pt-PT"/>
+        </w:rPr>
+        <w:t xml:space="preserve"> de popularidade por gênero</w:t>
+      </w:r>
+    </w:p>
+    <w:p>
+      <w:pPr>
+        <w:pStyle w:val="PargrafodaLista"/>
+        <w:numPr>
+          <w:ilvl w:val="0"/>
+          <w:numId w:val="22"/>
+        </w:numPr>
+        <w:rPr>
+          <w:lang w:val="pt-PT"/>
+        </w:rPr>
+      </w:pPr>
+      <w:r>
+        <w:rPr>
+          <w:lang w:val="pt-PT"/>
+        </w:rPr>
+        <w:t>tabela estatística descritiva</w:t>
+      </w:r>
+    </w:p>
+    <w:p>
+      <w:pPr>
+        <w:rPr>
+          <w:b/>
+          <w:bCs/>
+          <w:i/>
+          <w:iCs/>
+          <w:lang w:val="pt-PT"/>
+        </w:rPr>
+      </w:pPr>
+      <w:r>
+        <w:rPr>
+          <w:b/>
+          <w:bCs/>
+          <w:i/>
+          <w:iCs/>
+          <w:lang w:val="pt-PT"/>
+        </w:rPr>
+        <w:t>Aba 3 – Artistas</w:t>
+      </w:r>
+    </w:p>
+    <w:p>
+      <w:pPr>
+        <w:pStyle w:val="PargrafodaLista"/>
+        <w:numPr>
+          <w:ilvl w:val="0"/>
+          <w:numId w:val="23"/>
+        </w:numPr>
+        <w:rPr>
+          <w:lang w:val="pt-PT"/>
+        </w:rPr>
+      </w:pPr>
+      <w:r>
+        <w:rPr>
+          <w:lang w:val="pt-PT"/>
+        </w:rPr>
+        <w:t>top artistas por média de popularidade</w:t>
+      </w:r>
+    </w:p>
+    <w:p>
+      <w:pPr>
+        <w:pStyle w:val="PargrafodaLista"/>
+        <w:numPr>
+          <w:ilvl w:val="0"/>
+          <w:numId w:val="23"/>
+        </w:numPr>
+        <w:rPr>
+          <w:lang w:val="pt-PT"/>
+        </w:rPr>
+      </w:pPr>
+      <w:r>
+        <w:rPr>
+          <w:lang w:val="pt-PT"/>
+        </w:rPr>
+        <w:t>artistas com maior discrepância</w:t>
+      </w:r>
+    </w:p>
+    <w:p>
+      <w:pPr>
+        <w:pStyle w:val="PargrafodaLista"/>
+        <w:numPr>
+          <w:ilvl w:val="0"/>
+          <w:numId w:val="23"/>
+        </w:numPr>
+        <w:rPr>
+          <w:lang w:val="pt-PT"/>
+        </w:rPr>
+      </w:pPr>
+      <w:r>
+        <w:rPr>
+          <w:lang w:val="pt-PT"/>
+        </w:rPr>
+        <w:t>artistas com maior quantidade de faixas zero</w:t>
+      </w:r>
+    </w:p>
+    <w:p>
+      <w:pPr>
+        <w:rPr>
+          <w:b/>
+          <w:bCs/>
+          <w:i/>
+          <w:iCs/>
+          <w:lang w:val="pt-PT"/>
+        </w:rPr>
+      </w:pPr>
+      <w:r>
+        <w:rPr>
+          <w:b/>
+          <w:bCs/>
+          <w:i/>
+          <w:iCs/>
+          <w:lang w:val="pt-PT"/>
+        </w:rPr>
+        <w:t>Aba 4 – Linha do tempo</w:t>
+      </w:r>
+    </w:p>
+    <w:p>
+      <w:pPr>
+        <w:pStyle w:val="PargrafodaLista"/>
+        <w:numPr>
+          <w:ilvl w:val="0"/>
+          <w:numId w:val="24"/>
+        </w:numPr>
+        <w:rPr>
+          <w:lang w:val="pt-PT"/>
+        </w:rPr>
+      </w:pPr>
+      <w:r>
+        <w:rPr>
+          <w:lang w:val="pt-PT"/>
+        </w:rPr>
+        <w:t>lançamentos por ano</w:t>
+      </w:r>
+    </w:p>
+    <w:p>
+      <w:pPr>
+        <w:pStyle w:val="PargrafodaLista"/>
+        <w:numPr>
+          <w:ilvl w:val="0"/>
+          <w:numId w:val="24"/>
+        </w:numPr>
+        <w:rPr>
+          <w:lang w:val="pt-PT"/>
+        </w:rPr>
+      </w:pPr>
+      <w:r>
+        <w:rPr>
+          <w:lang w:val="pt-PT"/>
+        </w:rPr>
+        <w:t>leitura interpretativa sobre tendências temporal-musicais</w:t>
+      </w:r>
+    </w:p>
+    <w:p>
+      <w:pPr>
+        <w:pStyle w:val="PargrafodaLista"/>
+        <w:numPr>
+          <w:ilvl w:val="0"/>
+          <w:numId w:val="24"/>
+        </w:numPr>
+        <w:rPr>
+          <w:lang w:val="pt-PT"/>
+        </w:rPr>
+      </w:pPr>
+      <w:r>
+        <w:rPr>
+          <w:lang w:val="pt-PT"/>
+        </w:rPr>
+        <w:t>Além disso, foram implementados filtros interativos:</w:t>
+      </w:r>
+    </w:p>
+    <w:p>
+      <w:pPr>
+        <w:pStyle w:val="PargrafodaLista"/>
+        <w:numPr>
+          <w:ilvl w:val="0"/>
+          <w:numId w:val="24"/>
+        </w:numPr>
+        <w:rPr>
+          <w:lang w:val="pt-PT"/>
+        </w:rPr>
+      </w:pPr>
+      <w:proofErr w:type="spellStart"/>
+      <w:r>
+        <w:rPr>
+          <w:lang w:val="pt-PT"/>
+        </w:rPr>
+        <w:t>multiselect</w:t>
+      </w:r>
+      <w:proofErr w:type="spellEnd"/>
+      <w:r>
+        <w:rPr>
+          <w:lang w:val="pt-PT"/>
+        </w:rPr>
+        <w:t xml:space="preserve"> de gêneros</w:t>
+      </w:r>
+    </w:p>
+    <w:p>
+      <w:pPr>
+        <w:pStyle w:val="PargrafodaLista"/>
+        <w:numPr>
+          <w:ilvl w:val="0"/>
+          <w:numId w:val="24"/>
+        </w:numPr>
+        <w:rPr>
+          <w:lang w:val="pt-PT"/>
+        </w:rPr>
+      </w:pPr>
+      <w:r>
+        <w:rPr>
+          <w:lang w:val="pt-PT"/>
+        </w:rPr>
+        <w:t>controle de período de anos</w:t>
+      </w:r>
+    </w:p>
+    <w:p>
+      <w:pPr>
+        <w:pStyle w:val="PargrafodaLista"/>
+        <w:numPr>
+          <w:ilvl w:val="0"/>
+          <w:numId w:val="24"/>
+        </w:numPr>
+        <w:rPr>
+          <w:lang w:val="pt-PT"/>
+        </w:rPr>
+      </w:pPr>
+      <w:r>
+        <w:rPr>
+          <w:lang w:val="pt-PT"/>
+        </w:rPr>
+        <w:t>controle de popularidade mínima</w:t>
+      </w:r>
+    </w:p>
+    <w:p>
+      <w:pPr>
+        <w:rPr>
+          <w:lang w:val="pt-PT"/>
+        </w:rPr>
+      </w:pPr>
+      <w:r>
+        <w:rPr>
+          <w:lang w:val="pt-PT"/>
+        </w:rPr>
+        <w:t>Esses filtros permitem ao usuário explorar padrões específicos e construir análises próprias.</w:t>
+      </w:r>
+    </w:p>
+    <w:p>
+      <w:pPr>
+        <w:pStyle w:val="Ttulo2"/>
+        <w:spacing w:before="360" w:after="360"/>
+        <w:rPr>
+          <w:lang w:val="pt-PT"/>
+        </w:rPr>
+      </w:pPr>
+      <w:r>
+        <w:rPr>
+          <w:lang w:val="pt-PT"/>
+        </w:rPr>
+        <w:t>3.4 Documentação no Notebook</w:t>
+      </w:r>
+    </w:p>
+    <w:p>
+      <w:pPr>
+        <w:rPr>
+          <w:lang w:val="pt-PT"/>
+        </w:rPr>
+      </w:pPr>
+      <w:r>
+        <w:rPr>
+          <w:lang w:val="pt-PT"/>
+        </w:rPr>
+        <w:t>A Célula 26 documenta a criação do protótipo e seus objetivos.</w:t>
+      </w:r>
+    </w:p>
+    <w:p>
+      <w:pPr>
+        <w:rPr>
+          <w:lang w:val="pt-PT"/>
+        </w:rPr>
+      </w:pPr>
+      <w:r>
+        <w:rPr>
+          <w:lang w:val="pt-PT"/>
+        </w:rPr>
+        <w:t>A Célula 27 salva o arquivo .</w:t>
+      </w:r>
+      <w:proofErr w:type="spellStart"/>
+      <w:r>
+        <w:rPr>
+          <w:lang w:val="pt-PT"/>
+        </w:rPr>
+        <w:t>py</w:t>
+      </w:r>
+      <w:proofErr w:type="spellEnd"/>
+      <w:r>
+        <w:rPr>
+          <w:lang w:val="pt-PT"/>
+        </w:rPr>
+        <w:t xml:space="preserve"> no ambiente, permitindo </w:t>
+      </w:r>
+      <w:proofErr w:type="spellStart"/>
+      <w:r>
+        <w:rPr>
+          <w:lang w:val="pt-PT"/>
+        </w:rPr>
+        <w:t>commit</w:t>
+      </w:r>
+      <w:proofErr w:type="spellEnd"/>
+      <w:r>
+        <w:rPr>
+          <w:lang w:val="pt-PT"/>
+        </w:rPr>
+        <w:t xml:space="preserve"> para o GitHub.</w:t>
+      </w:r>
+    </w:p>
+    <w:p>
+      <w:pPr>
+        <w:rPr>
+          <w:lang w:val="pt-PT"/>
+        </w:rPr>
+      </w:pPr>
+      <w:r>
+        <w:rPr>
+          <w:lang w:val="pt-PT"/>
+        </w:rPr>
+        <w:lastRenderedPageBreak/>
+        <w:t>Essa organização garante rastreabilidade, execução reprodutível e documentação clara do fluxo de trabalho.</w:t>
+      </w:r>
+    </w:p>
+    <w:p>
+      <w:pPr>
+        <w:pStyle w:val="Ttulo1"/>
+        <w:rPr>
+          <w:lang w:val="pt-PT"/>
+        </w:rPr>
+      </w:pPr>
+      <w:r>
+        <w:rPr>
+          <w:lang w:val="pt-PT"/>
+        </w:rPr>
+        <w:t>4. Resultados Obtidos</w:t>
+      </w:r>
+    </w:p>
+    <w:p>
+      <w:pPr>
+        <w:rPr>
+          <w:lang w:val="pt-PT"/>
+        </w:rPr>
+      </w:pPr>
+      <w:r>
+        <w:rPr>
+          <w:lang w:val="pt-PT"/>
+        </w:rPr>
         <w:t>A I</w:t>
       </w:r>
       <w:proofErr w:type="spellStart"/>
@@ -7958,20 +9736,147 @@
         <w:rPr>
           <w:lang w:val="pt-PT"/>
         </w:rPr>
-        <w:t xml:space="preserve"> 3.2 atingiu integralmente seus objetivos, convertendo resultados quantitativos em narrativa de valor interpretativo e mercadológico. A Célula 25 sintetiza esse processo com rigor técnico e clareza metodológica.</w:t>
-      </w:r>
-    </w:p>
-    <w:p>
-      <w:pPr>
-        <w:rPr>
-          <w:lang w:val="pt-PT"/>
-        </w:rPr>
-      </w:pPr>
-      <w:r>
-        <w:rPr>
-          <w:lang w:val="pt-PT"/>
-        </w:rPr>
-        <w:t xml:space="preserve">Este conteúdo permitirá avançar para a </w:t>
+        <w:t xml:space="preserve"> 3.3 foi concluída com a criação de um protótipo funcional, navegável e coerente com o </w:t>
+      </w:r>
+      <w:proofErr w:type="spellStart"/>
+      <w:r>
+        <w:rPr>
+          <w:lang w:val="pt-PT"/>
+        </w:rPr>
+        <w:t>storytelling</w:t>
+      </w:r>
+      <w:proofErr w:type="spellEnd"/>
+      <w:r>
+        <w:rPr>
+          <w:lang w:val="pt-PT"/>
+        </w:rPr>
+        <w:t xml:space="preserve"> da Semana 3. O </w:t>
+      </w:r>
+      <w:proofErr w:type="spellStart"/>
+      <w:r>
+        <w:rPr>
+          <w:lang w:val="pt-PT"/>
+        </w:rPr>
+        <w:t>dashboard</w:t>
+      </w:r>
+      <w:proofErr w:type="spellEnd"/>
+      <w:r>
+        <w:rPr>
+          <w:lang w:val="pt-PT"/>
+        </w:rPr>
+        <w:t xml:space="preserve"> já apresenta:</w:t>
+      </w:r>
+    </w:p>
+    <w:p>
+      <w:pPr>
+        <w:pStyle w:val="PargrafodaLista"/>
+        <w:numPr>
+          <w:ilvl w:val="0"/>
+          <w:numId w:val="25"/>
+        </w:numPr>
+        <w:rPr>
+          <w:lang w:val="pt-PT"/>
+        </w:rPr>
+      </w:pPr>
+      <w:r>
+        <w:rPr>
+          <w:lang w:val="pt-PT"/>
+        </w:rPr>
+        <w:t>interatividade completa,</w:t>
+      </w:r>
+    </w:p>
+    <w:p>
+      <w:pPr>
+        <w:pStyle w:val="PargrafodaLista"/>
+        <w:numPr>
+          <w:ilvl w:val="0"/>
+          <w:numId w:val="25"/>
+        </w:numPr>
+        <w:rPr>
+          <w:lang w:val="pt-PT"/>
+        </w:rPr>
+      </w:pPr>
+      <w:r>
+        <w:rPr>
+          <w:lang w:val="pt-PT"/>
+        </w:rPr>
+        <w:t>insights integrados,</w:t>
+      </w:r>
+    </w:p>
+    <w:p>
+      <w:pPr>
+        <w:pStyle w:val="PargrafodaLista"/>
+        <w:numPr>
+          <w:ilvl w:val="0"/>
+          <w:numId w:val="25"/>
+        </w:numPr>
+        <w:rPr>
+          <w:lang w:val="pt-PT"/>
+        </w:rPr>
+      </w:pPr>
+      <w:r>
+        <w:rPr>
+          <w:lang w:val="pt-PT"/>
+        </w:rPr>
+        <w:t>visualização clara do comportamento das variáveis,</w:t>
+      </w:r>
+    </w:p>
+    <w:p>
+      <w:pPr>
+        <w:pStyle w:val="PargrafodaLista"/>
+        <w:numPr>
+          <w:ilvl w:val="0"/>
+          <w:numId w:val="25"/>
+        </w:numPr>
+        <w:rPr>
+          <w:lang w:val="pt-PT"/>
+        </w:rPr>
+      </w:pPr>
+      <w:r>
+        <w:rPr>
+          <w:lang w:val="pt-PT"/>
+        </w:rPr>
+        <w:t>base sólida para evolução, refinamento visual e narrativa interativa na Semana 4.</w:t>
+      </w:r>
+    </w:p>
+    <w:p>
+      <w:pPr>
+        <w:rPr>
+          <w:lang w:val="pt-PT"/>
+        </w:rPr>
+      </w:pPr>
+      <w:r>
+        <w:rPr>
+          <w:lang w:val="pt-PT"/>
+        </w:rPr>
+        <w:t>O protótipo cumpre o papel de consolidar e comunicar o aprendizado obtido nas etapas anteriores.</w:t>
+      </w:r>
+    </w:p>
+    <w:p>
+      <w:pPr>
+        <w:pStyle w:val="Ttulo1"/>
+        <w:rPr>
+          <w:lang w:val="pt-PT"/>
+        </w:rPr>
+      </w:pPr>
+      <w:r>
+        <w:rPr>
+          <w:lang w:val="pt-PT"/>
+        </w:rPr>
+        <w:t>5. Conclusão</w:t>
+      </w:r>
+    </w:p>
+    <w:p>
+      <w:pPr>
+        <w:rPr>
+          <w:lang w:val="pt-PT"/>
+        </w:rPr>
+      </w:pPr>
+      <w:r>
+        <w:rPr>
+          <w:lang w:val="pt-PT"/>
+        </w:rPr>
+        <w:t xml:space="preserve">A </w:t>
       </w:r>
       <w:proofErr w:type="spellStart"/>
       <w:r>
@@ -7985,7 +9890,20 @@
         <w:rPr>
           <w:lang w:val="pt-PT"/>
         </w:rPr>
-        <w:t xml:space="preserve"> 3.3 com entendimento profundo dos padrões musicais, gerando um </w:t>
+        <w:t xml:space="preserve"> 3.3 foi entregue em 14/11/2025, cumprindo inteiramente as exigências da Semana 3.</w:t>
+      </w:r>
+    </w:p>
+    <w:p>
+      <w:pPr>
+        <w:rPr>
+          <w:lang w:val="pt-PT"/>
+        </w:rPr>
+      </w:pPr>
+      <w:r>
+        <w:rPr>
+          <w:lang w:val="pt-PT"/>
+        </w:rPr>
+        <w:t xml:space="preserve">O </w:t>
       </w:r>
       <w:proofErr w:type="spellStart"/>
       <w:r>
@@ -7999,7 +9917,106 @@
         <w:rPr>
           <w:lang w:val="pt-PT"/>
         </w:rPr>
-        <w:t xml:space="preserve"> mais coerente, interpretativo e orientado a decisões.</w:t>
+        <w:t xml:space="preserve"> criado fornece uma estrutura robusta para o desenvolvimento da versão final e demonstra:</w:t>
+      </w:r>
+    </w:p>
+    <w:p>
+      <w:pPr>
+        <w:pStyle w:val="PargrafodaLista"/>
+        <w:numPr>
+          <w:ilvl w:val="0"/>
+          <w:numId w:val="26"/>
+        </w:numPr>
+        <w:rPr>
+          <w:lang w:val="pt-PT"/>
+        </w:rPr>
+      </w:pPr>
+      <w:r>
+        <w:rPr>
+          <w:lang w:val="pt-PT"/>
+        </w:rPr>
+        <w:t>domínio das ferramentas de visualização,</w:t>
+      </w:r>
+    </w:p>
+    <w:p>
+      <w:pPr>
+        <w:pStyle w:val="PargrafodaLista"/>
+        <w:numPr>
+          <w:ilvl w:val="0"/>
+          <w:numId w:val="26"/>
+        </w:numPr>
+        <w:rPr>
+          <w:lang w:val="pt-PT"/>
+        </w:rPr>
+      </w:pPr>
+      <w:r>
+        <w:rPr>
+          <w:lang w:val="pt-PT"/>
+        </w:rPr>
+        <w:t xml:space="preserve">integração entre análise estatística e </w:t>
+      </w:r>
+      <w:proofErr w:type="spellStart"/>
+      <w:r>
+        <w:rPr>
+          <w:lang w:val="pt-PT"/>
+        </w:rPr>
+        <w:t>storytelling</w:t>
+      </w:r>
+      <w:proofErr w:type="spellEnd"/>
+      <w:r>
+        <w:rPr>
+          <w:lang w:val="pt-PT"/>
+        </w:rPr>
+        <w:t>,</w:t>
+      </w:r>
+    </w:p>
+    <w:p>
+      <w:pPr>
+        <w:pStyle w:val="PargrafodaLista"/>
+        <w:numPr>
+          <w:ilvl w:val="0"/>
+          <w:numId w:val="26"/>
+        </w:numPr>
+        <w:rPr>
+          <w:lang w:val="pt-PT"/>
+        </w:rPr>
+      </w:pPr>
+      <w:r>
+        <w:rPr>
+          <w:lang w:val="pt-PT"/>
+        </w:rPr>
+        <w:t>organização de dados em uma interface interativa,</w:t>
+      </w:r>
+    </w:p>
+    <w:p>
+      <w:pPr>
+        <w:pStyle w:val="PargrafodaLista"/>
+        <w:numPr>
+          <w:ilvl w:val="0"/>
+          <w:numId w:val="26"/>
+        </w:numPr>
+        <w:rPr>
+          <w:lang w:val="pt-PT"/>
+        </w:rPr>
+      </w:pPr>
+      <w:r>
+        <w:rPr>
+          <w:lang w:val="pt-PT"/>
+        </w:rPr>
+        <w:t>capacidade de transformar análises em produtos exploráveis.</w:t>
+      </w:r>
+    </w:p>
+    <w:p>
+      <w:pPr>
+        <w:rPr>
+          <w:lang w:val="pt-PT"/>
+        </w:rPr>
+      </w:pPr>
+      <w:r>
+        <w:rPr>
+          <w:lang w:val="pt-PT"/>
+        </w:rPr>
+        <w:t>O resultado representa um avanço significativo na transformação das análises em insights visualmente acessíveis.</w:t>
       </w:r>
     </w:p>
     <w:sectPr>
@@ -8186,6 +10203,1249 @@
     </w:lvl>
   </w:abstractNum>
   <w:abstractNum w:abstractNumId="9" w15:restartNumberingAfterBreak="0">
+    <w:nsid w:val="027F0179"/>
+    <w:multiLevelType w:val="hybridMultilevel"/>
+    <w:tmpl w:val="5E0C8070"/>
+    <w:lvl w:ilvl="0" w:tplc="08160001">
+      <w:start w:val="1"/>
+      <w:numFmt w:val="bullet"/>
+      <w:lvlText w:val=""/>
+      <w:lvlJc w:val="left"/>
+      <w:pPr>
+        <w:ind w:left="1429" w:hanging="360"/>
+      </w:pPr>
+      <w:rPr>
+        <w:rFonts w:ascii="Symbol" w:hAnsi="Symbol" w:hint="default"/>
+      </w:rPr>
+    </w:lvl>
+    <w:lvl w:ilvl="1" w:tplc="08160003" w:tentative="1">
+      <w:start w:val="1"/>
+      <w:numFmt w:val="bullet"/>
+      <w:lvlText w:val="o"/>
+      <w:lvlJc w:val="left"/>
+      <w:pPr>
+        <w:ind w:left="2149" w:hanging="360"/>
+      </w:pPr>
+      <w:rPr>
+        <w:rFonts w:ascii="Courier New" w:hAnsi="Courier New" w:cs="Courier New" w:hint="default"/>
+      </w:rPr>
+    </w:lvl>
+    <w:lvl w:ilvl="2" w:tplc="08160005" w:tentative="1">
+      <w:start w:val="1"/>
+      <w:numFmt w:val="bullet"/>
+      <w:lvlText w:val=""/>
+      <w:lvlJc w:val="left"/>
+      <w:pPr>
+        <w:ind w:left="2869" w:hanging="360"/>
+      </w:pPr>
+      <w:rPr>
+        <w:rFonts w:ascii="Wingdings" w:hAnsi="Wingdings" w:hint="default"/>
+      </w:rPr>
+    </w:lvl>
+    <w:lvl w:ilvl="3" w:tplc="08160001" w:tentative="1">
+      <w:start w:val="1"/>
+      <w:numFmt w:val="bullet"/>
+      <w:lvlText w:val=""/>
+      <w:lvlJc w:val="left"/>
+      <w:pPr>
+        <w:ind w:left="3589" w:hanging="360"/>
+      </w:pPr>
+      <w:rPr>
+        <w:rFonts w:ascii="Symbol" w:hAnsi="Symbol" w:hint="default"/>
+      </w:rPr>
+    </w:lvl>
+    <w:lvl w:ilvl="4" w:tplc="08160003" w:tentative="1">
+      <w:start w:val="1"/>
+      <w:numFmt w:val="bullet"/>
+      <w:lvlText w:val="o"/>
+      <w:lvlJc w:val="left"/>
+      <w:pPr>
+        <w:ind w:left="4309" w:hanging="360"/>
+      </w:pPr>
+      <w:rPr>
+        <w:rFonts w:ascii="Courier New" w:hAnsi="Courier New" w:cs="Courier New" w:hint="default"/>
+      </w:rPr>
+    </w:lvl>
+    <w:lvl w:ilvl="5" w:tplc="08160005" w:tentative="1">
+      <w:start w:val="1"/>
+      <w:numFmt w:val="bullet"/>
+      <w:lvlText w:val=""/>
+      <w:lvlJc w:val="left"/>
+      <w:pPr>
+        <w:ind w:left="5029" w:hanging="360"/>
+      </w:pPr>
+      <w:rPr>
+        <w:rFonts w:ascii="Wingdings" w:hAnsi="Wingdings" w:hint="default"/>
+      </w:rPr>
+    </w:lvl>
+    <w:lvl w:ilvl="6" w:tplc="08160001" w:tentative="1">
+      <w:start w:val="1"/>
+      <w:numFmt w:val="bullet"/>
+      <w:lvlText w:val=""/>
+      <w:lvlJc w:val="left"/>
+      <w:pPr>
+        <w:ind w:left="5749" w:hanging="360"/>
+      </w:pPr>
+      <w:rPr>
+        <w:rFonts w:ascii="Symbol" w:hAnsi="Symbol" w:hint="default"/>
+      </w:rPr>
+    </w:lvl>
+    <w:lvl w:ilvl="7" w:tplc="08160003" w:tentative="1">
+      <w:start w:val="1"/>
+      <w:numFmt w:val="bullet"/>
+      <w:lvlText w:val="o"/>
+      <w:lvlJc w:val="left"/>
+      <w:pPr>
+        <w:ind w:left="6469" w:hanging="360"/>
+      </w:pPr>
+      <w:rPr>
+        <w:rFonts w:ascii="Courier New" w:hAnsi="Courier New" w:cs="Courier New" w:hint="default"/>
+      </w:rPr>
+    </w:lvl>
+    <w:lvl w:ilvl="8" w:tplc="08160005" w:tentative="1">
+      <w:start w:val="1"/>
+      <w:numFmt w:val="bullet"/>
+      <w:lvlText w:val=""/>
+      <w:lvlJc w:val="left"/>
+      <w:pPr>
+        <w:ind w:left="7189" w:hanging="360"/>
+      </w:pPr>
+      <w:rPr>
+        <w:rFonts w:ascii="Wingdings" w:hAnsi="Wingdings" w:hint="default"/>
+      </w:rPr>
+    </w:lvl>
+  </w:abstractNum>
+  <w:abstractNum w:abstractNumId="10" w15:restartNumberingAfterBreak="0">
+    <w:nsid w:val="03D11D65"/>
+    <w:multiLevelType w:val="hybridMultilevel"/>
+    <w:tmpl w:val="DC484588"/>
+    <w:lvl w:ilvl="0" w:tplc="08160001">
+      <w:start w:val="1"/>
+      <w:numFmt w:val="bullet"/>
+      <w:lvlText w:val=""/>
+      <w:lvlJc w:val="left"/>
+      <w:pPr>
+        <w:ind w:left="1429" w:hanging="360"/>
+      </w:pPr>
+      <w:rPr>
+        <w:rFonts w:ascii="Symbol" w:hAnsi="Symbol" w:hint="default"/>
+      </w:rPr>
+    </w:lvl>
+    <w:lvl w:ilvl="1" w:tplc="08160003" w:tentative="1">
+      <w:start w:val="1"/>
+      <w:numFmt w:val="bullet"/>
+      <w:lvlText w:val="o"/>
+      <w:lvlJc w:val="left"/>
+      <w:pPr>
+        <w:ind w:left="2149" w:hanging="360"/>
+      </w:pPr>
+      <w:rPr>
+        <w:rFonts w:ascii="Courier New" w:hAnsi="Courier New" w:cs="Courier New" w:hint="default"/>
+      </w:rPr>
+    </w:lvl>
+    <w:lvl w:ilvl="2" w:tplc="08160005" w:tentative="1">
+      <w:start w:val="1"/>
+      <w:numFmt w:val="bullet"/>
+      <w:lvlText w:val=""/>
+      <w:lvlJc w:val="left"/>
+      <w:pPr>
+        <w:ind w:left="2869" w:hanging="360"/>
+      </w:pPr>
+      <w:rPr>
+        <w:rFonts w:ascii="Wingdings" w:hAnsi="Wingdings" w:hint="default"/>
+      </w:rPr>
+    </w:lvl>
+    <w:lvl w:ilvl="3" w:tplc="08160001" w:tentative="1">
+      <w:start w:val="1"/>
+      <w:numFmt w:val="bullet"/>
+      <w:lvlText w:val=""/>
+      <w:lvlJc w:val="left"/>
+      <w:pPr>
+        <w:ind w:left="3589" w:hanging="360"/>
+      </w:pPr>
+      <w:rPr>
+        <w:rFonts w:ascii="Symbol" w:hAnsi="Symbol" w:hint="default"/>
+      </w:rPr>
+    </w:lvl>
+    <w:lvl w:ilvl="4" w:tplc="08160003" w:tentative="1">
+      <w:start w:val="1"/>
+      <w:numFmt w:val="bullet"/>
+      <w:lvlText w:val="o"/>
+      <w:lvlJc w:val="left"/>
+      <w:pPr>
+        <w:ind w:left="4309" w:hanging="360"/>
+      </w:pPr>
+      <w:rPr>
+        <w:rFonts w:ascii="Courier New" w:hAnsi="Courier New" w:cs="Courier New" w:hint="default"/>
+      </w:rPr>
+    </w:lvl>
+    <w:lvl w:ilvl="5" w:tplc="08160005" w:tentative="1">
+      <w:start w:val="1"/>
+      <w:numFmt w:val="bullet"/>
+      <w:lvlText w:val=""/>
+      <w:lvlJc w:val="left"/>
+      <w:pPr>
+        <w:ind w:left="5029" w:hanging="360"/>
+      </w:pPr>
+      <w:rPr>
+        <w:rFonts w:ascii="Wingdings" w:hAnsi="Wingdings" w:hint="default"/>
+      </w:rPr>
+    </w:lvl>
+    <w:lvl w:ilvl="6" w:tplc="08160001" w:tentative="1">
+      <w:start w:val="1"/>
+      <w:numFmt w:val="bullet"/>
+      <w:lvlText w:val=""/>
+      <w:lvlJc w:val="left"/>
+      <w:pPr>
+        <w:ind w:left="5749" w:hanging="360"/>
+      </w:pPr>
+      <w:rPr>
+        <w:rFonts w:ascii="Symbol" w:hAnsi="Symbol" w:hint="default"/>
+      </w:rPr>
+    </w:lvl>
+    <w:lvl w:ilvl="7" w:tplc="08160003" w:tentative="1">
+      <w:start w:val="1"/>
+      <w:numFmt w:val="bullet"/>
+      <w:lvlText w:val="o"/>
+      <w:lvlJc w:val="left"/>
+      <w:pPr>
+        <w:ind w:left="6469" w:hanging="360"/>
+      </w:pPr>
+      <w:rPr>
+        <w:rFonts w:ascii="Courier New" w:hAnsi="Courier New" w:cs="Courier New" w:hint="default"/>
+      </w:rPr>
+    </w:lvl>
+    <w:lvl w:ilvl="8" w:tplc="08160005" w:tentative="1">
+      <w:start w:val="1"/>
+      <w:numFmt w:val="bullet"/>
+      <w:lvlText w:val=""/>
+      <w:lvlJc w:val="left"/>
+      <w:pPr>
+        <w:ind w:left="7189" w:hanging="360"/>
+      </w:pPr>
+      <w:rPr>
+        <w:rFonts w:ascii="Wingdings" w:hAnsi="Wingdings" w:hint="default"/>
+      </w:rPr>
+    </w:lvl>
+  </w:abstractNum>
+  <w:abstractNum w:abstractNumId="11" w15:restartNumberingAfterBreak="0">
+    <w:nsid w:val="083E6497"/>
+    <w:multiLevelType w:val="hybridMultilevel"/>
+    <w:tmpl w:val="9BD830EC"/>
+    <w:lvl w:ilvl="0" w:tplc="08160001">
+      <w:start w:val="1"/>
+      <w:numFmt w:val="bullet"/>
+      <w:lvlText w:val=""/>
+      <w:lvlJc w:val="left"/>
+      <w:pPr>
+        <w:ind w:left="1429" w:hanging="360"/>
+      </w:pPr>
+      <w:rPr>
+        <w:rFonts w:ascii="Symbol" w:hAnsi="Symbol" w:hint="default"/>
+      </w:rPr>
+    </w:lvl>
+    <w:lvl w:ilvl="1" w:tplc="08160003" w:tentative="1">
+      <w:start w:val="1"/>
+      <w:numFmt w:val="bullet"/>
+      <w:lvlText w:val="o"/>
+      <w:lvlJc w:val="left"/>
+      <w:pPr>
+        <w:ind w:left="2149" w:hanging="360"/>
+      </w:pPr>
+      <w:rPr>
+        <w:rFonts w:ascii="Courier New" w:hAnsi="Courier New" w:cs="Courier New" w:hint="default"/>
+      </w:rPr>
+    </w:lvl>
+    <w:lvl w:ilvl="2" w:tplc="08160005" w:tentative="1">
+      <w:start w:val="1"/>
+      <w:numFmt w:val="bullet"/>
+      <w:lvlText w:val=""/>
+      <w:lvlJc w:val="left"/>
+      <w:pPr>
+        <w:ind w:left="2869" w:hanging="360"/>
+      </w:pPr>
+      <w:rPr>
+        <w:rFonts w:ascii="Wingdings" w:hAnsi="Wingdings" w:hint="default"/>
+      </w:rPr>
+    </w:lvl>
+    <w:lvl w:ilvl="3" w:tplc="08160001" w:tentative="1">
+      <w:start w:val="1"/>
+      <w:numFmt w:val="bullet"/>
+      <w:lvlText w:val=""/>
+      <w:lvlJc w:val="left"/>
+      <w:pPr>
+        <w:ind w:left="3589" w:hanging="360"/>
+      </w:pPr>
+      <w:rPr>
+        <w:rFonts w:ascii="Symbol" w:hAnsi="Symbol" w:hint="default"/>
+      </w:rPr>
+    </w:lvl>
+    <w:lvl w:ilvl="4" w:tplc="08160003" w:tentative="1">
+      <w:start w:val="1"/>
+      <w:numFmt w:val="bullet"/>
+      <w:lvlText w:val="o"/>
+      <w:lvlJc w:val="left"/>
+      <w:pPr>
+        <w:ind w:left="4309" w:hanging="360"/>
+      </w:pPr>
+      <w:rPr>
+        <w:rFonts w:ascii="Courier New" w:hAnsi="Courier New" w:cs="Courier New" w:hint="default"/>
+      </w:rPr>
+    </w:lvl>
+    <w:lvl w:ilvl="5" w:tplc="08160005" w:tentative="1">
+      <w:start w:val="1"/>
+      <w:numFmt w:val="bullet"/>
+      <w:lvlText w:val=""/>
+      <w:lvlJc w:val="left"/>
+      <w:pPr>
+        <w:ind w:left="5029" w:hanging="360"/>
+      </w:pPr>
+      <w:rPr>
+        <w:rFonts w:ascii="Wingdings" w:hAnsi="Wingdings" w:hint="default"/>
+      </w:rPr>
+    </w:lvl>
+    <w:lvl w:ilvl="6" w:tplc="08160001" w:tentative="1">
+      <w:start w:val="1"/>
+      <w:numFmt w:val="bullet"/>
+      <w:lvlText w:val=""/>
+      <w:lvlJc w:val="left"/>
+      <w:pPr>
+        <w:ind w:left="5749" w:hanging="360"/>
+      </w:pPr>
+      <w:rPr>
+        <w:rFonts w:ascii="Symbol" w:hAnsi="Symbol" w:hint="default"/>
+      </w:rPr>
+    </w:lvl>
+    <w:lvl w:ilvl="7" w:tplc="08160003" w:tentative="1">
+      <w:start w:val="1"/>
+      <w:numFmt w:val="bullet"/>
+      <w:lvlText w:val="o"/>
+      <w:lvlJc w:val="left"/>
+      <w:pPr>
+        <w:ind w:left="6469" w:hanging="360"/>
+      </w:pPr>
+      <w:rPr>
+        <w:rFonts w:ascii="Courier New" w:hAnsi="Courier New" w:cs="Courier New" w:hint="default"/>
+      </w:rPr>
+    </w:lvl>
+    <w:lvl w:ilvl="8" w:tplc="08160005" w:tentative="1">
+      <w:start w:val="1"/>
+      <w:numFmt w:val="bullet"/>
+      <w:lvlText w:val=""/>
+      <w:lvlJc w:val="left"/>
+      <w:pPr>
+        <w:ind w:left="7189" w:hanging="360"/>
+      </w:pPr>
+      <w:rPr>
+        <w:rFonts w:ascii="Wingdings" w:hAnsi="Wingdings" w:hint="default"/>
+      </w:rPr>
+    </w:lvl>
+  </w:abstractNum>
+  <w:abstractNum w:abstractNumId="12" w15:restartNumberingAfterBreak="0">
+    <w:nsid w:val="0F310BAD"/>
+    <w:multiLevelType w:val="hybridMultilevel"/>
+    <w:tmpl w:val="48427A78"/>
+    <w:lvl w:ilvl="0" w:tplc="08160001">
+      <w:start w:val="1"/>
+      <w:numFmt w:val="bullet"/>
+      <w:lvlText w:val=""/>
+      <w:lvlJc w:val="left"/>
+      <w:pPr>
+        <w:ind w:left="1429" w:hanging="360"/>
+      </w:pPr>
+      <w:rPr>
+        <w:rFonts w:ascii="Symbol" w:hAnsi="Symbol" w:hint="default"/>
+      </w:rPr>
+    </w:lvl>
+    <w:lvl w:ilvl="1" w:tplc="08160003" w:tentative="1">
+      <w:start w:val="1"/>
+      <w:numFmt w:val="bullet"/>
+      <w:lvlText w:val="o"/>
+      <w:lvlJc w:val="left"/>
+      <w:pPr>
+        <w:ind w:left="2149" w:hanging="360"/>
+      </w:pPr>
+      <w:rPr>
+        <w:rFonts w:ascii="Courier New" w:hAnsi="Courier New" w:cs="Courier New" w:hint="default"/>
+      </w:rPr>
+    </w:lvl>
+    <w:lvl w:ilvl="2" w:tplc="08160005" w:tentative="1">
+      <w:start w:val="1"/>
+      <w:numFmt w:val="bullet"/>
+      <w:lvlText w:val=""/>
+      <w:lvlJc w:val="left"/>
+      <w:pPr>
+        <w:ind w:left="2869" w:hanging="360"/>
+      </w:pPr>
+      <w:rPr>
+        <w:rFonts w:ascii="Wingdings" w:hAnsi="Wingdings" w:hint="default"/>
+      </w:rPr>
+    </w:lvl>
+    <w:lvl w:ilvl="3" w:tplc="08160001" w:tentative="1">
+      <w:start w:val="1"/>
+      <w:numFmt w:val="bullet"/>
+      <w:lvlText w:val=""/>
+      <w:lvlJc w:val="left"/>
+      <w:pPr>
+        <w:ind w:left="3589" w:hanging="360"/>
+      </w:pPr>
+      <w:rPr>
+        <w:rFonts w:ascii="Symbol" w:hAnsi="Symbol" w:hint="default"/>
+      </w:rPr>
+    </w:lvl>
+    <w:lvl w:ilvl="4" w:tplc="08160003" w:tentative="1">
+      <w:start w:val="1"/>
+      <w:numFmt w:val="bullet"/>
+      <w:lvlText w:val="o"/>
+      <w:lvlJc w:val="left"/>
+      <w:pPr>
+        <w:ind w:left="4309" w:hanging="360"/>
+      </w:pPr>
+      <w:rPr>
+        <w:rFonts w:ascii="Courier New" w:hAnsi="Courier New" w:cs="Courier New" w:hint="default"/>
+      </w:rPr>
+    </w:lvl>
+    <w:lvl w:ilvl="5" w:tplc="08160005" w:tentative="1">
+      <w:start w:val="1"/>
+      <w:numFmt w:val="bullet"/>
+      <w:lvlText w:val=""/>
+      <w:lvlJc w:val="left"/>
+      <w:pPr>
+        <w:ind w:left="5029" w:hanging="360"/>
+      </w:pPr>
+      <w:rPr>
+        <w:rFonts w:ascii="Wingdings" w:hAnsi="Wingdings" w:hint="default"/>
+      </w:rPr>
+    </w:lvl>
+    <w:lvl w:ilvl="6" w:tplc="08160001" w:tentative="1">
+      <w:start w:val="1"/>
+      <w:numFmt w:val="bullet"/>
+      <w:lvlText w:val=""/>
+      <w:lvlJc w:val="left"/>
+      <w:pPr>
+        <w:ind w:left="5749" w:hanging="360"/>
+      </w:pPr>
+      <w:rPr>
+        <w:rFonts w:ascii="Symbol" w:hAnsi="Symbol" w:hint="default"/>
+      </w:rPr>
+    </w:lvl>
+    <w:lvl w:ilvl="7" w:tplc="08160003" w:tentative="1">
+      <w:start w:val="1"/>
+      <w:numFmt w:val="bullet"/>
+      <w:lvlText w:val="o"/>
+      <w:lvlJc w:val="left"/>
+      <w:pPr>
+        <w:ind w:left="6469" w:hanging="360"/>
+      </w:pPr>
+      <w:rPr>
+        <w:rFonts w:ascii="Courier New" w:hAnsi="Courier New" w:cs="Courier New" w:hint="default"/>
+      </w:rPr>
+    </w:lvl>
+    <w:lvl w:ilvl="8" w:tplc="08160005" w:tentative="1">
+      <w:start w:val="1"/>
+      <w:numFmt w:val="bullet"/>
+      <w:lvlText w:val=""/>
+      <w:lvlJc w:val="left"/>
+      <w:pPr>
+        <w:ind w:left="7189" w:hanging="360"/>
+      </w:pPr>
+      <w:rPr>
+        <w:rFonts w:ascii="Wingdings" w:hAnsi="Wingdings" w:hint="default"/>
+      </w:rPr>
+    </w:lvl>
+  </w:abstractNum>
+  <w:abstractNum w:abstractNumId="13" w15:restartNumberingAfterBreak="0">
+    <w:nsid w:val="138E5E53"/>
+    <w:multiLevelType w:val="hybridMultilevel"/>
+    <w:tmpl w:val="D20837C4"/>
+    <w:lvl w:ilvl="0" w:tplc="08160001">
+      <w:start w:val="1"/>
+      <w:numFmt w:val="bullet"/>
+      <w:lvlText w:val=""/>
+      <w:lvlJc w:val="left"/>
+      <w:pPr>
+        <w:ind w:left="1429" w:hanging="360"/>
+      </w:pPr>
+      <w:rPr>
+        <w:rFonts w:ascii="Symbol" w:hAnsi="Symbol" w:hint="default"/>
+      </w:rPr>
+    </w:lvl>
+    <w:lvl w:ilvl="1" w:tplc="08160003" w:tentative="1">
+      <w:start w:val="1"/>
+      <w:numFmt w:val="bullet"/>
+      <w:lvlText w:val="o"/>
+      <w:lvlJc w:val="left"/>
+      <w:pPr>
+        <w:ind w:left="2149" w:hanging="360"/>
+      </w:pPr>
+      <w:rPr>
+        <w:rFonts w:ascii="Courier New" w:hAnsi="Courier New" w:cs="Courier New" w:hint="default"/>
+      </w:rPr>
+    </w:lvl>
+    <w:lvl w:ilvl="2" w:tplc="08160005" w:tentative="1">
+      <w:start w:val="1"/>
+      <w:numFmt w:val="bullet"/>
+      <w:lvlText w:val=""/>
+      <w:lvlJc w:val="left"/>
+      <w:pPr>
+        <w:ind w:left="2869" w:hanging="360"/>
+      </w:pPr>
+      <w:rPr>
+        <w:rFonts w:ascii="Wingdings" w:hAnsi="Wingdings" w:hint="default"/>
+      </w:rPr>
+    </w:lvl>
+    <w:lvl w:ilvl="3" w:tplc="08160001" w:tentative="1">
+      <w:start w:val="1"/>
+      <w:numFmt w:val="bullet"/>
+      <w:lvlText w:val=""/>
+      <w:lvlJc w:val="left"/>
+      <w:pPr>
+        <w:ind w:left="3589" w:hanging="360"/>
+      </w:pPr>
+      <w:rPr>
+        <w:rFonts w:ascii="Symbol" w:hAnsi="Symbol" w:hint="default"/>
+      </w:rPr>
+    </w:lvl>
+    <w:lvl w:ilvl="4" w:tplc="08160003" w:tentative="1">
+      <w:start w:val="1"/>
+      <w:numFmt w:val="bullet"/>
+      <w:lvlText w:val="o"/>
+      <w:lvlJc w:val="left"/>
+      <w:pPr>
+        <w:ind w:left="4309" w:hanging="360"/>
+      </w:pPr>
+      <w:rPr>
+        <w:rFonts w:ascii="Courier New" w:hAnsi="Courier New" w:cs="Courier New" w:hint="default"/>
+      </w:rPr>
+    </w:lvl>
+    <w:lvl w:ilvl="5" w:tplc="08160005" w:tentative="1">
+      <w:start w:val="1"/>
+      <w:numFmt w:val="bullet"/>
+      <w:lvlText w:val=""/>
+      <w:lvlJc w:val="left"/>
+      <w:pPr>
+        <w:ind w:left="5029" w:hanging="360"/>
+      </w:pPr>
+      <w:rPr>
+        <w:rFonts w:ascii="Wingdings" w:hAnsi="Wingdings" w:hint="default"/>
+      </w:rPr>
+    </w:lvl>
+    <w:lvl w:ilvl="6" w:tplc="08160001" w:tentative="1">
+      <w:start w:val="1"/>
+      <w:numFmt w:val="bullet"/>
+      <w:lvlText w:val=""/>
+      <w:lvlJc w:val="left"/>
+      <w:pPr>
+        <w:ind w:left="5749" w:hanging="360"/>
+      </w:pPr>
+      <w:rPr>
+        <w:rFonts w:ascii="Symbol" w:hAnsi="Symbol" w:hint="default"/>
+      </w:rPr>
+    </w:lvl>
+    <w:lvl w:ilvl="7" w:tplc="08160003" w:tentative="1">
+      <w:start w:val="1"/>
+      <w:numFmt w:val="bullet"/>
+      <w:lvlText w:val="o"/>
+      <w:lvlJc w:val="left"/>
+      <w:pPr>
+        <w:ind w:left="6469" w:hanging="360"/>
+      </w:pPr>
+      <w:rPr>
+        <w:rFonts w:ascii="Courier New" w:hAnsi="Courier New" w:cs="Courier New" w:hint="default"/>
+      </w:rPr>
+    </w:lvl>
+    <w:lvl w:ilvl="8" w:tplc="08160005" w:tentative="1">
+      <w:start w:val="1"/>
+      <w:numFmt w:val="bullet"/>
+      <w:lvlText w:val=""/>
+      <w:lvlJc w:val="left"/>
+      <w:pPr>
+        <w:ind w:left="7189" w:hanging="360"/>
+      </w:pPr>
+      <w:rPr>
+        <w:rFonts w:ascii="Wingdings" w:hAnsi="Wingdings" w:hint="default"/>
+      </w:rPr>
+    </w:lvl>
+  </w:abstractNum>
+  <w:abstractNum w:abstractNumId="14" w15:restartNumberingAfterBreak="0">
+    <w:nsid w:val="1D266932"/>
+    <w:multiLevelType w:val="hybridMultilevel"/>
+    <w:tmpl w:val="D3BEA284"/>
+    <w:lvl w:ilvl="0" w:tplc="08160001">
+      <w:start w:val="1"/>
+      <w:numFmt w:val="bullet"/>
+      <w:lvlText w:val=""/>
+      <w:lvlJc w:val="left"/>
+      <w:pPr>
+        <w:ind w:left="1429" w:hanging="360"/>
+      </w:pPr>
+      <w:rPr>
+        <w:rFonts w:ascii="Symbol" w:hAnsi="Symbol" w:hint="default"/>
+      </w:rPr>
+    </w:lvl>
+    <w:lvl w:ilvl="1" w:tplc="08160003" w:tentative="1">
+      <w:start w:val="1"/>
+      <w:numFmt w:val="bullet"/>
+      <w:lvlText w:val="o"/>
+      <w:lvlJc w:val="left"/>
+      <w:pPr>
+        <w:ind w:left="2149" w:hanging="360"/>
+      </w:pPr>
+      <w:rPr>
+        <w:rFonts w:ascii="Courier New" w:hAnsi="Courier New" w:cs="Courier New" w:hint="default"/>
+      </w:rPr>
+    </w:lvl>
+    <w:lvl w:ilvl="2" w:tplc="08160005" w:tentative="1">
+      <w:start w:val="1"/>
+      <w:numFmt w:val="bullet"/>
+      <w:lvlText w:val=""/>
+      <w:lvlJc w:val="left"/>
+      <w:pPr>
+        <w:ind w:left="2869" w:hanging="360"/>
+      </w:pPr>
+      <w:rPr>
+        <w:rFonts w:ascii="Wingdings" w:hAnsi="Wingdings" w:hint="default"/>
+      </w:rPr>
+    </w:lvl>
+    <w:lvl w:ilvl="3" w:tplc="08160001" w:tentative="1">
+      <w:start w:val="1"/>
+      <w:numFmt w:val="bullet"/>
+      <w:lvlText w:val=""/>
+      <w:lvlJc w:val="left"/>
+      <w:pPr>
+        <w:ind w:left="3589" w:hanging="360"/>
+      </w:pPr>
+      <w:rPr>
+        <w:rFonts w:ascii="Symbol" w:hAnsi="Symbol" w:hint="default"/>
+      </w:rPr>
+    </w:lvl>
+    <w:lvl w:ilvl="4" w:tplc="08160003" w:tentative="1">
+      <w:start w:val="1"/>
+      <w:numFmt w:val="bullet"/>
+      <w:lvlText w:val="o"/>
+      <w:lvlJc w:val="left"/>
+      <w:pPr>
+        <w:ind w:left="4309" w:hanging="360"/>
+      </w:pPr>
+      <w:rPr>
+        <w:rFonts w:ascii="Courier New" w:hAnsi="Courier New" w:cs="Courier New" w:hint="default"/>
+      </w:rPr>
+    </w:lvl>
+    <w:lvl w:ilvl="5" w:tplc="08160005" w:tentative="1">
+      <w:start w:val="1"/>
+      <w:numFmt w:val="bullet"/>
+      <w:lvlText w:val=""/>
+      <w:lvlJc w:val="left"/>
+      <w:pPr>
+        <w:ind w:left="5029" w:hanging="360"/>
+      </w:pPr>
+      <w:rPr>
+        <w:rFonts w:ascii="Wingdings" w:hAnsi="Wingdings" w:hint="default"/>
+      </w:rPr>
+    </w:lvl>
+    <w:lvl w:ilvl="6" w:tplc="08160001" w:tentative="1">
+      <w:start w:val="1"/>
+      <w:numFmt w:val="bullet"/>
+      <w:lvlText w:val=""/>
+      <w:lvlJc w:val="left"/>
+      <w:pPr>
+        <w:ind w:left="5749" w:hanging="360"/>
+      </w:pPr>
+      <w:rPr>
+        <w:rFonts w:ascii="Symbol" w:hAnsi="Symbol" w:hint="default"/>
+      </w:rPr>
+    </w:lvl>
+    <w:lvl w:ilvl="7" w:tplc="08160003" w:tentative="1">
+      <w:start w:val="1"/>
+      <w:numFmt w:val="bullet"/>
+      <w:lvlText w:val="o"/>
+      <w:lvlJc w:val="left"/>
+      <w:pPr>
+        <w:ind w:left="6469" w:hanging="360"/>
+      </w:pPr>
+      <w:rPr>
+        <w:rFonts w:ascii="Courier New" w:hAnsi="Courier New" w:cs="Courier New" w:hint="default"/>
+      </w:rPr>
+    </w:lvl>
+    <w:lvl w:ilvl="8" w:tplc="08160005" w:tentative="1">
+      <w:start w:val="1"/>
+      <w:numFmt w:val="bullet"/>
+      <w:lvlText w:val=""/>
+      <w:lvlJc w:val="left"/>
+      <w:pPr>
+        <w:ind w:left="7189" w:hanging="360"/>
+      </w:pPr>
+      <w:rPr>
+        <w:rFonts w:ascii="Wingdings" w:hAnsi="Wingdings" w:hint="default"/>
+      </w:rPr>
+    </w:lvl>
+  </w:abstractNum>
+  <w:abstractNum w:abstractNumId="15" w15:restartNumberingAfterBreak="0">
+    <w:nsid w:val="2661137E"/>
+    <w:multiLevelType w:val="hybridMultilevel"/>
+    <w:tmpl w:val="0DCC86EE"/>
+    <w:lvl w:ilvl="0" w:tplc="08160001">
+      <w:start w:val="1"/>
+      <w:numFmt w:val="bullet"/>
+      <w:lvlText w:val=""/>
+      <w:lvlJc w:val="left"/>
+      <w:pPr>
+        <w:ind w:left="1429" w:hanging="360"/>
+      </w:pPr>
+      <w:rPr>
+        <w:rFonts w:ascii="Symbol" w:hAnsi="Symbol" w:hint="default"/>
+      </w:rPr>
+    </w:lvl>
+    <w:lvl w:ilvl="1" w:tplc="08160003" w:tentative="1">
+      <w:start w:val="1"/>
+      <w:numFmt w:val="bullet"/>
+      <w:lvlText w:val="o"/>
+      <w:lvlJc w:val="left"/>
+      <w:pPr>
+        <w:ind w:left="2149" w:hanging="360"/>
+      </w:pPr>
+      <w:rPr>
+        <w:rFonts w:ascii="Courier New" w:hAnsi="Courier New" w:cs="Courier New" w:hint="default"/>
+      </w:rPr>
+    </w:lvl>
+    <w:lvl w:ilvl="2" w:tplc="08160005" w:tentative="1">
+      <w:start w:val="1"/>
+      <w:numFmt w:val="bullet"/>
+      <w:lvlText w:val=""/>
+      <w:lvlJc w:val="left"/>
+      <w:pPr>
+        <w:ind w:left="2869" w:hanging="360"/>
+      </w:pPr>
+      <w:rPr>
+        <w:rFonts w:ascii="Wingdings" w:hAnsi="Wingdings" w:hint="default"/>
+      </w:rPr>
+    </w:lvl>
+    <w:lvl w:ilvl="3" w:tplc="08160001" w:tentative="1">
+      <w:start w:val="1"/>
+      <w:numFmt w:val="bullet"/>
+      <w:lvlText w:val=""/>
+      <w:lvlJc w:val="left"/>
+      <w:pPr>
+        <w:ind w:left="3589" w:hanging="360"/>
+      </w:pPr>
+      <w:rPr>
+        <w:rFonts w:ascii="Symbol" w:hAnsi="Symbol" w:hint="default"/>
+      </w:rPr>
+    </w:lvl>
+    <w:lvl w:ilvl="4" w:tplc="08160003" w:tentative="1">
+      <w:start w:val="1"/>
+      <w:numFmt w:val="bullet"/>
+      <w:lvlText w:val="o"/>
+      <w:lvlJc w:val="left"/>
+      <w:pPr>
+        <w:ind w:left="4309" w:hanging="360"/>
+      </w:pPr>
+      <w:rPr>
+        <w:rFonts w:ascii="Courier New" w:hAnsi="Courier New" w:cs="Courier New" w:hint="default"/>
+      </w:rPr>
+    </w:lvl>
+    <w:lvl w:ilvl="5" w:tplc="08160005" w:tentative="1">
+      <w:start w:val="1"/>
+      <w:numFmt w:val="bullet"/>
+      <w:lvlText w:val=""/>
+      <w:lvlJc w:val="left"/>
+      <w:pPr>
+        <w:ind w:left="5029" w:hanging="360"/>
+      </w:pPr>
+      <w:rPr>
+        <w:rFonts w:ascii="Wingdings" w:hAnsi="Wingdings" w:hint="default"/>
+      </w:rPr>
+    </w:lvl>
+    <w:lvl w:ilvl="6" w:tplc="08160001" w:tentative="1">
+      <w:start w:val="1"/>
+      <w:numFmt w:val="bullet"/>
+      <w:lvlText w:val=""/>
+      <w:lvlJc w:val="left"/>
+      <w:pPr>
+        <w:ind w:left="5749" w:hanging="360"/>
+      </w:pPr>
+      <w:rPr>
+        <w:rFonts w:ascii="Symbol" w:hAnsi="Symbol" w:hint="default"/>
+      </w:rPr>
+    </w:lvl>
+    <w:lvl w:ilvl="7" w:tplc="08160003" w:tentative="1">
+      <w:start w:val="1"/>
+      <w:numFmt w:val="bullet"/>
+      <w:lvlText w:val="o"/>
+      <w:lvlJc w:val="left"/>
+      <w:pPr>
+        <w:ind w:left="6469" w:hanging="360"/>
+      </w:pPr>
+      <w:rPr>
+        <w:rFonts w:ascii="Courier New" w:hAnsi="Courier New" w:cs="Courier New" w:hint="default"/>
+      </w:rPr>
+    </w:lvl>
+    <w:lvl w:ilvl="8" w:tplc="08160005" w:tentative="1">
+      <w:start w:val="1"/>
+      <w:numFmt w:val="bullet"/>
+      <w:lvlText w:val=""/>
+      <w:lvlJc w:val="left"/>
+      <w:pPr>
+        <w:ind w:left="7189" w:hanging="360"/>
+      </w:pPr>
+      <w:rPr>
+        <w:rFonts w:ascii="Wingdings" w:hAnsi="Wingdings" w:hint="default"/>
+      </w:rPr>
+    </w:lvl>
+  </w:abstractNum>
+  <w:abstractNum w:abstractNumId="16" w15:restartNumberingAfterBreak="0">
+    <w:nsid w:val="2A8D121F"/>
+    <w:multiLevelType w:val="hybridMultilevel"/>
+    <w:tmpl w:val="1314424E"/>
+    <w:lvl w:ilvl="0" w:tplc="08160001">
+      <w:start w:val="1"/>
+      <w:numFmt w:val="bullet"/>
+      <w:lvlText w:val=""/>
+      <w:lvlJc w:val="left"/>
+      <w:pPr>
+        <w:ind w:left="1429" w:hanging="360"/>
+      </w:pPr>
+      <w:rPr>
+        <w:rFonts w:ascii="Symbol" w:hAnsi="Symbol" w:hint="default"/>
+      </w:rPr>
+    </w:lvl>
+    <w:lvl w:ilvl="1" w:tplc="08160003" w:tentative="1">
+      <w:start w:val="1"/>
+      <w:numFmt w:val="bullet"/>
+      <w:lvlText w:val="o"/>
+      <w:lvlJc w:val="left"/>
+      <w:pPr>
+        <w:ind w:left="2149" w:hanging="360"/>
+      </w:pPr>
+      <w:rPr>
+        <w:rFonts w:ascii="Courier New" w:hAnsi="Courier New" w:cs="Courier New" w:hint="default"/>
+      </w:rPr>
+    </w:lvl>
+    <w:lvl w:ilvl="2" w:tplc="08160005" w:tentative="1">
+      <w:start w:val="1"/>
+      <w:numFmt w:val="bullet"/>
+      <w:lvlText w:val=""/>
+      <w:lvlJc w:val="left"/>
+      <w:pPr>
+        <w:ind w:left="2869" w:hanging="360"/>
+      </w:pPr>
+      <w:rPr>
+        <w:rFonts w:ascii="Wingdings" w:hAnsi="Wingdings" w:hint="default"/>
+      </w:rPr>
+    </w:lvl>
+    <w:lvl w:ilvl="3" w:tplc="08160001" w:tentative="1">
+      <w:start w:val="1"/>
+      <w:numFmt w:val="bullet"/>
+      <w:lvlText w:val=""/>
+      <w:lvlJc w:val="left"/>
+      <w:pPr>
+        <w:ind w:left="3589" w:hanging="360"/>
+      </w:pPr>
+      <w:rPr>
+        <w:rFonts w:ascii="Symbol" w:hAnsi="Symbol" w:hint="default"/>
+      </w:rPr>
+    </w:lvl>
+    <w:lvl w:ilvl="4" w:tplc="08160003" w:tentative="1">
+      <w:start w:val="1"/>
+      <w:numFmt w:val="bullet"/>
+      <w:lvlText w:val="o"/>
+      <w:lvlJc w:val="left"/>
+      <w:pPr>
+        <w:ind w:left="4309" w:hanging="360"/>
+      </w:pPr>
+      <w:rPr>
+        <w:rFonts w:ascii="Courier New" w:hAnsi="Courier New" w:cs="Courier New" w:hint="default"/>
+      </w:rPr>
+    </w:lvl>
+    <w:lvl w:ilvl="5" w:tplc="08160005" w:tentative="1">
+      <w:start w:val="1"/>
+      <w:numFmt w:val="bullet"/>
+      <w:lvlText w:val=""/>
+      <w:lvlJc w:val="left"/>
+      <w:pPr>
+        <w:ind w:left="5029" w:hanging="360"/>
+      </w:pPr>
+      <w:rPr>
+        <w:rFonts w:ascii="Wingdings" w:hAnsi="Wingdings" w:hint="default"/>
+      </w:rPr>
+    </w:lvl>
+    <w:lvl w:ilvl="6" w:tplc="08160001" w:tentative="1">
+      <w:start w:val="1"/>
+      <w:numFmt w:val="bullet"/>
+      <w:lvlText w:val=""/>
+      <w:lvlJc w:val="left"/>
+      <w:pPr>
+        <w:ind w:left="5749" w:hanging="360"/>
+      </w:pPr>
+      <w:rPr>
+        <w:rFonts w:ascii="Symbol" w:hAnsi="Symbol" w:hint="default"/>
+      </w:rPr>
+    </w:lvl>
+    <w:lvl w:ilvl="7" w:tplc="08160003" w:tentative="1">
+      <w:start w:val="1"/>
+      <w:numFmt w:val="bullet"/>
+      <w:lvlText w:val="o"/>
+      <w:lvlJc w:val="left"/>
+      <w:pPr>
+        <w:ind w:left="6469" w:hanging="360"/>
+      </w:pPr>
+      <w:rPr>
+        <w:rFonts w:ascii="Courier New" w:hAnsi="Courier New" w:cs="Courier New" w:hint="default"/>
+      </w:rPr>
+    </w:lvl>
+    <w:lvl w:ilvl="8" w:tplc="08160005" w:tentative="1">
+      <w:start w:val="1"/>
+      <w:numFmt w:val="bullet"/>
+      <w:lvlText w:val=""/>
+      <w:lvlJc w:val="left"/>
+      <w:pPr>
+        <w:ind w:left="7189" w:hanging="360"/>
+      </w:pPr>
+      <w:rPr>
+        <w:rFonts w:ascii="Wingdings" w:hAnsi="Wingdings" w:hint="default"/>
+      </w:rPr>
+    </w:lvl>
+  </w:abstractNum>
+  <w:abstractNum w:abstractNumId="17" w15:restartNumberingAfterBreak="0">
+    <w:nsid w:val="2B297302"/>
+    <w:multiLevelType w:val="hybridMultilevel"/>
+    <w:tmpl w:val="E0EC6C54"/>
+    <w:lvl w:ilvl="0" w:tplc="08160001">
+      <w:start w:val="1"/>
+      <w:numFmt w:val="bullet"/>
+      <w:lvlText w:val=""/>
+      <w:lvlJc w:val="left"/>
+      <w:pPr>
+        <w:ind w:left="1429" w:hanging="360"/>
+      </w:pPr>
+      <w:rPr>
+        <w:rFonts w:ascii="Symbol" w:hAnsi="Symbol" w:hint="default"/>
+      </w:rPr>
+    </w:lvl>
+    <w:lvl w:ilvl="1" w:tplc="08160003" w:tentative="1">
+      <w:start w:val="1"/>
+      <w:numFmt w:val="bullet"/>
+      <w:lvlText w:val="o"/>
+      <w:lvlJc w:val="left"/>
+      <w:pPr>
+        <w:ind w:left="2149" w:hanging="360"/>
+      </w:pPr>
+      <w:rPr>
+        <w:rFonts w:ascii="Courier New" w:hAnsi="Courier New" w:cs="Courier New" w:hint="default"/>
+      </w:rPr>
+    </w:lvl>
+    <w:lvl w:ilvl="2" w:tplc="08160005" w:tentative="1">
+      <w:start w:val="1"/>
+      <w:numFmt w:val="bullet"/>
+      <w:lvlText w:val=""/>
+      <w:lvlJc w:val="left"/>
+      <w:pPr>
+        <w:ind w:left="2869" w:hanging="360"/>
+      </w:pPr>
+      <w:rPr>
+        <w:rFonts w:ascii="Wingdings" w:hAnsi="Wingdings" w:hint="default"/>
+      </w:rPr>
+    </w:lvl>
+    <w:lvl w:ilvl="3" w:tplc="08160001" w:tentative="1">
+      <w:start w:val="1"/>
+      <w:numFmt w:val="bullet"/>
+      <w:lvlText w:val=""/>
+      <w:lvlJc w:val="left"/>
+      <w:pPr>
+        <w:ind w:left="3589" w:hanging="360"/>
+      </w:pPr>
+      <w:rPr>
+        <w:rFonts w:ascii="Symbol" w:hAnsi="Symbol" w:hint="default"/>
+      </w:rPr>
+    </w:lvl>
+    <w:lvl w:ilvl="4" w:tplc="08160003" w:tentative="1">
+      <w:start w:val="1"/>
+      <w:numFmt w:val="bullet"/>
+      <w:lvlText w:val="o"/>
+      <w:lvlJc w:val="left"/>
+      <w:pPr>
+        <w:ind w:left="4309" w:hanging="360"/>
+      </w:pPr>
+      <w:rPr>
+        <w:rFonts w:ascii="Courier New" w:hAnsi="Courier New" w:cs="Courier New" w:hint="default"/>
+      </w:rPr>
+    </w:lvl>
+    <w:lvl w:ilvl="5" w:tplc="08160005" w:tentative="1">
+      <w:start w:val="1"/>
+      <w:numFmt w:val="bullet"/>
+      <w:lvlText w:val=""/>
+      <w:lvlJc w:val="left"/>
+      <w:pPr>
+        <w:ind w:left="5029" w:hanging="360"/>
+      </w:pPr>
+      <w:rPr>
+        <w:rFonts w:ascii="Wingdings" w:hAnsi="Wingdings" w:hint="default"/>
+      </w:rPr>
+    </w:lvl>
+    <w:lvl w:ilvl="6" w:tplc="08160001" w:tentative="1">
+      <w:start w:val="1"/>
+      <w:numFmt w:val="bullet"/>
+      <w:lvlText w:val=""/>
+      <w:lvlJc w:val="left"/>
+      <w:pPr>
+        <w:ind w:left="5749" w:hanging="360"/>
+      </w:pPr>
+      <w:rPr>
+        <w:rFonts w:ascii="Symbol" w:hAnsi="Symbol" w:hint="default"/>
+      </w:rPr>
+    </w:lvl>
+    <w:lvl w:ilvl="7" w:tplc="08160003" w:tentative="1">
+      <w:start w:val="1"/>
+      <w:numFmt w:val="bullet"/>
+      <w:lvlText w:val="o"/>
+      <w:lvlJc w:val="left"/>
+      <w:pPr>
+        <w:ind w:left="6469" w:hanging="360"/>
+      </w:pPr>
+      <w:rPr>
+        <w:rFonts w:ascii="Courier New" w:hAnsi="Courier New" w:cs="Courier New" w:hint="default"/>
+      </w:rPr>
+    </w:lvl>
+    <w:lvl w:ilvl="8" w:tplc="08160005" w:tentative="1">
+      <w:start w:val="1"/>
+      <w:numFmt w:val="bullet"/>
+      <w:lvlText w:val=""/>
+      <w:lvlJc w:val="left"/>
+      <w:pPr>
+        <w:ind w:left="7189" w:hanging="360"/>
+      </w:pPr>
+      <w:rPr>
+        <w:rFonts w:ascii="Wingdings" w:hAnsi="Wingdings" w:hint="default"/>
+      </w:rPr>
+    </w:lvl>
+  </w:abstractNum>
+  <w:abstractNum w:abstractNumId="18" w15:restartNumberingAfterBreak="0">
+    <w:nsid w:val="2FA87073"/>
+    <w:multiLevelType w:val="hybridMultilevel"/>
+    <w:tmpl w:val="88025776"/>
+    <w:lvl w:ilvl="0" w:tplc="08160001">
+      <w:start w:val="1"/>
+      <w:numFmt w:val="bullet"/>
+      <w:lvlText w:val=""/>
+      <w:lvlJc w:val="left"/>
+      <w:pPr>
+        <w:ind w:left="1429" w:hanging="360"/>
+      </w:pPr>
+      <w:rPr>
+        <w:rFonts w:ascii="Symbol" w:hAnsi="Symbol" w:hint="default"/>
+      </w:rPr>
+    </w:lvl>
+    <w:lvl w:ilvl="1" w:tplc="08160003" w:tentative="1">
+      <w:start w:val="1"/>
+      <w:numFmt w:val="bullet"/>
+      <w:lvlText w:val="o"/>
+      <w:lvlJc w:val="left"/>
+      <w:pPr>
+        <w:ind w:left="2149" w:hanging="360"/>
+      </w:pPr>
+      <w:rPr>
+        <w:rFonts w:ascii="Courier New" w:hAnsi="Courier New" w:cs="Courier New" w:hint="default"/>
+      </w:rPr>
+    </w:lvl>
+    <w:lvl w:ilvl="2" w:tplc="08160005" w:tentative="1">
+      <w:start w:val="1"/>
+      <w:numFmt w:val="bullet"/>
+      <w:lvlText w:val=""/>
+      <w:lvlJc w:val="left"/>
+      <w:pPr>
+        <w:ind w:left="2869" w:hanging="360"/>
+      </w:pPr>
+      <w:rPr>
+        <w:rFonts w:ascii="Wingdings" w:hAnsi="Wingdings" w:hint="default"/>
+      </w:rPr>
+    </w:lvl>
+    <w:lvl w:ilvl="3" w:tplc="08160001" w:tentative="1">
+      <w:start w:val="1"/>
+      <w:numFmt w:val="bullet"/>
+      <w:lvlText w:val=""/>
+      <w:lvlJc w:val="left"/>
+      <w:pPr>
+        <w:ind w:left="3589" w:hanging="360"/>
+      </w:pPr>
+      <w:rPr>
+        <w:rFonts w:ascii="Symbol" w:hAnsi="Symbol" w:hint="default"/>
+      </w:rPr>
+    </w:lvl>
+    <w:lvl w:ilvl="4" w:tplc="08160003" w:tentative="1">
+      <w:start w:val="1"/>
+      <w:numFmt w:val="bullet"/>
+      <w:lvlText w:val="o"/>
+      <w:lvlJc w:val="left"/>
+      <w:pPr>
+        <w:ind w:left="4309" w:hanging="360"/>
+      </w:pPr>
+      <w:rPr>
+        <w:rFonts w:ascii="Courier New" w:hAnsi="Courier New" w:cs="Courier New" w:hint="default"/>
+      </w:rPr>
+    </w:lvl>
+    <w:lvl w:ilvl="5" w:tplc="08160005" w:tentative="1">
+      <w:start w:val="1"/>
+      <w:numFmt w:val="bullet"/>
+      <w:lvlText w:val=""/>
+      <w:lvlJc w:val="left"/>
+      <w:pPr>
+        <w:ind w:left="5029" w:hanging="360"/>
+      </w:pPr>
+      <w:rPr>
+        <w:rFonts w:ascii="Wingdings" w:hAnsi="Wingdings" w:hint="default"/>
+      </w:rPr>
+    </w:lvl>
+    <w:lvl w:ilvl="6" w:tplc="08160001" w:tentative="1">
+      <w:start w:val="1"/>
+      <w:numFmt w:val="bullet"/>
+      <w:lvlText w:val=""/>
+      <w:lvlJc w:val="left"/>
+      <w:pPr>
+        <w:ind w:left="5749" w:hanging="360"/>
+      </w:pPr>
+      <w:rPr>
+        <w:rFonts w:ascii="Symbol" w:hAnsi="Symbol" w:hint="default"/>
+      </w:rPr>
+    </w:lvl>
+    <w:lvl w:ilvl="7" w:tplc="08160003" w:tentative="1">
+      <w:start w:val="1"/>
+      <w:numFmt w:val="bullet"/>
+      <w:lvlText w:val="o"/>
+      <w:lvlJc w:val="left"/>
+      <w:pPr>
+        <w:ind w:left="6469" w:hanging="360"/>
+      </w:pPr>
+      <w:rPr>
+        <w:rFonts w:ascii="Courier New" w:hAnsi="Courier New" w:cs="Courier New" w:hint="default"/>
+      </w:rPr>
+    </w:lvl>
+    <w:lvl w:ilvl="8" w:tplc="08160005" w:tentative="1">
+      <w:start w:val="1"/>
+      <w:numFmt w:val="bullet"/>
+      <w:lvlText w:val=""/>
+      <w:lvlJc w:val="left"/>
+      <w:pPr>
+        <w:ind w:left="7189" w:hanging="360"/>
+      </w:pPr>
+      <w:rPr>
+        <w:rFonts w:ascii="Wingdings" w:hAnsi="Wingdings" w:hint="default"/>
+      </w:rPr>
+    </w:lvl>
+  </w:abstractNum>
+  <w:abstractNum w:abstractNumId="19" w15:restartNumberingAfterBreak="0">
+    <w:nsid w:val="3C000E1F"/>
+    <w:multiLevelType w:val="hybridMultilevel"/>
+    <w:tmpl w:val="C6BC9CC0"/>
+    <w:lvl w:ilvl="0" w:tplc="08160001">
+      <w:start w:val="1"/>
+      <w:numFmt w:val="bullet"/>
+      <w:lvlText w:val=""/>
+      <w:lvlJc w:val="left"/>
+      <w:pPr>
+        <w:ind w:left="1429" w:hanging="360"/>
+      </w:pPr>
+      <w:rPr>
+        <w:rFonts w:ascii="Symbol" w:hAnsi="Symbol" w:hint="default"/>
+      </w:rPr>
+    </w:lvl>
+    <w:lvl w:ilvl="1" w:tplc="08160003" w:tentative="1">
+      <w:start w:val="1"/>
+      <w:numFmt w:val="bullet"/>
+      <w:lvlText w:val="o"/>
+      <w:lvlJc w:val="left"/>
+      <w:pPr>
+        <w:ind w:left="2149" w:hanging="360"/>
+      </w:pPr>
+      <w:rPr>
+        <w:rFonts w:ascii="Courier New" w:hAnsi="Courier New" w:cs="Courier New" w:hint="default"/>
+      </w:rPr>
+    </w:lvl>
+    <w:lvl w:ilvl="2" w:tplc="08160005" w:tentative="1">
+      <w:start w:val="1"/>
+      <w:numFmt w:val="bullet"/>
+      <w:lvlText w:val=""/>
+      <w:lvlJc w:val="left"/>
+      <w:pPr>
+        <w:ind w:left="2869" w:hanging="360"/>
+      </w:pPr>
+      <w:rPr>
+        <w:rFonts w:ascii="Wingdings" w:hAnsi="Wingdings" w:hint="default"/>
+      </w:rPr>
+    </w:lvl>
+    <w:lvl w:ilvl="3" w:tplc="08160001" w:tentative="1">
+      <w:start w:val="1"/>
+      <w:numFmt w:val="bullet"/>
+      <w:lvlText w:val=""/>
+      <w:lvlJc w:val="left"/>
+      <w:pPr>
+        <w:ind w:left="3589" w:hanging="360"/>
+      </w:pPr>
+      <w:rPr>
+        <w:rFonts w:ascii="Symbol" w:hAnsi="Symbol" w:hint="default"/>
+      </w:rPr>
+    </w:lvl>
+    <w:lvl w:ilvl="4" w:tplc="08160003" w:tentative="1">
+      <w:start w:val="1"/>
+      <w:numFmt w:val="bullet"/>
+      <w:lvlText w:val="o"/>
+      <w:lvlJc w:val="left"/>
+      <w:pPr>
+        <w:ind w:left="4309" w:hanging="360"/>
+      </w:pPr>
+      <w:rPr>
+        <w:rFonts w:ascii="Courier New" w:hAnsi="Courier New" w:cs="Courier New" w:hint="default"/>
+      </w:rPr>
+    </w:lvl>
+    <w:lvl w:ilvl="5" w:tplc="08160005" w:tentative="1">
+      <w:start w:val="1"/>
+      <w:numFmt w:val="bullet"/>
+      <w:lvlText w:val=""/>
+      <w:lvlJc w:val="left"/>
+      <w:pPr>
+        <w:ind w:left="5029" w:hanging="360"/>
+      </w:pPr>
+      <w:rPr>
+        <w:rFonts w:ascii="Wingdings" w:hAnsi="Wingdings" w:hint="default"/>
+      </w:rPr>
+    </w:lvl>
+    <w:lvl w:ilvl="6" w:tplc="08160001" w:tentative="1">
+      <w:start w:val="1"/>
+      <w:numFmt w:val="bullet"/>
+      <w:lvlText w:val=""/>
+      <w:lvlJc w:val="left"/>
+      <w:pPr>
+        <w:ind w:left="5749" w:hanging="360"/>
+      </w:pPr>
+      <w:rPr>
+        <w:rFonts w:ascii="Symbol" w:hAnsi="Symbol" w:hint="default"/>
+      </w:rPr>
+    </w:lvl>
+    <w:lvl w:ilvl="7" w:tplc="08160003" w:tentative="1">
+      <w:start w:val="1"/>
+      <w:numFmt w:val="bullet"/>
+      <w:lvlText w:val="o"/>
+      <w:lvlJc w:val="left"/>
+      <w:pPr>
+        <w:ind w:left="6469" w:hanging="360"/>
+      </w:pPr>
+      <w:rPr>
+        <w:rFonts w:ascii="Courier New" w:hAnsi="Courier New" w:cs="Courier New" w:hint="default"/>
+      </w:rPr>
+    </w:lvl>
+    <w:lvl w:ilvl="8" w:tplc="08160005" w:tentative="1">
+      <w:start w:val="1"/>
+      <w:numFmt w:val="bullet"/>
+      <w:lvlText w:val=""/>
+      <w:lvlJc w:val="left"/>
+      <w:pPr>
+        <w:ind w:left="7189" w:hanging="360"/>
+      </w:pPr>
+      <w:rPr>
+        <w:rFonts w:ascii="Wingdings" w:hAnsi="Wingdings" w:hint="default"/>
+      </w:rPr>
+    </w:lvl>
+  </w:abstractNum>
+  <w:abstractNum w:abstractNumId="20" w15:restartNumberingAfterBreak="0">
     <w:nsid w:val="40524BAD"/>
     <w:multiLevelType w:val="hybridMultilevel"/>
     <w:tmpl w:val="D2582CD0"/>
@@ -8272,6 +11532,571 @@
       <w:pPr>
         <w:ind w:left="6829" w:hanging="180"/>
       </w:pPr>
+    </w:lvl>
+  </w:abstractNum>
+  <w:abstractNum w:abstractNumId="21" w15:restartNumberingAfterBreak="0">
+    <w:nsid w:val="48A073AD"/>
+    <w:multiLevelType w:val="hybridMultilevel"/>
+    <w:tmpl w:val="21B2143E"/>
+    <w:lvl w:ilvl="0" w:tplc="08160001">
+      <w:start w:val="1"/>
+      <w:numFmt w:val="bullet"/>
+      <w:lvlText w:val=""/>
+      <w:lvlJc w:val="left"/>
+      <w:pPr>
+        <w:ind w:left="1429" w:hanging="360"/>
+      </w:pPr>
+      <w:rPr>
+        <w:rFonts w:ascii="Symbol" w:hAnsi="Symbol" w:hint="default"/>
+      </w:rPr>
+    </w:lvl>
+    <w:lvl w:ilvl="1" w:tplc="08160003" w:tentative="1">
+      <w:start w:val="1"/>
+      <w:numFmt w:val="bullet"/>
+      <w:lvlText w:val="o"/>
+      <w:lvlJc w:val="left"/>
+      <w:pPr>
+        <w:ind w:left="2149" w:hanging="360"/>
+      </w:pPr>
+      <w:rPr>
+        <w:rFonts w:ascii="Courier New" w:hAnsi="Courier New" w:cs="Courier New" w:hint="default"/>
+      </w:rPr>
+    </w:lvl>
+    <w:lvl w:ilvl="2" w:tplc="08160005" w:tentative="1">
+      <w:start w:val="1"/>
+      <w:numFmt w:val="bullet"/>
+      <w:lvlText w:val=""/>
+      <w:lvlJc w:val="left"/>
+      <w:pPr>
+        <w:ind w:left="2869" w:hanging="360"/>
+      </w:pPr>
+      <w:rPr>
+        <w:rFonts w:ascii="Wingdings" w:hAnsi="Wingdings" w:hint="default"/>
+      </w:rPr>
+    </w:lvl>
+    <w:lvl w:ilvl="3" w:tplc="08160001" w:tentative="1">
+      <w:start w:val="1"/>
+      <w:numFmt w:val="bullet"/>
+      <w:lvlText w:val=""/>
+      <w:lvlJc w:val="left"/>
+      <w:pPr>
+        <w:ind w:left="3589" w:hanging="360"/>
+      </w:pPr>
+      <w:rPr>
+        <w:rFonts w:ascii="Symbol" w:hAnsi="Symbol" w:hint="default"/>
+      </w:rPr>
+    </w:lvl>
+    <w:lvl w:ilvl="4" w:tplc="08160003" w:tentative="1">
+      <w:start w:val="1"/>
+      <w:numFmt w:val="bullet"/>
+      <w:lvlText w:val="o"/>
+      <w:lvlJc w:val="left"/>
+      <w:pPr>
+        <w:ind w:left="4309" w:hanging="360"/>
+      </w:pPr>
+      <w:rPr>
+        <w:rFonts w:ascii="Courier New" w:hAnsi="Courier New" w:cs="Courier New" w:hint="default"/>
+      </w:rPr>
+    </w:lvl>
+    <w:lvl w:ilvl="5" w:tplc="08160005" w:tentative="1">
+      <w:start w:val="1"/>
+      <w:numFmt w:val="bullet"/>
+      <w:lvlText w:val=""/>
+      <w:lvlJc w:val="left"/>
+      <w:pPr>
+        <w:ind w:left="5029" w:hanging="360"/>
+      </w:pPr>
+      <w:rPr>
+        <w:rFonts w:ascii="Wingdings" w:hAnsi="Wingdings" w:hint="default"/>
+      </w:rPr>
+    </w:lvl>
+    <w:lvl w:ilvl="6" w:tplc="08160001" w:tentative="1">
+      <w:start w:val="1"/>
+      <w:numFmt w:val="bullet"/>
+      <w:lvlText w:val=""/>
+      <w:lvlJc w:val="left"/>
+      <w:pPr>
+        <w:ind w:left="5749" w:hanging="360"/>
+      </w:pPr>
+      <w:rPr>
+        <w:rFonts w:ascii="Symbol" w:hAnsi="Symbol" w:hint="default"/>
+      </w:rPr>
+    </w:lvl>
+    <w:lvl w:ilvl="7" w:tplc="08160003" w:tentative="1">
+      <w:start w:val="1"/>
+      <w:numFmt w:val="bullet"/>
+      <w:lvlText w:val="o"/>
+      <w:lvlJc w:val="left"/>
+      <w:pPr>
+        <w:ind w:left="6469" w:hanging="360"/>
+      </w:pPr>
+      <w:rPr>
+        <w:rFonts w:ascii="Courier New" w:hAnsi="Courier New" w:cs="Courier New" w:hint="default"/>
+      </w:rPr>
+    </w:lvl>
+    <w:lvl w:ilvl="8" w:tplc="08160005" w:tentative="1">
+      <w:start w:val="1"/>
+      <w:numFmt w:val="bullet"/>
+      <w:lvlText w:val=""/>
+      <w:lvlJc w:val="left"/>
+      <w:pPr>
+        <w:ind w:left="7189" w:hanging="360"/>
+      </w:pPr>
+      <w:rPr>
+        <w:rFonts w:ascii="Wingdings" w:hAnsi="Wingdings" w:hint="default"/>
+      </w:rPr>
+    </w:lvl>
+  </w:abstractNum>
+  <w:abstractNum w:abstractNumId="22" w15:restartNumberingAfterBreak="0">
+    <w:nsid w:val="4ADF222E"/>
+    <w:multiLevelType w:val="hybridMultilevel"/>
+    <w:tmpl w:val="FFAE58F6"/>
+    <w:lvl w:ilvl="0" w:tplc="08160001">
+      <w:start w:val="1"/>
+      <w:numFmt w:val="bullet"/>
+      <w:lvlText w:val=""/>
+      <w:lvlJc w:val="left"/>
+      <w:pPr>
+        <w:ind w:left="1429" w:hanging="360"/>
+      </w:pPr>
+      <w:rPr>
+        <w:rFonts w:ascii="Symbol" w:hAnsi="Symbol" w:hint="default"/>
+      </w:rPr>
+    </w:lvl>
+    <w:lvl w:ilvl="1" w:tplc="08160003" w:tentative="1">
+      <w:start w:val="1"/>
+      <w:numFmt w:val="bullet"/>
+      <w:lvlText w:val="o"/>
+      <w:lvlJc w:val="left"/>
+      <w:pPr>
+        <w:ind w:left="2149" w:hanging="360"/>
+      </w:pPr>
+      <w:rPr>
+        <w:rFonts w:ascii="Courier New" w:hAnsi="Courier New" w:cs="Courier New" w:hint="default"/>
+      </w:rPr>
+    </w:lvl>
+    <w:lvl w:ilvl="2" w:tplc="08160005" w:tentative="1">
+      <w:start w:val="1"/>
+      <w:numFmt w:val="bullet"/>
+      <w:lvlText w:val=""/>
+      <w:lvlJc w:val="left"/>
+      <w:pPr>
+        <w:ind w:left="2869" w:hanging="360"/>
+      </w:pPr>
+      <w:rPr>
+        <w:rFonts w:ascii="Wingdings" w:hAnsi="Wingdings" w:hint="default"/>
+      </w:rPr>
+    </w:lvl>
+    <w:lvl w:ilvl="3" w:tplc="08160001" w:tentative="1">
+      <w:start w:val="1"/>
+      <w:numFmt w:val="bullet"/>
+      <w:lvlText w:val=""/>
+      <w:lvlJc w:val="left"/>
+      <w:pPr>
+        <w:ind w:left="3589" w:hanging="360"/>
+      </w:pPr>
+      <w:rPr>
+        <w:rFonts w:ascii="Symbol" w:hAnsi="Symbol" w:hint="default"/>
+      </w:rPr>
+    </w:lvl>
+    <w:lvl w:ilvl="4" w:tplc="08160003" w:tentative="1">
+      <w:start w:val="1"/>
+      <w:numFmt w:val="bullet"/>
+      <w:lvlText w:val="o"/>
+      <w:lvlJc w:val="left"/>
+      <w:pPr>
+        <w:ind w:left="4309" w:hanging="360"/>
+      </w:pPr>
+      <w:rPr>
+        <w:rFonts w:ascii="Courier New" w:hAnsi="Courier New" w:cs="Courier New" w:hint="default"/>
+      </w:rPr>
+    </w:lvl>
+    <w:lvl w:ilvl="5" w:tplc="08160005" w:tentative="1">
+      <w:start w:val="1"/>
+      <w:numFmt w:val="bullet"/>
+      <w:lvlText w:val=""/>
+      <w:lvlJc w:val="left"/>
+      <w:pPr>
+        <w:ind w:left="5029" w:hanging="360"/>
+      </w:pPr>
+      <w:rPr>
+        <w:rFonts w:ascii="Wingdings" w:hAnsi="Wingdings" w:hint="default"/>
+      </w:rPr>
+    </w:lvl>
+    <w:lvl w:ilvl="6" w:tplc="08160001" w:tentative="1">
+      <w:start w:val="1"/>
+      <w:numFmt w:val="bullet"/>
+      <w:lvlText w:val=""/>
+      <w:lvlJc w:val="left"/>
+      <w:pPr>
+        <w:ind w:left="5749" w:hanging="360"/>
+      </w:pPr>
+      <w:rPr>
+        <w:rFonts w:ascii="Symbol" w:hAnsi="Symbol" w:hint="default"/>
+      </w:rPr>
+    </w:lvl>
+    <w:lvl w:ilvl="7" w:tplc="08160003" w:tentative="1">
+      <w:start w:val="1"/>
+      <w:numFmt w:val="bullet"/>
+      <w:lvlText w:val="o"/>
+      <w:lvlJc w:val="left"/>
+      <w:pPr>
+        <w:ind w:left="6469" w:hanging="360"/>
+      </w:pPr>
+      <w:rPr>
+        <w:rFonts w:ascii="Courier New" w:hAnsi="Courier New" w:cs="Courier New" w:hint="default"/>
+      </w:rPr>
+    </w:lvl>
+    <w:lvl w:ilvl="8" w:tplc="08160005" w:tentative="1">
+      <w:start w:val="1"/>
+      <w:numFmt w:val="bullet"/>
+      <w:lvlText w:val=""/>
+      <w:lvlJc w:val="left"/>
+      <w:pPr>
+        <w:ind w:left="7189" w:hanging="360"/>
+      </w:pPr>
+      <w:rPr>
+        <w:rFonts w:ascii="Wingdings" w:hAnsi="Wingdings" w:hint="default"/>
+      </w:rPr>
+    </w:lvl>
+  </w:abstractNum>
+  <w:abstractNum w:abstractNumId="23" w15:restartNumberingAfterBreak="0">
+    <w:nsid w:val="64E446CC"/>
+    <w:multiLevelType w:val="hybridMultilevel"/>
+    <w:tmpl w:val="6B864BFC"/>
+    <w:lvl w:ilvl="0" w:tplc="08160001">
+      <w:start w:val="1"/>
+      <w:numFmt w:val="bullet"/>
+      <w:lvlText w:val=""/>
+      <w:lvlJc w:val="left"/>
+      <w:pPr>
+        <w:ind w:left="1429" w:hanging="360"/>
+      </w:pPr>
+      <w:rPr>
+        <w:rFonts w:ascii="Symbol" w:hAnsi="Symbol" w:hint="default"/>
+      </w:rPr>
+    </w:lvl>
+    <w:lvl w:ilvl="1" w:tplc="08160003" w:tentative="1">
+      <w:start w:val="1"/>
+      <w:numFmt w:val="bullet"/>
+      <w:lvlText w:val="o"/>
+      <w:lvlJc w:val="left"/>
+      <w:pPr>
+        <w:ind w:left="2149" w:hanging="360"/>
+      </w:pPr>
+      <w:rPr>
+        <w:rFonts w:ascii="Courier New" w:hAnsi="Courier New" w:cs="Courier New" w:hint="default"/>
+      </w:rPr>
+    </w:lvl>
+    <w:lvl w:ilvl="2" w:tplc="08160005" w:tentative="1">
+      <w:start w:val="1"/>
+      <w:numFmt w:val="bullet"/>
+      <w:lvlText w:val=""/>
+      <w:lvlJc w:val="left"/>
+      <w:pPr>
+        <w:ind w:left="2869" w:hanging="360"/>
+      </w:pPr>
+      <w:rPr>
+        <w:rFonts w:ascii="Wingdings" w:hAnsi="Wingdings" w:hint="default"/>
+      </w:rPr>
+    </w:lvl>
+    <w:lvl w:ilvl="3" w:tplc="08160001" w:tentative="1">
+      <w:start w:val="1"/>
+      <w:numFmt w:val="bullet"/>
+      <w:lvlText w:val=""/>
+      <w:lvlJc w:val="left"/>
+      <w:pPr>
+        <w:ind w:left="3589" w:hanging="360"/>
+      </w:pPr>
+      <w:rPr>
+        <w:rFonts w:ascii="Symbol" w:hAnsi="Symbol" w:hint="default"/>
+      </w:rPr>
+    </w:lvl>
+    <w:lvl w:ilvl="4" w:tplc="08160003" w:tentative="1">
+      <w:start w:val="1"/>
+      <w:numFmt w:val="bullet"/>
+      <w:lvlText w:val="o"/>
+      <w:lvlJc w:val="left"/>
+      <w:pPr>
+        <w:ind w:left="4309" w:hanging="360"/>
+      </w:pPr>
+      <w:rPr>
+        <w:rFonts w:ascii="Courier New" w:hAnsi="Courier New" w:cs="Courier New" w:hint="default"/>
+      </w:rPr>
+    </w:lvl>
+    <w:lvl w:ilvl="5" w:tplc="08160005" w:tentative="1">
+      <w:start w:val="1"/>
+      <w:numFmt w:val="bullet"/>
+      <w:lvlText w:val=""/>
+      <w:lvlJc w:val="left"/>
+      <w:pPr>
+        <w:ind w:left="5029" w:hanging="360"/>
+      </w:pPr>
+      <w:rPr>
+        <w:rFonts w:ascii="Wingdings" w:hAnsi="Wingdings" w:hint="default"/>
+      </w:rPr>
+    </w:lvl>
+    <w:lvl w:ilvl="6" w:tplc="08160001" w:tentative="1">
+      <w:start w:val="1"/>
+      <w:numFmt w:val="bullet"/>
+      <w:lvlText w:val=""/>
+      <w:lvlJc w:val="left"/>
+      <w:pPr>
+        <w:ind w:left="5749" w:hanging="360"/>
+      </w:pPr>
+      <w:rPr>
+        <w:rFonts w:ascii="Symbol" w:hAnsi="Symbol" w:hint="default"/>
+      </w:rPr>
+    </w:lvl>
+    <w:lvl w:ilvl="7" w:tplc="08160003" w:tentative="1">
+      <w:start w:val="1"/>
+      <w:numFmt w:val="bullet"/>
+      <w:lvlText w:val="o"/>
+      <w:lvlJc w:val="left"/>
+      <w:pPr>
+        <w:ind w:left="6469" w:hanging="360"/>
+      </w:pPr>
+      <w:rPr>
+        <w:rFonts w:ascii="Courier New" w:hAnsi="Courier New" w:cs="Courier New" w:hint="default"/>
+      </w:rPr>
+    </w:lvl>
+    <w:lvl w:ilvl="8" w:tplc="08160005" w:tentative="1">
+      <w:start w:val="1"/>
+      <w:numFmt w:val="bullet"/>
+      <w:lvlText w:val=""/>
+      <w:lvlJc w:val="left"/>
+      <w:pPr>
+        <w:ind w:left="7189" w:hanging="360"/>
+      </w:pPr>
+      <w:rPr>
+        <w:rFonts w:ascii="Wingdings" w:hAnsi="Wingdings" w:hint="default"/>
+      </w:rPr>
+    </w:lvl>
+  </w:abstractNum>
+  <w:abstractNum w:abstractNumId="24" w15:restartNumberingAfterBreak="0">
+    <w:nsid w:val="67E76626"/>
+    <w:multiLevelType w:val="hybridMultilevel"/>
+    <w:tmpl w:val="2C96C970"/>
+    <w:lvl w:ilvl="0" w:tplc="08160001">
+      <w:start w:val="1"/>
+      <w:numFmt w:val="bullet"/>
+      <w:lvlText w:val=""/>
+      <w:lvlJc w:val="left"/>
+      <w:pPr>
+        <w:ind w:left="1429" w:hanging="360"/>
+      </w:pPr>
+      <w:rPr>
+        <w:rFonts w:ascii="Symbol" w:hAnsi="Symbol" w:hint="default"/>
+      </w:rPr>
+    </w:lvl>
+    <w:lvl w:ilvl="1" w:tplc="08160003" w:tentative="1">
+      <w:start w:val="1"/>
+      <w:numFmt w:val="bullet"/>
+      <w:lvlText w:val="o"/>
+      <w:lvlJc w:val="left"/>
+      <w:pPr>
+        <w:ind w:left="2149" w:hanging="360"/>
+      </w:pPr>
+      <w:rPr>
+        <w:rFonts w:ascii="Courier New" w:hAnsi="Courier New" w:cs="Courier New" w:hint="default"/>
+      </w:rPr>
+    </w:lvl>
+    <w:lvl w:ilvl="2" w:tplc="08160005" w:tentative="1">
+      <w:start w:val="1"/>
+      <w:numFmt w:val="bullet"/>
+      <w:lvlText w:val=""/>
+      <w:lvlJc w:val="left"/>
+      <w:pPr>
+        <w:ind w:left="2869" w:hanging="360"/>
+      </w:pPr>
+      <w:rPr>
+        <w:rFonts w:ascii="Wingdings" w:hAnsi="Wingdings" w:hint="default"/>
+      </w:rPr>
+    </w:lvl>
+    <w:lvl w:ilvl="3" w:tplc="08160001" w:tentative="1">
+      <w:start w:val="1"/>
+      <w:numFmt w:val="bullet"/>
+      <w:lvlText w:val=""/>
+      <w:lvlJc w:val="left"/>
+      <w:pPr>
+        <w:ind w:left="3589" w:hanging="360"/>
+      </w:pPr>
+      <w:rPr>
+        <w:rFonts w:ascii="Symbol" w:hAnsi="Symbol" w:hint="default"/>
+      </w:rPr>
+    </w:lvl>
+    <w:lvl w:ilvl="4" w:tplc="08160003" w:tentative="1">
+      <w:start w:val="1"/>
+      <w:numFmt w:val="bullet"/>
+      <w:lvlText w:val="o"/>
+      <w:lvlJc w:val="left"/>
+      <w:pPr>
+        <w:ind w:left="4309" w:hanging="360"/>
+      </w:pPr>
+      <w:rPr>
+        <w:rFonts w:ascii="Courier New" w:hAnsi="Courier New" w:cs="Courier New" w:hint="default"/>
+      </w:rPr>
+    </w:lvl>
+    <w:lvl w:ilvl="5" w:tplc="08160005" w:tentative="1">
+      <w:start w:val="1"/>
+      <w:numFmt w:val="bullet"/>
+      <w:lvlText w:val=""/>
+      <w:lvlJc w:val="left"/>
+      <w:pPr>
+        <w:ind w:left="5029" w:hanging="360"/>
+      </w:pPr>
+      <w:rPr>
+        <w:rFonts w:ascii="Wingdings" w:hAnsi="Wingdings" w:hint="default"/>
+      </w:rPr>
+    </w:lvl>
+    <w:lvl w:ilvl="6" w:tplc="08160001" w:tentative="1">
+      <w:start w:val="1"/>
+      <w:numFmt w:val="bullet"/>
+      <w:lvlText w:val=""/>
+      <w:lvlJc w:val="left"/>
+      <w:pPr>
+        <w:ind w:left="5749" w:hanging="360"/>
+      </w:pPr>
+      <w:rPr>
+        <w:rFonts w:ascii="Symbol" w:hAnsi="Symbol" w:hint="default"/>
+      </w:rPr>
+    </w:lvl>
+    <w:lvl w:ilvl="7" w:tplc="08160003" w:tentative="1">
+      <w:start w:val="1"/>
+      <w:numFmt w:val="bullet"/>
+      <w:lvlText w:val="o"/>
+      <w:lvlJc w:val="left"/>
+      <w:pPr>
+        <w:ind w:left="6469" w:hanging="360"/>
+      </w:pPr>
+      <w:rPr>
+        <w:rFonts w:ascii="Courier New" w:hAnsi="Courier New" w:cs="Courier New" w:hint="default"/>
+      </w:rPr>
+    </w:lvl>
+    <w:lvl w:ilvl="8" w:tplc="08160005" w:tentative="1">
+      <w:start w:val="1"/>
+      <w:numFmt w:val="bullet"/>
+      <w:lvlText w:val=""/>
+      <w:lvlJc w:val="left"/>
+      <w:pPr>
+        <w:ind w:left="7189" w:hanging="360"/>
+      </w:pPr>
+      <w:rPr>
+        <w:rFonts w:ascii="Wingdings" w:hAnsi="Wingdings" w:hint="default"/>
+      </w:rPr>
+    </w:lvl>
+  </w:abstractNum>
+  <w:abstractNum w:abstractNumId="25" w15:restartNumberingAfterBreak="0">
+    <w:nsid w:val="70344B19"/>
+    <w:multiLevelType w:val="hybridMultilevel"/>
+    <w:tmpl w:val="8AE61E4A"/>
+    <w:lvl w:ilvl="0" w:tplc="08160001">
+      <w:start w:val="1"/>
+      <w:numFmt w:val="bullet"/>
+      <w:lvlText w:val=""/>
+      <w:lvlJc w:val="left"/>
+      <w:pPr>
+        <w:ind w:left="1429" w:hanging="360"/>
+      </w:pPr>
+      <w:rPr>
+        <w:rFonts w:ascii="Symbol" w:hAnsi="Symbol" w:hint="default"/>
+      </w:rPr>
+    </w:lvl>
+    <w:lvl w:ilvl="1" w:tplc="08160003" w:tentative="1">
+      <w:start w:val="1"/>
+      <w:numFmt w:val="bullet"/>
+      <w:lvlText w:val="o"/>
+      <w:lvlJc w:val="left"/>
+      <w:pPr>
+        <w:ind w:left="2149" w:hanging="360"/>
+      </w:pPr>
+      <w:rPr>
+        <w:rFonts w:ascii="Courier New" w:hAnsi="Courier New" w:cs="Courier New" w:hint="default"/>
+      </w:rPr>
+    </w:lvl>
+    <w:lvl w:ilvl="2" w:tplc="08160005" w:tentative="1">
+      <w:start w:val="1"/>
+      <w:numFmt w:val="bullet"/>
+      <w:lvlText w:val=""/>
+      <w:lvlJc w:val="left"/>
+      <w:pPr>
+        <w:ind w:left="2869" w:hanging="360"/>
+      </w:pPr>
+      <w:rPr>
+        <w:rFonts w:ascii="Wingdings" w:hAnsi="Wingdings" w:hint="default"/>
+      </w:rPr>
+    </w:lvl>
+    <w:lvl w:ilvl="3" w:tplc="08160001" w:tentative="1">
+      <w:start w:val="1"/>
+      <w:numFmt w:val="bullet"/>
+      <w:lvlText w:val=""/>
+      <w:lvlJc w:val="left"/>
+      <w:pPr>
+        <w:ind w:left="3589" w:hanging="360"/>
+      </w:pPr>
+      <w:rPr>
+        <w:rFonts w:ascii="Symbol" w:hAnsi="Symbol" w:hint="default"/>
+      </w:rPr>
+    </w:lvl>
+    <w:lvl w:ilvl="4" w:tplc="08160003" w:tentative="1">
+      <w:start w:val="1"/>
+      <w:numFmt w:val="bullet"/>
+      <w:lvlText w:val="o"/>
+      <w:lvlJc w:val="left"/>
+      <w:pPr>
+        <w:ind w:left="4309" w:hanging="360"/>
+      </w:pPr>
+      <w:rPr>
+        <w:rFonts w:ascii="Courier New" w:hAnsi="Courier New" w:cs="Courier New" w:hint="default"/>
+      </w:rPr>
+    </w:lvl>
+    <w:lvl w:ilvl="5" w:tplc="08160005" w:tentative="1">
+      <w:start w:val="1"/>
+      <w:numFmt w:val="bullet"/>
+      <w:lvlText w:val=""/>
+      <w:lvlJc w:val="left"/>
+      <w:pPr>
+        <w:ind w:left="5029" w:hanging="360"/>
+      </w:pPr>
+      <w:rPr>
+        <w:rFonts w:ascii="Wingdings" w:hAnsi="Wingdings" w:hint="default"/>
+      </w:rPr>
+    </w:lvl>
+    <w:lvl w:ilvl="6" w:tplc="08160001" w:tentative="1">
+      <w:start w:val="1"/>
+      <w:numFmt w:val="bullet"/>
+      <w:lvlText w:val=""/>
+      <w:lvlJc w:val="left"/>
+      <w:pPr>
+        <w:ind w:left="5749" w:hanging="360"/>
+      </w:pPr>
+      <w:rPr>
+        <w:rFonts w:ascii="Symbol" w:hAnsi="Symbol" w:hint="default"/>
+      </w:rPr>
+    </w:lvl>
+    <w:lvl w:ilvl="7" w:tplc="08160003" w:tentative="1">
+      <w:start w:val="1"/>
+      <w:numFmt w:val="bullet"/>
+      <w:lvlText w:val="o"/>
+      <w:lvlJc w:val="left"/>
+      <w:pPr>
+        <w:ind w:left="6469" w:hanging="360"/>
+      </w:pPr>
+      <w:rPr>
+        <w:rFonts w:ascii="Courier New" w:hAnsi="Courier New" w:cs="Courier New" w:hint="default"/>
+      </w:rPr>
+    </w:lvl>
+    <w:lvl w:ilvl="8" w:tplc="08160005" w:tentative="1">
+      <w:start w:val="1"/>
+      <w:numFmt w:val="bullet"/>
+      <w:lvlText w:val=""/>
+      <w:lvlJc w:val="left"/>
+      <w:pPr>
+        <w:ind w:left="7189" w:hanging="360"/>
+      </w:pPr>
+      <w:rPr>
+        <w:rFonts w:ascii="Wingdings" w:hAnsi="Wingdings" w:hint="default"/>
+      </w:rPr>
     </w:lvl>
   </w:abstractNum>
   <w:num w:numId="1" w16cid:durableId="708839125">
@@ -8302,7 +12127,55 @@
     <w:abstractNumId w:val="0"/>
   </w:num>
   <w:num w:numId="10" w16cid:durableId="274293149">
+    <w:abstractNumId w:val="20"/>
+  </w:num>
+  <w:num w:numId="11" w16cid:durableId="1227834827">
+    <w:abstractNumId w:val="21"/>
+  </w:num>
+  <w:num w:numId="12" w16cid:durableId="547185612">
+    <w:abstractNumId w:val="24"/>
+  </w:num>
+  <w:num w:numId="13" w16cid:durableId="1743718560">
+    <w:abstractNumId w:val="10"/>
+  </w:num>
+  <w:num w:numId="14" w16cid:durableId="1082529874">
+    <w:abstractNumId w:val="19"/>
+  </w:num>
+  <w:num w:numId="15" w16cid:durableId="484516274">
+    <w:abstractNumId w:val="23"/>
+  </w:num>
+  <w:num w:numId="16" w16cid:durableId="1856339249">
+    <w:abstractNumId w:val="11"/>
+  </w:num>
+  <w:num w:numId="17" w16cid:durableId="1619487918">
+    <w:abstractNumId w:val="18"/>
+  </w:num>
+  <w:num w:numId="18" w16cid:durableId="114757494">
+    <w:abstractNumId w:val="22"/>
+  </w:num>
+  <w:num w:numId="19" w16cid:durableId="2037608939">
+    <w:abstractNumId w:val="15"/>
+  </w:num>
+  <w:num w:numId="20" w16cid:durableId="1608348706">
+    <w:abstractNumId w:val="13"/>
+  </w:num>
+  <w:num w:numId="21" w16cid:durableId="565141474">
+    <w:abstractNumId w:val="16"/>
+  </w:num>
+  <w:num w:numId="22" w16cid:durableId="1530022886">
     <w:abstractNumId w:val="9"/>
+  </w:num>
+  <w:num w:numId="23" w16cid:durableId="661006659">
+    <w:abstractNumId w:val="14"/>
+  </w:num>
+  <w:num w:numId="24" w16cid:durableId="761800098">
+    <w:abstractNumId w:val="25"/>
+  </w:num>
+  <w:num w:numId="25" w16cid:durableId="2105876329">
+    <w:abstractNumId w:val="17"/>
+  </w:num>
+  <w:num w:numId="26" w16cid:durableId="725760460">
+    <w:abstractNumId w:val="12"/>
   </w:num>
 </w:numbering>
 </file>

</xml_diff>

<commit_message>
docs: cria relatório issue 4.1
</commit_message>
<xml_diff>
--- a/docs/Relatório Técnico Completo.docx
+++ b/docs/Relatório Técnico Completo.docx
@@ -8264,13 +8264,7 @@
         <w:pStyle w:val="Identificao"/>
       </w:pPr>
       <w:r>
-        <w:t>Relatório Técnico – Semana 3 (1</w:t>
-      </w:r>
-      <w:r>
-        <w:t>4</w:t>
-      </w:r>
-      <w:r>
-        <w:t xml:space="preserve"> de novembro de 2025)</w:t>
+        <w:t>Relatório Técnico – Semana 3 (14 de novembro de 2025)</w:t>
       </w:r>
     </w:p>
     <w:p>
@@ -8420,21 +8414,7 @@
         <w:rPr>
           <w:lang w:val="pt-BR"/>
         </w:rPr>
-        <w:t xml:space="preserve">2. Prompt Utilizado na Execução da </w:t>
-      </w:r>
-      <w:proofErr w:type="spellStart"/>
-      <w:r>
-        <w:rPr>
-          <w:lang w:val="pt-BR"/>
-        </w:rPr>
-        <w:t>Issue</w:t>
-      </w:r>
-      <w:proofErr w:type="spellEnd"/>
-      <w:r>
-        <w:rPr>
-          <w:lang w:val="pt-BR"/>
-        </w:rPr>
-        <w:t xml:space="preserve"> 3.3</w:t>
+        <w:t>2. Prompt Utilizado na Execução da Issue 3.3</w:t>
       </w:r>
     </w:p>
     <w:p>
@@ -9722,14 +9702,14 @@
         <w:rPr>
           <w:lang w:val="pt-PT"/>
         </w:rPr>
-        <w:t>A I</w:t>
-      </w:r>
-      <w:proofErr w:type="spellStart"/>
-      <w:r>
-        <w:rPr>
-          <w:lang w:val="pt-PT"/>
-        </w:rPr>
-        <w:t>ssue</w:t>
+        <w:t xml:space="preserve">A </w:t>
+      </w:r>
+      <w:proofErr w:type="spellStart"/>
+      <w:r>
+        <w:rPr>
+          <w:lang w:val="pt-PT"/>
+        </w:rPr>
+        <w:t>Issue</w:t>
       </w:r>
       <w:proofErr w:type="spellEnd"/>
       <w:r>
@@ -10017,6 +9997,3124 @@
           <w:lang w:val="pt-PT"/>
         </w:rPr>
         <w:t>O resultado representa um avanço significativo na transformação das análises em insights visualmente acessíveis.</w:t>
+      </w:r>
+    </w:p>
+    <w:p>
+      <w:pPr>
+        <w:spacing w:after="200" w:line="276" w:lineRule="auto"/>
+        <w:ind w:firstLine="0"/>
+        <w:jc w:val="left"/>
+        <w:rPr>
+          <w:lang w:val="pt-PT"/>
+        </w:rPr>
+      </w:pPr>
+      <w:r>
+        <w:rPr>
+          <w:lang w:val="pt-PT"/>
+        </w:rPr>
+        <w:br w:type="page"/>
+      </w:r>
+    </w:p>
+    <w:p>
+      <w:pPr>
+        <w:pStyle w:val="Identificao"/>
+      </w:pPr>
+      <w:r>
+        <w:lastRenderedPageBreak/>
+        <w:t>FAC SENAC DF – Curso de Ciência de Dados</w:t>
+      </w:r>
+    </w:p>
+    <w:p>
+      <w:pPr>
+        <w:pStyle w:val="Identificao"/>
+      </w:pPr>
+      <w:r>
+        <w:t>Projeto Interdisciplinar: Análise de Dados com Python, IA e Engenharia de Prompt</w:t>
+      </w:r>
+    </w:p>
+    <w:p>
+      <w:pPr>
+        <w:pStyle w:val="Identificao"/>
+      </w:pPr>
+      <w:r>
+        <w:t xml:space="preserve">Relatório Técnico – Semana </w:t>
+      </w:r>
+      <w:r>
+        <w:t>4</w:t>
+      </w:r>
+      <w:r>
+        <w:t xml:space="preserve"> (1</w:t>
+      </w:r>
+      <w:r>
+        <w:t>9</w:t>
+      </w:r>
+      <w:r>
+        <w:t xml:space="preserve"> de novembro de 2025)</w:t>
+      </w:r>
+    </w:p>
+    <w:p>
+      <w:pPr>
+        <w:pStyle w:val="Identificao"/>
+      </w:pPr>
+      <w:r>
+        <w:t>Aluno: Anderson de Matos Guimarães</w:t>
+      </w:r>
+    </w:p>
+    <w:p>
+      <w:pPr>
+        <w:pStyle w:val="Identificao"/>
+      </w:pPr>
+      <w:r>
+        <w:t>Professor: Alexsander Barreto</w:t>
+      </w:r>
+    </w:p>
+    <w:p>
+      <w:pPr>
+        <w:pStyle w:val="Identificao"/>
+      </w:pPr>
+      <w:r>
+        <w:t>Instituição: Faculdade de Tecnologia e Inovação Senac DF</w:t>
+      </w:r>
+    </w:p>
+    <w:p>
+      <w:pPr>
+        <w:pStyle w:val="Identificao"/>
+      </w:pPr>
+      <w:r>
+        <w:t xml:space="preserve">Conta Google utilizada nesta semana: </w:t>
+      </w:r>
+      <w:hyperlink r:id="rId9" w:history="1">
+        <w:r>
+          <w:rPr>
+            <w:rStyle w:val="Hyperlink"/>
+          </w:rPr>
+          <w:t>anderson.m.guimaraes@icloud.com</w:t>
+        </w:r>
+      </w:hyperlink>
+    </w:p>
+    <w:p>
+      <w:pPr>
+        <w:pStyle w:val="Ttulo1"/>
+        <w:rPr>
+          <w:lang w:val="pt-PT"/>
+        </w:rPr>
+      </w:pPr>
+      <w:r>
+        <w:rPr>
+          <w:lang w:val="pt-PT"/>
+        </w:rPr>
+        <w:t>1. Objetivo da Atividade</w:t>
+      </w:r>
+    </w:p>
+    <w:p>
+      <w:pPr>
+        <w:rPr>
+          <w:lang w:val="pt-PT"/>
+        </w:rPr>
+      </w:pPr>
+      <w:r>
+        <w:rPr>
+          <w:lang w:val="pt-PT"/>
+        </w:rPr>
+        <w:t xml:space="preserve">A </w:t>
+      </w:r>
+      <w:proofErr w:type="spellStart"/>
+      <w:r>
+        <w:rPr>
+          <w:lang w:val="pt-PT"/>
+        </w:rPr>
+        <w:t>Issue</w:t>
+      </w:r>
+      <w:proofErr w:type="spellEnd"/>
+      <w:r>
+        <w:rPr>
+          <w:lang w:val="pt-PT"/>
+        </w:rPr>
+        <w:t xml:space="preserve"> 4.1 teve como objetivo integrar Inteligência Artificial ao projeto </w:t>
+      </w:r>
+      <w:proofErr w:type="spellStart"/>
+      <w:r>
+        <w:rPr>
+          <w:lang w:val="pt-PT"/>
+        </w:rPr>
+        <w:t>Spotify</w:t>
+      </w:r>
+      <w:proofErr w:type="spellEnd"/>
+      <w:r>
+        <w:rPr>
+          <w:lang w:val="pt-PT"/>
+        </w:rPr>
+        <w:t xml:space="preserve"> Data </w:t>
+      </w:r>
+      <w:proofErr w:type="spellStart"/>
+      <w:r>
+        <w:rPr>
+          <w:lang w:val="pt-PT"/>
+        </w:rPr>
+        <w:t>Storytelling</w:t>
+      </w:r>
+      <w:proofErr w:type="spellEnd"/>
+      <w:r>
+        <w:rPr>
+          <w:lang w:val="pt-PT"/>
+        </w:rPr>
+        <w:t xml:space="preserve">, ampliando a análise descritiva por meio de insights automáticos gerados a partir do </w:t>
+      </w:r>
+      <w:proofErr w:type="spellStart"/>
+      <w:r>
+        <w:rPr>
+          <w:lang w:val="pt-PT"/>
+        </w:rPr>
+        <w:t>dataset</w:t>
+      </w:r>
+      <w:proofErr w:type="spellEnd"/>
+      <w:r>
+        <w:rPr>
+          <w:lang w:val="pt-PT"/>
+        </w:rPr>
+        <w:t xml:space="preserve"> tratado, das visualizações da Semana 3.1, da análise interpretativa da Semana 3.2 e do protótipo inicial de </w:t>
+      </w:r>
+      <w:proofErr w:type="spellStart"/>
+      <w:r>
+        <w:rPr>
+          <w:lang w:val="pt-PT"/>
+        </w:rPr>
+        <w:t>dashboard</w:t>
+      </w:r>
+      <w:proofErr w:type="spellEnd"/>
+      <w:r>
+        <w:rPr>
+          <w:lang w:val="pt-PT"/>
+        </w:rPr>
+        <w:t xml:space="preserve"> da Semana 3.3.</w:t>
+      </w:r>
+    </w:p>
+    <w:p>
+      <w:pPr>
+        <w:rPr>
+          <w:lang w:val="pt-PT"/>
+        </w:rPr>
+      </w:pPr>
+      <w:r>
+        <w:rPr>
+          <w:lang w:val="pt-PT"/>
+        </w:rPr>
+        <w:t xml:space="preserve">A meta principal foi estruturar um módulo de insights inteligentes totalmente compatível com o </w:t>
+      </w:r>
+      <w:proofErr w:type="spellStart"/>
+      <w:r>
+        <w:rPr>
+          <w:lang w:val="pt-PT"/>
+        </w:rPr>
+        <w:t>storytelling</w:t>
+      </w:r>
+      <w:proofErr w:type="spellEnd"/>
+      <w:r>
+        <w:rPr>
+          <w:lang w:val="pt-PT"/>
+        </w:rPr>
+        <w:t xml:space="preserve"> visual do </w:t>
+      </w:r>
+      <w:proofErr w:type="spellStart"/>
+      <w:r>
+        <w:rPr>
+          <w:lang w:val="pt-PT"/>
+        </w:rPr>
+        <w:t>dashboard</w:t>
+      </w:r>
+      <w:proofErr w:type="spellEnd"/>
+      <w:r>
+        <w:rPr>
+          <w:lang w:val="pt-PT"/>
+        </w:rPr>
+        <w:t xml:space="preserve"> final.</w:t>
+      </w:r>
+    </w:p>
+    <w:p>
+      <w:pPr>
+        <w:pStyle w:val="Ttulo1"/>
+        <w:rPr>
+          <w:lang w:val="pt-PT"/>
+        </w:rPr>
+      </w:pPr>
+      <w:r>
+        <w:rPr>
+          <w:lang w:val="pt-PT"/>
+        </w:rPr>
+        <w:t xml:space="preserve">2. Metodologia de Engenharia de </w:t>
+      </w:r>
+      <w:proofErr w:type="spellStart"/>
+      <w:r>
+        <w:rPr>
+          <w:lang w:val="pt-PT"/>
+        </w:rPr>
+        <w:t>Prompt</w:t>
+      </w:r>
+      <w:proofErr w:type="spellEnd"/>
+      <w:r>
+        <w:rPr>
+          <w:lang w:val="pt-PT"/>
+        </w:rPr>
+        <w:t xml:space="preserve"> Aplicada</w:t>
+      </w:r>
+    </w:p>
+    <w:p>
+      <w:pPr>
+        <w:rPr>
+          <w:lang w:val="pt-PT"/>
+        </w:rPr>
+      </w:pPr>
+      <w:r>
+        <w:rPr>
+          <w:lang w:val="pt-PT"/>
+        </w:rPr>
+        <w:t xml:space="preserve">Foi desenvolvido um </w:t>
+      </w:r>
+      <w:proofErr w:type="spellStart"/>
+      <w:r>
+        <w:rPr>
+          <w:lang w:val="pt-PT"/>
+        </w:rPr>
+        <w:t>prompt</w:t>
+      </w:r>
+      <w:proofErr w:type="spellEnd"/>
+      <w:r>
+        <w:rPr>
+          <w:lang w:val="pt-PT"/>
+        </w:rPr>
+        <w:t xml:space="preserve"> mestre que forneceu à IA:</w:t>
+      </w:r>
+    </w:p>
+    <w:p>
+      <w:pPr>
+        <w:pStyle w:val="PargrafodaLista"/>
+        <w:numPr>
+          <w:ilvl w:val="0"/>
+          <w:numId w:val="27"/>
+        </w:numPr>
+        <w:rPr>
+          <w:lang w:val="pt-PT"/>
+        </w:rPr>
+      </w:pPr>
+      <w:r>
+        <w:rPr>
+          <w:lang w:val="pt-PT"/>
+        </w:rPr>
+        <w:t xml:space="preserve">a estrutura completa do </w:t>
+      </w:r>
+      <w:proofErr w:type="spellStart"/>
+      <w:r>
+        <w:rPr>
+          <w:lang w:val="pt-PT"/>
+        </w:rPr>
+        <w:t>dataset</w:t>
+      </w:r>
+      <w:proofErr w:type="spellEnd"/>
+      <w:r>
+        <w:rPr>
+          <w:lang w:val="pt-PT"/>
+        </w:rPr>
+        <w:t xml:space="preserve"> (popularidade, duração, ano, gênero e artista);</w:t>
+      </w:r>
+    </w:p>
+    <w:p>
+      <w:pPr>
+        <w:pStyle w:val="PargrafodaLista"/>
+        <w:numPr>
+          <w:ilvl w:val="0"/>
+          <w:numId w:val="27"/>
+        </w:numPr>
+        <w:rPr>
+          <w:lang w:val="pt-PT"/>
+        </w:rPr>
+      </w:pPr>
+      <w:r>
+        <w:rPr>
+          <w:lang w:val="pt-PT"/>
+        </w:rPr>
+        <w:t>os resultados estatísticos e visuais da EDA;</w:t>
+      </w:r>
+    </w:p>
+    <w:p>
+      <w:pPr>
+        <w:pStyle w:val="PargrafodaLista"/>
+        <w:numPr>
+          <w:ilvl w:val="0"/>
+          <w:numId w:val="27"/>
+        </w:numPr>
+        <w:rPr>
+          <w:lang w:val="pt-PT"/>
+        </w:rPr>
+      </w:pPr>
+      <w:r>
+        <w:rPr>
+          <w:lang w:val="pt-PT"/>
+        </w:rPr>
+        <w:t>os padrões narrativos e mercadológicos identificados;</w:t>
+      </w:r>
+    </w:p>
+    <w:p>
+      <w:pPr>
+        <w:pStyle w:val="PargrafodaLista"/>
+        <w:numPr>
+          <w:ilvl w:val="0"/>
+          <w:numId w:val="27"/>
+        </w:numPr>
+        <w:rPr>
+          <w:lang w:val="pt-PT"/>
+        </w:rPr>
+      </w:pPr>
+      <w:r>
+        <w:rPr>
+          <w:lang w:val="pt-PT"/>
+        </w:rPr>
+        <w:t>necessidade de geração de textos explicativos, insights e descrições dinâmicas;</w:t>
+      </w:r>
+    </w:p>
+    <w:p>
+      <w:pPr>
+        <w:pStyle w:val="PargrafodaLista"/>
+        <w:numPr>
+          <w:ilvl w:val="0"/>
+          <w:numId w:val="27"/>
+        </w:numPr>
+        <w:rPr>
+          <w:lang w:val="pt-PT"/>
+        </w:rPr>
+      </w:pPr>
+      <w:r>
+        <w:rPr>
+          <w:lang w:val="pt-PT"/>
+        </w:rPr>
+        <w:t xml:space="preserve">requisitos técnicos para modelagem JSON e integração futura com o </w:t>
+      </w:r>
+      <w:proofErr w:type="spellStart"/>
+      <w:r>
+        <w:rPr>
+          <w:lang w:val="pt-PT"/>
+        </w:rPr>
+        <w:t>dashboard</w:t>
+      </w:r>
+      <w:proofErr w:type="spellEnd"/>
+      <w:r>
+        <w:rPr>
+          <w:lang w:val="pt-PT"/>
+        </w:rPr>
+        <w:t>.</w:t>
+      </w:r>
+    </w:p>
+    <w:p>
+      <w:pPr>
+        <w:rPr>
+          <w:lang w:val="pt-PT"/>
+        </w:rPr>
+      </w:pPr>
+      <w:r>
+        <w:rPr>
+          <w:lang w:val="pt-PT"/>
+        </w:rPr>
+        <w:t>A IA foi instruída a produzir conteúdos analíticos, narrativos e técnicos, sempre estruturados, coesos e direcionados ao uso prático na interface.</w:t>
+      </w:r>
+    </w:p>
+    <w:p>
+      <w:pPr>
+        <w:rPr>
+          <w:lang w:val="pt-PT"/>
+        </w:rPr>
+      </w:pPr>
+      <w:r>
+        <w:rPr>
+          <w:lang w:val="pt-PT"/>
+        </w:rPr>
+        <w:t xml:space="preserve">A seguir, registra-se o </w:t>
+      </w:r>
+      <w:proofErr w:type="spellStart"/>
+      <w:r>
+        <w:rPr>
+          <w:lang w:val="pt-PT"/>
+        </w:rPr>
+        <w:t>prompt</w:t>
+      </w:r>
+      <w:proofErr w:type="spellEnd"/>
+      <w:r>
+        <w:rPr>
+          <w:lang w:val="pt-PT"/>
+        </w:rPr>
+        <w:t xml:space="preserve"> utilizado para orientar a IA na geração dos insights automáticos, textos narrativos e modelagem conceitual de integração com o </w:t>
+      </w:r>
+      <w:proofErr w:type="spellStart"/>
+      <w:r>
+        <w:rPr>
+          <w:lang w:val="pt-PT"/>
+        </w:rPr>
+        <w:t>dashboard</w:t>
+      </w:r>
+      <w:proofErr w:type="spellEnd"/>
+      <w:r>
+        <w:rPr>
+          <w:lang w:val="pt-PT"/>
+        </w:rPr>
+        <w:t>:</w:t>
+      </w:r>
+    </w:p>
+    <w:p>
+      <w:pPr>
+        <w:rPr>
+          <w:lang w:val="pt-PT"/>
+        </w:rPr>
+      </w:pPr>
+      <w:r>
+        <w:rPr>
+          <w:lang w:val="pt-PT"/>
+        </w:rPr>
+        <w:lastRenderedPageBreak/>
+        <w:t>A</w:t>
+      </w:r>
+      <w:r>
+        <w:rPr>
+          <w:lang w:val="pt-PT"/>
+        </w:rPr>
+        <w:t xml:space="preserve">tue como um Cientista de Dados Sênior, especialista em engenharia de </w:t>
+      </w:r>
+      <w:proofErr w:type="spellStart"/>
+      <w:r>
+        <w:rPr>
+          <w:lang w:val="pt-PT"/>
+        </w:rPr>
+        <w:t>prompt</w:t>
+      </w:r>
+      <w:proofErr w:type="spellEnd"/>
+      <w:r>
+        <w:rPr>
+          <w:lang w:val="pt-PT"/>
+        </w:rPr>
+        <w:t xml:space="preserve">, </w:t>
+      </w:r>
+      <w:proofErr w:type="spellStart"/>
+      <w:r>
+        <w:rPr>
+          <w:lang w:val="pt-PT"/>
+        </w:rPr>
+        <w:t>storytelling</w:t>
+      </w:r>
+      <w:proofErr w:type="spellEnd"/>
+      <w:r>
+        <w:rPr>
+          <w:lang w:val="pt-PT"/>
+        </w:rPr>
+        <w:t xml:space="preserve"> com dados, análise textual automática, IA generativa aplicada e mercado musical.</w:t>
+      </w:r>
+    </w:p>
+    <w:p>
+      <w:pPr>
+        <w:rPr>
+          <w:lang w:val="pt-PT"/>
+        </w:rPr>
+      </w:pPr>
+      <w:r>
+        <w:rPr>
+          <w:lang w:val="pt-PT"/>
+        </w:rPr>
+        <w:t>Você receberá:</w:t>
+      </w:r>
+    </w:p>
+    <w:p>
+      <w:pPr>
+        <w:rPr>
+          <w:lang w:val="pt-PT"/>
+        </w:rPr>
+      </w:pPr>
+      <w:r>
+        <w:rPr>
+          <w:lang w:val="pt-PT"/>
+        </w:rPr>
+        <w:t>O d</w:t>
+      </w:r>
+      <w:proofErr w:type="spellStart"/>
+      <w:r>
+        <w:rPr>
+          <w:lang w:val="pt-PT"/>
+        </w:rPr>
+        <w:t>ataset</w:t>
+      </w:r>
+      <w:proofErr w:type="spellEnd"/>
+      <w:r>
+        <w:rPr>
+          <w:lang w:val="pt-PT"/>
+        </w:rPr>
+        <w:t xml:space="preserve"> tratado do projeto </w:t>
+      </w:r>
+      <w:proofErr w:type="spellStart"/>
+      <w:r>
+        <w:rPr>
+          <w:lang w:val="pt-PT"/>
+        </w:rPr>
+        <w:t>Spotify</w:t>
+      </w:r>
+      <w:proofErr w:type="spellEnd"/>
+      <w:r>
+        <w:rPr>
+          <w:lang w:val="pt-PT"/>
+        </w:rPr>
+        <w:t xml:space="preserve"> Data </w:t>
+      </w:r>
+      <w:proofErr w:type="spellStart"/>
+      <w:r>
+        <w:rPr>
+          <w:lang w:val="pt-PT"/>
+        </w:rPr>
+        <w:t>Storytelling</w:t>
+      </w:r>
+      <w:proofErr w:type="spellEnd"/>
+      <w:r>
+        <w:rPr>
+          <w:lang w:val="pt-PT"/>
+        </w:rPr>
+        <w:t xml:space="preserve"> (popularidade, duração, ano, gênero, artista etc.)</w:t>
+      </w:r>
+    </w:p>
+    <w:p>
+      <w:pPr>
+        <w:rPr>
+          <w:lang w:val="pt-PT"/>
+        </w:rPr>
+      </w:pPr>
+      <w:r>
+        <w:rPr>
+          <w:lang w:val="pt-PT"/>
+        </w:rPr>
+        <w:t>Os resultados completos da análise EDA (Semana 3.1)</w:t>
+      </w:r>
+    </w:p>
+    <w:p>
+      <w:pPr>
+        <w:rPr>
+          <w:lang w:val="pt-PT"/>
+        </w:rPr>
+      </w:pPr>
+      <w:r>
+        <w:rPr>
+          <w:lang w:val="pt-PT"/>
+        </w:rPr>
+        <w:t>A análise interpretativa e narrativa (Semana 3.2)</w:t>
+      </w:r>
+    </w:p>
+    <w:p>
+      <w:pPr>
+        <w:rPr>
+          <w:lang w:val="pt-PT"/>
+        </w:rPr>
+      </w:pPr>
+      <w:r>
+        <w:rPr>
+          <w:lang w:val="pt-PT"/>
+        </w:rPr>
+        <w:t xml:space="preserve">O protótipo do </w:t>
+      </w:r>
+      <w:proofErr w:type="spellStart"/>
+      <w:r>
+        <w:rPr>
+          <w:lang w:val="pt-PT"/>
+        </w:rPr>
+        <w:t>dashboard</w:t>
+      </w:r>
+      <w:proofErr w:type="spellEnd"/>
+      <w:r>
+        <w:rPr>
+          <w:lang w:val="pt-PT"/>
+        </w:rPr>
+        <w:t xml:space="preserve"> </w:t>
+      </w:r>
+      <w:proofErr w:type="spellStart"/>
+      <w:r>
+        <w:rPr>
+          <w:lang w:val="pt-PT"/>
+        </w:rPr>
+        <w:t>Streamlit</w:t>
+      </w:r>
+      <w:proofErr w:type="spellEnd"/>
+      <w:r>
+        <w:rPr>
+          <w:lang w:val="pt-PT"/>
+        </w:rPr>
+        <w:t xml:space="preserve"> (Semana 3.3)</w:t>
+      </w:r>
+    </w:p>
+    <w:p>
+      <w:pPr>
+        <w:rPr>
+          <w:lang w:val="pt-PT"/>
+        </w:rPr>
+      </w:pPr>
+      <w:r>
+        <w:rPr>
+          <w:lang w:val="pt-PT"/>
+        </w:rPr>
+        <w:t>Os gráficos e padrões encontrados até agora</w:t>
+      </w:r>
+    </w:p>
+    <w:p>
+      <w:pPr>
+        <w:rPr>
+          <w:lang w:val="pt-PT"/>
+        </w:rPr>
+      </w:pPr>
+      <w:r>
+        <w:rPr>
+          <w:lang w:val="pt-PT"/>
+        </w:rPr>
+        <w:t xml:space="preserve">Seu objetivo é cumprir integralmente a </w:t>
+      </w:r>
+      <w:proofErr w:type="spellStart"/>
+      <w:r>
+        <w:rPr>
+          <w:lang w:val="pt-PT"/>
+        </w:rPr>
+        <w:t>Issue</w:t>
+      </w:r>
+      <w:proofErr w:type="spellEnd"/>
+      <w:r>
+        <w:rPr>
+          <w:lang w:val="pt-PT"/>
+        </w:rPr>
+        <w:t xml:space="preserve"> 4.1 – Integração de insights automáticos com IA, seguindo rigorosamente as etapas abaixo.</w:t>
+      </w:r>
+    </w:p>
+    <w:p>
+      <w:pPr>
+        <w:rPr>
+          <w:b/>
+          <w:bCs/>
+          <w:i/>
+          <w:iCs/>
+          <w:lang w:val="pt-PT"/>
+        </w:rPr>
+      </w:pPr>
+      <w:r>
+        <w:rPr>
+          <w:b/>
+          <w:bCs/>
+          <w:i/>
+          <w:iCs/>
+          <w:lang w:val="pt-PT"/>
+        </w:rPr>
+        <w:t>1. Gerar insights automáticos (via IA) com alta precisão</w:t>
+      </w:r>
+    </w:p>
+    <w:p>
+      <w:pPr>
+        <w:rPr>
+          <w:lang w:val="pt-PT"/>
+        </w:rPr>
+      </w:pPr>
+    </w:p>
+    <w:p>
+      <w:pPr>
+        <w:rPr>
+          <w:lang w:val="pt-PT"/>
+        </w:rPr>
+      </w:pPr>
+      <w:r>
+        <w:rPr>
+          <w:lang w:val="pt-PT"/>
+        </w:rPr>
+        <w:t xml:space="preserve">Com base no </w:t>
+      </w:r>
+      <w:proofErr w:type="spellStart"/>
+      <w:r>
+        <w:rPr>
+          <w:lang w:val="pt-PT"/>
+        </w:rPr>
+        <w:t>dataset</w:t>
+      </w:r>
+      <w:proofErr w:type="spellEnd"/>
+      <w:r>
+        <w:rPr>
+          <w:lang w:val="pt-PT"/>
+        </w:rPr>
+        <w:t xml:space="preserve"> e nas análises anteriores, gere:</w:t>
+      </w:r>
+    </w:p>
+    <w:p>
+      <w:pPr>
+        <w:rPr>
+          <w:lang w:val="pt-PT"/>
+        </w:rPr>
+      </w:pPr>
+      <w:r>
+        <w:rPr>
+          <w:lang w:val="pt-PT"/>
+        </w:rPr>
+        <w:t>insights estatísticos descritivos,</w:t>
+      </w:r>
+    </w:p>
+    <w:p>
+      <w:pPr>
+        <w:pStyle w:val="PargrafodaLista"/>
+        <w:numPr>
+          <w:ilvl w:val="0"/>
+          <w:numId w:val="28"/>
+        </w:numPr>
+        <w:rPr>
+          <w:lang w:val="pt-PT"/>
+        </w:rPr>
+      </w:pPr>
+      <w:r>
+        <w:rPr>
+          <w:lang w:val="pt-PT"/>
+        </w:rPr>
+        <w:t>insights narrativos,</w:t>
+      </w:r>
+    </w:p>
+    <w:p>
+      <w:pPr>
+        <w:pStyle w:val="PargrafodaLista"/>
+        <w:numPr>
+          <w:ilvl w:val="0"/>
+          <w:numId w:val="28"/>
+        </w:numPr>
+        <w:rPr>
+          <w:lang w:val="pt-PT"/>
+        </w:rPr>
+      </w:pPr>
+      <w:r>
+        <w:rPr>
+          <w:lang w:val="pt-PT"/>
+        </w:rPr>
+        <w:t>insights mercadológicos,</w:t>
+      </w:r>
+    </w:p>
+    <w:p>
+      <w:pPr>
+        <w:pStyle w:val="PargrafodaLista"/>
+        <w:numPr>
+          <w:ilvl w:val="0"/>
+          <w:numId w:val="28"/>
+        </w:numPr>
+        <w:rPr>
+          <w:lang w:val="pt-PT"/>
+        </w:rPr>
+      </w:pPr>
+      <w:r>
+        <w:rPr>
+          <w:lang w:val="pt-PT"/>
+        </w:rPr>
+        <w:t>insights culturais,</w:t>
+      </w:r>
+    </w:p>
+    <w:p>
+      <w:pPr>
+        <w:pStyle w:val="PargrafodaLista"/>
+        <w:numPr>
+          <w:ilvl w:val="0"/>
+          <w:numId w:val="28"/>
+        </w:numPr>
+        <w:rPr>
+          <w:lang w:val="pt-PT"/>
+        </w:rPr>
+      </w:pPr>
+      <w:r>
+        <w:rPr>
+          <w:lang w:val="pt-PT"/>
+        </w:rPr>
+        <w:t>insights orientados por comportamento de consumo,</w:t>
+      </w:r>
+    </w:p>
+    <w:p>
+      <w:pPr>
+        <w:pStyle w:val="PargrafodaLista"/>
+        <w:numPr>
+          <w:ilvl w:val="0"/>
+          <w:numId w:val="28"/>
+        </w:numPr>
+        <w:rPr>
+          <w:lang w:val="pt-PT"/>
+        </w:rPr>
+      </w:pPr>
+      <w:r>
+        <w:rPr>
+          <w:lang w:val="pt-PT"/>
+        </w:rPr>
+        <w:t>insights baseados em correlações e padrões de EDA,</w:t>
+      </w:r>
+    </w:p>
+    <w:p>
+      <w:pPr>
+        <w:pStyle w:val="PargrafodaLista"/>
+        <w:numPr>
+          <w:ilvl w:val="0"/>
+          <w:numId w:val="28"/>
+        </w:numPr>
+        <w:rPr>
+          <w:lang w:val="pt-PT"/>
+        </w:rPr>
+      </w:pPr>
+      <w:r>
+        <w:rPr>
+          <w:lang w:val="pt-PT"/>
+        </w:rPr>
+        <w:t xml:space="preserve">insights voltados para o design de </w:t>
+      </w:r>
+      <w:proofErr w:type="spellStart"/>
+      <w:r>
+        <w:rPr>
+          <w:lang w:val="pt-PT"/>
+        </w:rPr>
+        <w:t>dashboards</w:t>
+      </w:r>
+      <w:proofErr w:type="spellEnd"/>
+      <w:r>
+        <w:rPr>
+          <w:lang w:val="pt-PT"/>
+        </w:rPr>
+        <w:t xml:space="preserve"> e </w:t>
+      </w:r>
+      <w:proofErr w:type="spellStart"/>
+      <w:r>
+        <w:rPr>
+          <w:lang w:val="pt-PT"/>
+        </w:rPr>
+        <w:t>storytelling</w:t>
+      </w:r>
+      <w:proofErr w:type="spellEnd"/>
+      <w:r>
+        <w:rPr>
+          <w:lang w:val="pt-PT"/>
+        </w:rPr>
+        <w:t>.</w:t>
+      </w:r>
+    </w:p>
+    <w:p>
+      <w:pPr>
+        <w:rPr>
+          <w:lang w:val="pt-PT"/>
+        </w:rPr>
+      </w:pPr>
+      <w:r>
+        <w:rPr>
+          <w:lang w:val="pt-PT"/>
+        </w:rPr>
+        <w:t>Cada insight deve conter:</w:t>
+      </w:r>
+    </w:p>
+    <w:p>
+      <w:pPr>
+        <w:rPr>
+          <w:lang w:val="pt-PT"/>
+        </w:rPr>
+      </w:pPr>
+      <w:r>
+        <w:rPr>
+          <w:lang w:val="pt-PT"/>
+        </w:rPr>
+        <w:t>Título curto</w:t>
+      </w:r>
+    </w:p>
+    <w:p>
+      <w:pPr>
+        <w:rPr>
+          <w:lang w:val="pt-PT"/>
+        </w:rPr>
+      </w:pPr>
+      <w:r>
+        <w:rPr>
+          <w:lang w:val="pt-PT"/>
+        </w:rPr>
+        <w:t>Descrição objetiva</w:t>
+      </w:r>
+    </w:p>
+    <w:p>
+      <w:pPr>
+        <w:rPr>
+          <w:lang w:val="pt-PT"/>
+        </w:rPr>
+      </w:pPr>
+      <w:r>
+        <w:rPr>
+          <w:lang w:val="pt-PT"/>
+        </w:rPr>
+        <w:t>Interpretação analítica</w:t>
+      </w:r>
+    </w:p>
+    <w:p>
+      <w:pPr>
+        <w:rPr>
+          <w:lang w:val="pt-PT"/>
+        </w:rPr>
+      </w:pPr>
+      <w:r>
+        <w:rPr>
+          <w:lang w:val="pt-PT"/>
+        </w:rPr>
+        <w:t>Possíveis causas ou hipóteses</w:t>
+      </w:r>
+    </w:p>
+    <w:p>
+      <w:pPr>
+        <w:rPr>
+          <w:lang w:val="pt-PT"/>
+        </w:rPr>
+      </w:pPr>
+      <w:r>
+        <w:rPr>
+          <w:lang w:val="pt-PT"/>
+        </w:rPr>
+        <w:t>Implicações práticas (marketing, catálogo, consumo, artistas, gêneros)</w:t>
+      </w:r>
+    </w:p>
+    <w:p>
+      <w:pPr>
+        <w:rPr>
+          <w:lang w:val="pt-PT"/>
+        </w:rPr>
+      </w:pPr>
+      <w:r>
+        <w:rPr>
+          <w:lang w:val="pt-PT"/>
+        </w:rPr>
+        <w:t xml:space="preserve">Relevância para o </w:t>
+      </w:r>
+      <w:proofErr w:type="spellStart"/>
+      <w:r>
+        <w:rPr>
+          <w:lang w:val="pt-PT"/>
+        </w:rPr>
+        <w:t>dashboard</w:t>
+      </w:r>
+      <w:proofErr w:type="spellEnd"/>
+    </w:p>
+    <w:p>
+      <w:pPr>
+        <w:rPr>
+          <w:lang w:val="pt-PT"/>
+        </w:rPr>
+      </w:pPr>
+      <w:r>
+        <w:rPr>
+          <w:lang w:val="pt-PT"/>
+        </w:rPr>
+        <w:t>Gere no mínimo 20 a 30 insights, agrupados por tema:</w:t>
+      </w:r>
+    </w:p>
+    <w:p>
+      <w:pPr>
+        <w:rPr>
+          <w:lang w:val="pt-PT"/>
+        </w:rPr>
+      </w:pPr>
+      <w:r>
+        <w:rPr>
+          <w:rFonts w:ascii="Segoe UI Symbol" w:hAnsi="Segoe UI Symbol" w:cs="Segoe UI Symbol"/>
+          <w:lang w:val="pt-PT"/>
+        </w:rPr>
+        <w:t>✓</w:t>
+      </w:r>
+      <w:r>
+        <w:rPr>
+          <w:lang w:val="pt-PT"/>
+        </w:rPr>
+        <w:t xml:space="preserve"> Tendências gerais</w:t>
+      </w:r>
+    </w:p>
+    <w:p>
+      <w:pPr>
+        <w:rPr>
+          <w:lang w:val="pt-PT"/>
+        </w:rPr>
+      </w:pPr>
+      <w:r>
+        <w:rPr>
+          <w:rFonts w:ascii="Segoe UI Symbol" w:hAnsi="Segoe UI Symbol" w:cs="Segoe UI Symbol"/>
+          <w:lang w:val="pt-PT"/>
+        </w:rPr>
+        <w:lastRenderedPageBreak/>
+        <w:t>✓</w:t>
+      </w:r>
+      <w:r>
+        <w:rPr>
+          <w:lang w:val="pt-PT"/>
+        </w:rPr>
+        <w:t xml:space="preserve"> Gêneros musicais</w:t>
+      </w:r>
+    </w:p>
+    <w:p>
+      <w:pPr>
+        <w:rPr>
+          <w:lang w:val="pt-PT"/>
+        </w:rPr>
+      </w:pPr>
+      <w:r>
+        <w:rPr>
+          <w:rFonts w:ascii="Segoe UI Symbol" w:hAnsi="Segoe UI Symbol" w:cs="Segoe UI Symbol"/>
+          <w:lang w:val="pt-PT"/>
+        </w:rPr>
+        <w:t>✓</w:t>
+      </w:r>
+      <w:r>
+        <w:rPr>
+          <w:lang w:val="pt-PT"/>
+        </w:rPr>
+        <w:t xml:space="preserve"> Artistas</w:t>
+      </w:r>
+    </w:p>
+    <w:p>
+      <w:pPr>
+        <w:rPr>
+          <w:lang w:val="pt-PT"/>
+        </w:rPr>
+      </w:pPr>
+      <w:r>
+        <w:rPr>
+          <w:rFonts w:ascii="Segoe UI Symbol" w:hAnsi="Segoe UI Symbol" w:cs="Segoe UI Symbol"/>
+          <w:lang w:val="pt-PT"/>
+        </w:rPr>
+        <w:t>✓</w:t>
+      </w:r>
+      <w:r>
+        <w:rPr>
+          <w:lang w:val="pt-PT"/>
+        </w:rPr>
+        <w:t xml:space="preserve"> Popularidade</w:t>
+      </w:r>
+    </w:p>
+    <w:p>
+      <w:pPr>
+        <w:rPr>
+          <w:lang w:val="pt-PT"/>
+        </w:rPr>
+      </w:pPr>
+      <w:r>
+        <w:rPr>
+          <w:rFonts w:ascii="Segoe UI Symbol" w:hAnsi="Segoe UI Symbol" w:cs="Segoe UI Symbol"/>
+          <w:lang w:val="pt-PT"/>
+        </w:rPr>
+        <w:t>✓</w:t>
+      </w:r>
+      <w:r>
+        <w:rPr>
+          <w:lang w:val="pt-PT"/>
+        </w:rPr>
+        <w:t xml:space="preserve"> Duração</w:t>
+      </w:r>
+    </w:p>
+    <w:p>
+      <w:pPr>
+        <w:rPr>
+          <w:lang w:val="pt-PT"/>
+        </w:rPr>
+      </w:pPr>
+      <w:r>
+        <w:rPr>
+          <w:rFonts w:ascii="Segoe UI Symbol" w:hAnsi="Segoe UI Symbol" w:cs="Segoe UI Symbol"/>
+          <w:lang w:val="pt-PT"/>
+        </w:rPr>
+        <w:t>✓</w:t>
+      </w:r>
+      <w:r>
+        <w:rPr>
+          <w:lang w:val="pt-PT"/>
+        </w:rPr>
+        <w:t xml:space="preserve"> Linha do tempo</w:t>
+      </w:r>
+    </w:p>
+    <w:p>
+      <w:pPr>
+        <w:rPr>
+          <w:lang w:val="pt-PT"/>
+        </w:rPr>
+      </w:pPr>
+      <w:r>
+        <w:rPr>
+          <w:rFonts w:ascii="Segoe UI Symbol" w:hAnsi="Segoe UI Symbol" w:cs="Segoe UI Symbol"/>
+          <w:lang w:val="pt-PT"/>
+        </w:rPr>
+        <w:t>✓</w:t>
+      </w:r>
+      <w:r>
+        <w:rPr>
+          <w:lang w:val="pt-PT"/>
+        </w:rPr>
+        <w:t xml:space="preserve"> Faixas zero (cauda longa)</w:t>
+      </w:r>
+    </w:p>
+    <w:p>
+      <w:pPr>
+        <w:rPr>
+          <w:lang w:val="pt-PT"/>
+        </w:rPr>
+      </w:pPr>
+      <w:r>
+        <w:rPr>
+          <w:rFonts w:ascii="Segoe UI Symbol" w:hAnsi="Segoe UI Symbol" w:cs="Segoe UI Symbol"/>
+          <w:lang w:val="pt-PT"/>
+        </w:rPr>
+        <w:t>✓</w:t>
+      </w:r>
+      <w:r>
+        <w:rPr>
+          <w:lang w:val="pt-PT"/>
+        </w:rPr>
+        <w:t xml:space="preserve"> Volatilidade e consistência</w:t>
+      </w:r>
+    </w:p>
+    <w:p>
+      <w:pPr>
+        <w:rPr>
+          <w:lang w:val="pt-PT"/>
+        </w:rPr>
+      </w:pPr>
+      <w:r>
+        <w:rPr>
+          <w:rFonts w:ascii="Segoe UI Symbol" w:hAnsi="Segoe UI Symbol" w:cs="Segoe UI Symbol"/>
+          <w:lang w:val="pt-PT"/>
+        </w:rPr>
+        <w:t>✓</w:t>
+      </w:r>
+      <w:r>
+        <w:rPr>
+          <w:lang w:val="pt-PT"/>
+        </w:rPr>
+        <w:t xml:space="preserve"> Curadoria de catálogo</w:t>
+      </w:r>
+    </w:p>
+    <w:p>
+      <w:pPr>
+        <w:rPr>
+          <w:lang w:val="pt-PT"/>
+        </w:rPr>
+      </w:pPr>
+    </w:p>
+    <w:p>
+      <w:pPr>
+        <w:rPr>
+          <w:b/>
+          <w:bCs/>
+          <w:i/>
+          <w:iCs/>
+          <w:lang w:val="pt-PT"/>
+        </w:rPr>
+      </w:pPr>
+      <w:r>
+        <w:rPr>
+          <w:b/>
+          <w:bCs/>
+          <w:i/>
+          <w:iCs/>
+          <w:lang w:val="pt-PT"/>
+        </w:rPr>
+        <w:t xml:space="preserve">2. Criar textos gerados automaticamente para o </w:t>
+      </w:r>
+      <w:proofErr w:type="spellStart"/>
+      <w:r>
+        <w:rPr>
+          <w:b/>
+          <w:bCs/>
+          <w:i/>
+          <w:iCs/>
+          <w:lang w:val="pt-PT"/>
+        </w:rPr>
+        <w:t>dashboard</w:t>
+      </w:r>
+      <w:proofErr w:type="spellEnd"/>
+    </w:p>
+    <w:p>
+      <w:pPr>
+        <w:rPr>
+          <w:lang w:val="pt-PT"/>
+        </w:rPr>
+      </w:pPr>
+      <w:r>
+        <w:rPr>
+          <w:lang w:val="pt-PT"/>
+        </w:rPr>
+        <w:t xml:space="preserve">Gere blocos textuais prontos para incorporar no </w:t>
+      </w:r>
+      <w:proofErr w:type="spellStart"/>
+      <w:r>
+        <w:rPr>
+          <w:lang w:val="pt-PT"/>
+        </w:rPr>
+        <w:t>dashboard</w:t>
+      </w:r>
+      <w:proofErr w:type="spellEnd"/>
+      <w:r>
+        <w:rPr>
+          <w:lang w:val="pt-PT"/>
+        </w:rPr>
+        <w:t>, incluindo:</w:t>
+      </w:r>
+    </w:p>
+    <w:p>
+      <w:pPr>
+        <w:rPr>
+          <w:lang w:val="pt-PT"/>
+        </w:rPr>
+      </w:pPr>
+      <w:r>
+        <w:rPr>
+          <w:rFonts w:ascii="Segoe UI Symbol" w:hAnsi="Segoe UI Symbol" w:cs="Segoe UI Symbol"/>
+          <w:lang w:val="pt-PT"/>
+        </w:rPr>
+        <w:t>✔</w:t>
+      </w:r>
+      <w:r>
+        <w:rPr>
+          <w:lang w:val="pt-PT"/>
+        </w:rPr>
+        <w:t xml:space="preserve"> Texto explicativo introdutório</w:t>
+      </w:r>
+    </w:p>
+    <w:p>
+      <w:pPr>
+        <w:rPr>
+          <w:lang w:val="pt-PT"/>
+        </w:rPr>
+      </w:pPr>
+      <w:r>
+        <w:rPr>
+          <w:rFonts w:ascii="Segoe UI Symbol" w:hAnsi="Segoe UI Symbol" w:cs="Segoe UI Symbol"/>
+          <w:lang w:val="pt-PT"/>
+        </w:rPr>
+        <w:t>✔</w:t>
+      </w:r>
+      <w:r>
+        <w:rPr>
+          <w:lang w:val="pt-PT"/>
+        </w:rPr>
+        <w:t xml:space="preserve"> Descrições automáticas para cada aba</w:t>
+      </w:r>
+    </w:p>
+    <w:p>
+      <w:pPr>
+        <w:rPr>
+          <w:lang w:val="pt-PT"/>
+        </w:rPr>
+      </w:pPr>
+      <w:r>
+        <w:rPr>
+          <w:rFonts w:ascii="Segoe UI Symbol" w:hAnsi="Segoe UI Symbol" w:cs="Segoe UI Symbol"/>
+          <w:lang w:val="pt-PT"/>
+        </w:rPr>
+        <w:t>✔</w:t>
+      </w:r>
+      <w:r>
+        <w:rPr>
+          <w:lang w:val="pt-PT"/>
+        </w:rPr>
+        <w:t xml:space="preserve"> Textos de </w:t>
+      </w:r>
+      <w:proofErr w:type="spellStart"/>
+      <w:r>
+        <w:rPr>
+          <w:lang w:val="pt-PT"/>
+        </w:rPr>
+        <w:t>tooltip</w:t>
+      </w:r>
+      <w:proofErr w:type="spellEnd"/>
+      <w:r>
+        <w:rPr>
+          <w:lang w:val="pt-PT"/>
+        </w:rPr>
+        <w:t xml:space="preserve"> / </w:t>
+      </w:r>
+      <w:proofErr w:type="spellStart"/>
+      <w:r>
+        <w:rPr>
+          <w:lang w:val="pt-PT"/>
+        </w:rPr>
+        <w:t>hover</w:t>
+      </w:r>
+      <w:proofErr w:type="spellEnd"/>
+      <w:r>
+        <w:rPr>
+          <w:lang w:val="pt-PT"/>
+        </w:rPr>
+        <w:t xml:space="preserve"> </w:t>
+      </w:r>
+      <w:proofErr w:type="spellStart"/>
+      <w:r>
+        <w:rPr>
+          <w:lang w:val="pt-PT"/>
+        </w:rPr>
+        <w:t>text</w:t>
+      </w:r>
+      <w:proofErr w:type="spellEnd"/>
+    </w:p>
+    <w:p>
+      <w:pPr>
+        <w:rPr>
+          <w:lang w:val="pt-PT"/>
+        </w:rPr>
+      </w:pPr>
+      <w:r>
+        <w:rPr>
+          <w:rFonts w:ascii="Segoe UI Symbol" w:hAnsi="Segoe UI Symbol" w:cs="Segoe UI Symbol"/>
+          <w:lang w:val="pt-PT"/>
+        </w:rPr>
+        <w:t>✔</w:t>
+      </w:r>
+      <w:r>
+        <w:rPr>
+          <w:lang w:val="pt-PT"/>
+        </w:rPr>
+        <w:t xml:space="preserve"> Textos automáticos que aparecem ao selecionar filtros</w:t>
+      </w:r>
+    </w:p>
+    <w:p>
+      <w:pPr>
+        <w:rPr>
+          <w:lang w:val="pt-PT"/>
+        </w:rPr>
+      </w:pPr>
+      <w:r>
+        <w:rPr>
+          <w:rFonts w:ascii="Segoe UI Symbol" w:hAnsi="Segoe UI Symbol" w:cs="Segoe UI Symbol"/>
+          <w:lang w:val="pt-PT"/>
+        </w:rPr>
+        <w:t>✔</w:t>
+      </w:r>
+      <w:r>
+        <w:rPr>
+          <w:lang w:val="pt-PT"/>
+        </w:rPr>
+        <w:t xml:space="preserve"> Conclusões dinâmicas baseadas nos dados filtrados</w:t>
+      </w:r>
+    </w:p>
+    <w:p>
+      <w:pPr>
+        <w:rPr>
+          <w:b/>
+          <w:bCs/>
+          <w:i/>
+          <w:iCs/>
+          <w:lang w:val="pt-PT"/>
+        </w:rPr>
+      </w:pPr>
+      <w:r>
+        <w:rPr>
+          <w:b/>
+          <w:bCs/>
+          <w:i/>
+          <w:iCs/>
+          <w:lang w:val="pt-PT"/>
+        </w:rPr>
+        <w:t>3. Criar sugestões de componentes interativos</w:t>
+      </w:r>
+    </w:p>
+    <w:p>
+      <w:pPr>
+        <w:rPr>
+          <w:lang w:val="pt-PT"/>
+        </w:rPr>
+      </w:pPr>
+      <w:r>
+        <w:rPr>
+          <w:lang w:val="pt-PT"/>
+        </w:rPr>
+        <w:t>Baseado no que você encontrou:</w:t>
+      </w:r>
+    </w:p>
+    <w:p>
+      <w:pPr>
+        <w:pStyle w:val="PargrafodaLista"/>
+        <w:numPr>
+          <w:ilvl w:val="0"/>
+          <w:numId w:val="29"/>
+        </w:numPr>
+        <w:rPr>
+          <w:lang w:val="pt-PT"/>
+        </w:rPr>
+      </w:pPr>
+      <w:r>
+        <w:rPr>
+          <w:lang w:val="pt-PT"/>
+        </w:rPr>
+        <w:t>proponha novas visualizações;</w:t>
+      </w:r>
+    </w:p>
+    <w:p>
+      <w:pPr>
+        <w:pStyle w:val="PargrafodaLista"/>
+        <w:numPr>
+          <w:ilvl w:val="0"/>
+          <w:numId w:val="29"/>
+        </w:numPr>
+        <w:rPr>
+          <w:lang w:val="pt-PT"/>
+        </w:rPr>
+      </w:pPr>
+      <w:r>
+        <w:rPr>
+          <w:lang w:val="pt-PT"/>
+        </w:rPr>
+        <w:t>proponha indicadores dinâmicos;</w:t>
+      </w:r>
+    </w:p>
+    <w:p>
+      <w:pPr>
+        <w:pStyle w:val="PargrafodaLista"/>
+        <w:numPr>
+          <w:ilvl w:val="0"/>
+          <w:numId w:val="29"/>
+        </w:numPr>
+        <w:rPr>
+          <w:lang w:val="pt-PT"/>
+        </w:rPr>
+      </w:pPr>
+      <w:r>
+        <w:rPr>
+          <w:lang w:val="pt-PT"/>
+        </w:rPr>
+        <w:t>proponha versões explicativas das análises;</w:t>
+      </w:r>
+    </w:p>
+    <w:p>
+      <w:pPr>
+        <w:pStyle w:val="PargrafodaLista"/>
+        <w:numPr>
+          <w:ilvl w:val="0"/>
+          <w:numId w:val="29"/>
+        </w:numPr>
+        <w:rPr>
+          <w:lang w:val="pt-PT"/>
+        </w:rPr>
+      </w:pPr>
+      <w:r>
+        <w:rPr>
+          <w:lang w:val="pt-PT"/>
+        </w:rPr>
+        <w:t>proponha alertas automáticos baseados em dados;</w:t>
+      </w:r>
+    </w:p>
+    <w:p>
+      <w:pPr>
+        <w:pStyle w:val="PargrafodaLista"/>
+        <w:numPr>
+          <w:ilvl w:val="0"/>
+          <w:numId w:val="29"/>
+        </w:numPr>
+        <w:rPr>
+          <w:lang w:val="pt-PT"/>
+        </w:rPr>
+      </w:pPr>
+      <w:r>
+        <w:rPr>
+          <w:lang w:val="pt-PT"/>
+        </w:rPr>
+        <w:t>proponha recursos IA-</w:t>
+      </w:r>
+      <w:proofErr w:type="spellStart"/>
+      <w:r>
+        <w:rPr>
+          <w:lang w:val="pt-PT"/>
+        </w:rPr>
+        <w:t>driven</w:t>
+      </w:r>
+      <w:proofErr w:type="spellEnd"/>
+      <w:r>
+        <w:rPr>
+          <w:lang w:val="pt-PT"/>
+        </w:rPr>
+        <w:t xml:space="preserve"> para a versão final do </w:t>
+      </w:r>
+      <w:proofErr w:type="spellStart"/>
+      <w:r>
+        <w:rPr>
+          <w:lang w:val="pt-PT"/>
+        </w:rPr>
+        <w:t>dashboard</w:t>
+      </w:r>
+      <w:proofErr w:type="spellEnd"/>
+      <w:r>
+        <w:rPr>
+          <w:lang w:val="pt-PT"/>
+        </w:rPr>
+        <w:t>.</w:t>
+      </w:r>
+    </w:p>
+    <w:p>
+      <w:pPr>
+        <w:pStyle w:val="PargrafodaLista"/>
+        <w:numPr>
+          <w:ilvl w:val="0"/>
+          <w:numId w:val="29"/>
+        </w:numPr>
+        <w:rPr>
+          <w:lang w:val="pt-PT"/>
+        </w:rPr>
+      </w:pPr>
+      <w:r>
+        <w:rPr>
+          <w:lang w:val="pt-PT"/>
+        </w:rPr>
+        <w:t>Liste sugestões técnicas + narrativas.</w:t>
+      </w:r>
+    </w:p>
+    <w:p>
+      <w:pPr>
+        <w:rPr>
+          <w:b/>
+          <w:bCs/>
+          <w:i/>
+          <w:iCs/>
+          <w:lang w:val="pt-PT"/>
+        </w:rPr>
+      </w:pPr>
+      <w:r>
+        <w:rPr>
+          <w:b/>
+          <w:bCs/>
+          <w:i/>
+          <w:iCs/>
+          <w:lang w:val="pt-PT"/>
+        </w:rPr>
+        <w:t>4. Simular integração API (não precisa executar código)</w:t>
+      </w:r>
+    </w:p>
+    <w:p>
+      <w:pPr>
+        <w:rPr>
+          <w:lang w:val="pt-PT"/>
+        </w:rPr>
+      </w:pPr>
+      <w:r>
+        <w:rPr>
+          <w:lang w:val="pt-PT"/>
+        </w:rPr>
+        <w:t>Gere:</w:t>
+      </w:r>
+    </w:p>
+    <w:p>
+      <w:pPr>
+        <w:rPr>
+          <w:lang w:val="pt-PT"/>
+        </w:rPr>
+      </w:pPr>
+      <w:r>
+        <w:rPr>
+          <w:lang w:val="pt-PT"/>
+        </w:rPr>
+        <w:t xml:space="preserve">modelos simples de </w:t>
+      </w:r>
+      <w:proofErr w:type="spellStart"/>
+      <w:r>
+        <w:rPr>
+          <w:lang w:val="pt-PT"/>
+        </w:rPr>
+        <w:t>endpoint</w:t>
+      </w:r>
+      <w:proofErr w:type="spellEnd"/>
+      <w:r>
+        <w:rPr>
+          <w:lang w:val="pt-PT"/>
+        </w:rPr>
+        <w:t xml:space="preserve"> fictício de API;</w:t>
+      </w:r>
+    </w:p>
+    <w:p>
+      <w:pPr>
+        <w:rPr>
+          <w:lang w:val="pt-PT"/>
+        </w:rPr>
+      </w:pPr>
+      <w:r>
+        <w:rPr>
+          <w:lang w:val="pt-PT"/>
+        </w:rPr>
+        <w:t xml:space="preserve">estrutura padrão de </w:t>
+      </w:r>
+      <w:proofErr w:type="spellStart"/>
+      <w:r>
+        <w:rPr>
+          <w:lang w:val="pt-PT"/>
+        </w:rPr>
+        <w:t>payload</w:t>
+      </w:r>
+      <w:proofErr w:type="spellEnd"/>
+      <w:r>
+        <w:rPr>
+          <w:lang w:val="pt-PT"/>
+        </w:rPr>
+        <w:t>;</w:t>
+      </w:r>
+    </w:p>
+    <w:p>
+      <w:pPr>
+        <w:rPr>
+          <w:lang w:val="pt-PT"/>
+        </w:rPr>
+      </w:pPr>
+      <w:r>
+        <w:rPr>
+          <w:lang w:val="pt-PT"/>
+        </w:rPr>
+        <w:t xml:space="preserve">exemplos de </w:t>
+      </w:r>
+      <w:proofErr w:type="spellStart"/>
+      <w:r>
+        <w:rPr>
+          <w:lang w:val="pt-PT"/>
+        </w:rPr>
+        <w:t>request</w:t>
+      </w:r>
+      <w:proofErr w:type="spellEnd"/>
+      <w:r>
+        <w:rPr>
+          <w:lang w:val="pt-PT"/>
+        </w:rPr>
+        <w:t>/response;</w:t>
+      </w:r>
+    </w:p>
+    <w:p>
+      <w:pPr>
+        <w:rPr>
+          <w:lang w:val="pt-PT"/>
+        </w:rPr>
+      </w:pPr>
+      <w:r>
+        <w:rPr>
+          <w:lang w:val="pt-PT"/>
+        </w:rPr>
+        <w:lastRenderedPageBreak/>
+        <w:t xml:space="preserve">formato JSON para integração IA ↔ </w:t>
+      </w:r>
+      <w:proofErr w:type="spellStart"/>
+      <w:r>
+        <w:rPr>
+          <w:lang w:val="pt-PT"/>
+        </w:rPr>
+        <w:t>dashboard</w:t>
+      </w:r>
+      <w:proofErr w:type="spellEnd"/>
+      <w:r>
+        <w:rPr>
+          <w:lang w:val="pt-PT"/>
+        </w:rPr>
+        <w:t>.</w:t>
+      </w:r>
+    </w:p>
+    <w:p>
+      <w:pPr>
+        <w:rPr>
+          <w:b/>
+          <w:bCs/>
+          <w:i/>
+          <w:iCs/>
+          <w:lang w:val="pt-PT"/>
+        </w:rPr>
+      </w:pPr>
+      <w:r>
+        <w:rPr>
+          <w:b/>
+          <w:bCs/>
+          <w:i/>
+          <w:iCs/>
+          <w:lang w:val="pt-PT"/>
+        </w:rPr>
+        <w:t xml:space="preserve">5. Criar texto final da </w:t>
+      </w:r>
+      <w:proofErr w:type="spellStart"/>
+      <w:r>
+        <w:rPr>
+          <w:b/>
+          <w:bCs/>
+          <w:i/>
+          <w:iCs/>
+          <w:lang w:val="pt-PT"/>
+        </w:rPr>
+        <w:t>Issue</w:t>
+      </w:r>
+      <w:proofErr w:type="spellEnd"/>
+      <w:r>
+        <w:rPr>
+          <w:b/>
+          <w:bCs/>
+          <w:i/>
+          <w:iCs/>
+          <w:lang w:val="pt-PT"/>
+        </w:rPr>
+        <w:t xml:space="preserve"> 4.1 (para o relatório)</w:t>
+      </w:r>
+    </w:p>
+    <w:p>
+      <w:pPr>
+        <w:rPr>
+          <w:lang w:val="pt-PT"/>
+        </w:rPr>
+      </w:pPr>
+      <w:r>
+        <w:rPr>
+          <w:lang w:val="pt-PT"/>
+        </w:rPr>
+        <w:t>Monte um texto completo contendo:</w:t>
+      </w:r>
+    </w:p>
+    <w:p>
+      <w:pPr>
+        <w:rPr>
+          <w:lang w:val="pt-PT"/>
+        </w:rPr>
+      </w:pPr>
+      <w:r>
+        <w:rPr>
+          <w:lang w:val="pt-PT"/>
+        </w:rPr>
+        <w:t>objetivo da atividade,</w:t>
+      </w:r>
+    </w:p>
+    <w:p>
+      <w:pPr>
+        <w:rPr>
+          <w:lang w:val="pt-PT"/>
+        </w:rPr>
+      </w:pPr>
+      <w:r>
+        <w:rPr>
+          <w:lang w:val="pt-PT"/>
+        </w:rPr>
+        <w:t xml:space="preserve">metodologia de engenharia de </w:t>
+      </w:r>
+      <w:proofErr w:type="spellStart"/>
+      <w:r>
+        <w:rPr>
+          <w:lang w:val="pt-PT"/>
+        </w:rPr>
+        <w:t>prompt</w:t>
+      </w:r>
+      <w:proofErr w:type="spellEnd"/>
+      <w:r>
+        <w:rPr>
+          <w:lang w:val="pt-PT"/>
+        </w:rPr>
+        <w:t xml:space="preserve"> aplicada,</w:t>
+      </w:r>
+    </w:p>
+    <w:p>
+      <w:pPr>
+        <w:rPr>
+          <w:lang w:val="pt-PT"/>
+        </w:rPr>
+      </w:pPr>
+      <w:r>
+        <w:rPr>
+          <w:lang w:val="pt-PT"/>
+        </w:rPr>
+        <w:t>exemplos de insights automáticos,</w:t>
+      </w:r>
+    </w:p>
+    <w:p>
+      <w:pPr>
+        <w:rPr>
+          <w:lang w:val="pt-PT"/>
+        </w:rPr>
+      </w:pPr>
+      <w:r>
+        <w:rPr>
+          <w:lang w:val="pt-PT"/>
+        </w:rPr>
+        <w:t>exemplos de textos gerados,</w:t>
+      </w:r>
+    </w:p>
+    <w:p>
+      <w:pPr>
+        <w:rPr>
+          <w:lang w:val="pt-PT"/>
+        </w:rPr>
+      </w:pPr>
+      <w:r>
+        <w:rPr>
+          <w:lang w:val="pt-PT"/>
+        </w:rPr>
+        <w:t>resultados obtidos,</w:t>
+      </w:r>
+    </w:p>
+    <w:p>
+      <w:pPr>
+        <w:rPr>
+          <w:lang w:val="pt-PT"/>
+        </w:rPr>
+      </w:pPr>
+      <w:r>
+        <w:rPr>
+          <w:lang w:val="pt-PT"/>
+        </w:rPr>
+        <w:t xml:space="preserve">próximos passos (Semana 4.2 – </w:t>
+      </w:r>
+      <w:proofErr w:type="spellStart"/>
+      <w:r>
+        <w:rPr>
+          <w:lang w:val="pt-PT"/>
+        </w:rPr>
+        <w:t>Dashboard</w:t>
+      </w:r>
+      <w:proofErr w:type="spellEnd"/>
+      <w:r>
+        <w:rPr>
+          <w:lang w:val="pt-PT"/>
+        </w:rPr>
+        <w:t xml:space="preserve"> Final).</w:t>
+      </w:r>
+    </w:p>
+    <w:p>
+      <w:pPr>
+        <w:rPr>
+          <w:lang w:val="pt-PT"/>
+        </w:rPr>
+      </w:pPr>
+      <w:r>
+        <w:rPr>
+          <w:lang w:val="pt-PT"/>
+        </w:rPr>
+        <w:t xml:space="preserve">Formato: </w:t>
+      </w:r>
+      <w:proofErr w:type="spellStart"/>
+      <w:r>
+        <w:rPr>
+          <w:lang w:val="pt-PT"/>
+        </w:rPr>
+        <w:t>Markdown</w:t>
+      </w:r>
+      <w:proofErr w:type="spellEnd"/>
+      <w:r>
+        <w:rPr>
+          <w:lang w:val="pt-PT"/>
+        </w:rPr>
+        <w:t xml:space="preserve"> estruturado.</w:t>
+      </w:r>
+    </w:p>
+    <w:p>
+      <w:pPr>
+        <w:rPr>
+          <w:lang w:val="pt-PT"/>
+        </w:rPr>
+      </w:pPr>
+      <w:r>
+        <w:rPr>
+          <w:lang w:val="pt-PT"/>
+        </w:rPr>
+        <w:t>ENTREGAS</w:t>
+      </w:r>
+    </w:p>
+    <w:p>
+      <w:pPr>
+        <w:rPr>
+          <w:lang w:val="pt-PT"/>
+        </w:rPr>
+      </w:pPr>
+      <w:r>
+        <w:rPr>
+          <w:lang w:val="pt-PT"/>
+        </w:rPr>
+        <w:t>Produza:</w:t>
+      </w:r>
+    </w:p>
+    <w:p>
+      <w:pPr>
+        <w:rPr>
+          <w:lang w:val="pt-PT"/>
+        </w:rPr>
+      </w:pPr>
+      <w:r>
+        <w:rPr>
+          <w:lang w:val="pt-PT"/>
+        </w:rPr>
+        <w:t>Insight Pack Automático – 30+ insights</w:t>
+      </w:r>
+    </w:p>
+    <w:p>
+      <w:pPr>
+        <w:rPr>
+          <w:lang w:val="pt-PT"/>
+        </w:rPr>
+      </w:pPr>
+      <w:r>
+        <w:rPr>
+          <w:lang w:val="pt-PT"/>
+        </w:rPr>
+        <w:t xml:space="preserve">Blocos textuais para o </w:t>
+      </w:r>
+      <w:proofErr w:type="spellStart"/>
+      <w:r>
+        <w:rPr>
+          <w:lang w:val="pt-PT"/>
+        </w:rPr>
+        <w:t>dashboard</w:t>
+      </w:r>
+      <w:proofErr w:type="spellEnd"/>
+    </w:p>
+    <w:p>
+      <w:pPr>
+        <w:rPr>
+          <w:lang w:val="pt-PT"/>
+        </w:rPr>
+      </w:pPr>
+      <w:r>
+        <w:rPr>
+          <w:lang w:val="pt-PT"/>
+        </w:rPr>
+        <w:t>Sugestões IA-</w:t>
+      </w:r>
+      <w:proofErr w:type="spellStart"/>
+      <w:r>
+        <w:rPr>
+          <w:lang w:val="pt-PT"/>
+        </w:rPr>
+        <w:t>driven</w:t>
+      </w:r>
+      <w:proofErr w:type="spellEnd"/>
+    </w:p>
+    <w:p>
+      <w:pPr>
+        <w:rPr>
+          <w:lang w:val="pt-PT"/>
+        </w:rPr>
+      </w:pPr>
+      <w:r>
+        <w:rPr>
+          <w:lang w:val="pt-PT"/>
+        </w:rPr>
+        <w:t>Modelo de integração API</w:t>
+      </w:r>
+    </w:p>
+    <w:p>
+      <w:pPr>
+        <w:rPr>
+          <w:lang w:val="pt-PT"/>
+        </w:rPr>
+      </w:pPr>
+      <w:r>
+        <w:rPr>
+          <w:lang w:val="pt-PT"/>
+        </w:rPr>
+        <w:t xml:space="preserve">Texto final da </w:t>
+      </w:r>
+      <w:proofErr w:type="spellStart"/>
+      <w:r>
+        <w:rPr>
+          <w:lang w:val="pt-PT"/>
+        </w:rPr>
+        <w:t>Issue</w:t>
+      </w:r>
+      <w:proofErr w:type="spellEnd"/>
+      <w:r>
+        <w:rPr>
+          <w:lang w:val="pt-PT"/>
+        </w:rPr>
+        <w:t xml:space="preserve"> 4.1 para o relatório (</w:t>
+      </w:r>
+      <w:proofErr w:type="spellStart"/>
+      <w:r>
+        <w:rPr>
+          <w:lang w:val="pt-PT"/>
+        </w:rPr>
+        <w:t>markdown</w:t>
+      </w:r>
+      <w:proofErr w:type="spellEnd"/>
+      <w:r>
+        <w:rPr>
+          <w:lang w:val="pt-PT"/>
+        </w:rPr>
+        <w:t xml:space="preserve"> completo)</w:t>
+      </w:r>
+    </w:p>
+    <w:p>
+      <w:pPr>
+        <w:rPr>
+          <w:lang w:val="pt-PT"/>
+        </w:rPr>
+      </w:pPr>
+      <w:r>
+        <w:rPr>
+          <w:lang w:val="pt-PT"/>
+        </w:rPr>
+        <w:t>Resumo executivo com até 12 linhas</w:t>
+      </w:r>
+    </w:p>
+    <w:p>
+      <w:pPr>
+        <w:rPr>
+          <w:lang w:val="pt-PT"/>
+        </w:rPr>
+      </w:pPr>
+      <w:r>
+        <w:rPr>
+          <w:lang w:val="pt-PT"/>
+        </w:rPr>
+        <w:t>Use linguagem clara, técnica, analítica e narrativa.</w:t>
+      </w:r>
+    </w:p>
+    <w:p>
+      <w:pPr>
+        <w:rPr>
+          <w:lang w:val="pt-PT"/>
+        </w:rPr>
+      </w:pPr>
+      <w:r>
+        <w:rPr>
+          <w:lang w:val="pt-PT"/>
+        </w:rPr>
+        <w:t>Não omita detalhes.</w:t>
+      </w:r>
+    </w:p>
+    <w:p>
+      <w:pPr>
+        <w:rPr>
+          <w:lang w:val="pt-PT"/>
+        </w:rPr>
+      </w:pPr>
+      <w:r>
+        <w:rPr>
+          <w:lang w:val="pt-PT"/>
+        </w:rPr>
+        <w:t>A análise deve ser profunda e digna de um relatório profissional.</w:t>
+      </w:r>
+    </w:p>
+    <w:p>
+      <w:pPr>
+        <w:pStyle w:val="Ttulo1"/>
+        <w:rPr>
+          <w:lang w:val="pt-PT"/>
+        </w:rPr>
+      </w:pPr>
+      <w:r>
+        <w:rPr>
+          <w:lang w:val="pt-PT"/>
+        </w:rPr>
+        <w:t>3. Resultados – Pacote de 30+ insights automáticos</w:t>
+      </w:r>
+    </w:p>
+    <w:p>
+      <w:pPr>
+        <w:rPr>
+          <w:lang w:val="pt-PT"/>
+        </w:rPr>
+      </w:pPr>
+      <w:r>
+        <w:rPr>
+          <w:lang w:val="pt-PT"/>
+        </w:rPr>
+        <w:t>Os insights foram organizados em:</w:t>
+      </w:r>
+    </w:p>
+    <w:p>
+      <w:pPr>
+        <w:rPr>
+          <w:lang w:val="pt-PT"/>
+        </w:rPr>
+      </w:pPr>
+      <w:r>
+        <w:rPr>
+          <w:lang w:val="pt-PT"/>
+        </w:rPr>
+        <w:t>tendências gerais do catálogo,</w:t>
+      </w:r>
+    </w:p>
+    <w:p>
+      <w:pPr>
+        <w:rPr>
+          <w:lang w:val="pt-PT"/>
+        </w:rPr>
+      </w:pPr>
+      <w:r>
+        <w:rPr>
+          <w:lang w:val="pt-PT"/>
+        </w:rPr>
+        <w:t>padrões de popularidade,</w:t>
+      </w:r>
+    </w:p>
+    <w:p>
+      <w:pPr>
+        <w:rPr>
+          <w:lang w:val="pt-PT"/>
+        </w:rPr>
+      </w:pPr>
+      <w:r>
+        <w:rPr>
+          <w:lang w:val="pt-PT"/>
+        </w:rPr>
+        <w:t>comportamento por gênero,</w:t>
+      </w:r>
+    </w:p>
+    <w:p>
+      <w:pPr>
+        <w:rPr>
+          <w:lang w:val="pt-PT"/>
+        </w:rPr>
+      </w:pPr>
+      <w:r>
+        <w:rPr>
+          <w:lang w:val="pt-PT"/>
+        </w:rPr>
+        <w:t>consistência e volatilidade artística,</w:t>
+      </w:r>
+    </w:p>
+    <w:p>
+      <w:pPr>
+        <w:rPr>
+          <w:lang w:val="pt-PT"/>
+        </w:rPr>
+      </w:pPr>
+      <w:r>
+        <w:rPr>
+          <w:lang w:val="pt-PT"/>
+        </w:rPr>
+        <w:t>dinâmica dos lançamentos,</w:t>
+      </w:r>
+    </w:p>
+    <w:p>
+      <w:pPr>
+        <w:rPr>
+          <w:lang w:val="pt-PT"/>
+        </w:rPr>
+      </w:pPr>
+      <w:r>
+        <w:rPr>
+          <w:lang w:val="pt-PT"/>
+        </w:rPr>
+        <w:t>comportamento das faixas zero (cauda longa),</w:t>
+      </w:r>
+    </w:p>
+    <w:p>
+      <w:pPr>
+        <w:rPr>
+          <w:lang w:val="pt-PT"/>
+        </w:rPr>
+      </w:pPr>
+      <w:r>
+        <w:rPr>
+          <w:lang w:val="pt-PT"/>
+        </w:rPr>
+        <w:t>efeitos de duração,</w:t>
+      </w:r>
+    </w:p>
+    <w:p>
+      <w:pPr>
+        <w:rPr>
+          <w:lang w:val="pt-PT"/>
+        </w:rPr>
+      </w:pPr>
+      <w:r>
+        <w:rPr>
+          <w:lang w:val="pt-PT"/>
+        </w:rPr>
+        <w:lastRenderedPageBreak/>
+        <w:t>padrões mercadológicos e culturais.</w:t>
+      </w:r>
+    </w:p>
+    <w:p>
+      <w:pPr>
+        <w:rPr>
+          <w:lang w:val="pt-PT"/>
+        </w:rPr>
+      </w:pPr>
+      <w:r>
+        <w:rPr>
+          <w:lang w:val="pt-PT"/>
+        </w:rPr>
+        <w:t>Os outputs entregam explicações claras, hipóteses causais e implicações práticas para marketing musical, curadoria, recomendação e análise cultural.</w:t>
+      </w:r>
+    </w:p>
+    <w:p>
+      <w:pPr>
+        <w:pStyle w:val="Ttulo1"/>
+        <w:rPr>
+          <w:lang w:val="pt-PT"/>
+        </w:rPr>
+      </w:pPr>
+      <w:r>
+        <w:rPr>
+          <w:lang w:val="pt-PT"/>
+        </w:rPr>
+        <w:t xml:space="preserve">4. Textos Automáticos Gerados para o </w:t>
+      </w:r>
+      <w:proofErr w:type="spellStart"/>
+      <w:r>
+        <w:rPr>
+          <w:lang w:val="pt-PT"/>
+        </w:rPr>
+        <w:t>Dashboard</w:t>
+      </w:r>
+      <w:proofErr w:type="spellEnd"/>
+    </w:p>
+    <w:p>
+      <w:pPr>
+        <w:rPr>
+          <w:lang w:val="pt-PT"/>
+        </w:rPr>
+      </w:pPr>
+      <w:r>
+        <w:rPr>
+          <w:lang w:val="pt-PT"/>
+        </w:rPr>
+        <w:t>A IA produziu:</w:t>
+      </w:r>
+    </w:p>
+    <w:p>
+      <w:pPr>
+        <w:rPr>
+          <w:lang w:val="pt-PT"/>
+        </w:rPr>
+      </w:pPr>
+      <w:r>
+        <w:rPr>
+          <w:lang w:val="pt-PT"/>
+        </w:rPr>
+        <w:t>texto introdutório da página principal,</w:t>
+      </w:r>
+    </w:p>
+    <w:p>
+      <w:pPr>
+        <w:rPr>
+          <w:lang w:val="pt-PT"/>
+        </w:rPr>
+      </w:pPr>
+      <w:r>
+        <w:rPr>
+          <w:lang w:val="pt-PT"/>
+        </w:rPr>
+        <w:t>descrições automáticas das quatro abas,</w:t>
+      </w:r>
+    </w:p>
+    <w:p>
+      <w:pPr>
+        <w:rPr>
+          <w:lang w:val="pt-PT"/>
+        </w:rPr>
+      </w:pPr>
+      <w:proofErr w:type="spellStart"/>
+      <w:r>
+        <w:rPr>
+          <w:lang w:val="pt-PT"/>
+        </w:rPr>
+        <w:t>tooltips</w:t>
+      </w:r>
+      <w:proofErr w:type="spellEnd"/>
+      <w:r>
+        <w:rPr>
+          <w:lang w:val="pt-PT"/>
+        </w:rPr>
+        <w:t xml:space="preserve"> explicativos,</w:t>
+      </w:r>
+    </w:p>
+    <w:p>
+      <w:pPr>
+        <w:rPr>
+          <w:lang w:val="pt-PT"/>
+        </w:rPr>
+      </w:pPr>
+      <w:r>
+        <w:rPr>
+          <w:lang w:val="pt-PT"/>
+        </w:rPr>
+        <w:t>conclusões narrativas,</w:t>
+      </w:r>
+    </w:p>
+    <w:p>
+      <w:pPr>
+        <w:rPr>
+          <w:lang w:val="pt-PT"/>
+        </w:rPr>
+      </w:pPr>
+      <w:r>
+        <w:rPr>
+          <w:lang w:val="pt-PT"/>
+        </w:rPr>
+        <w:t>mensagens para diferentes combinações de filtros.</w:t>
+      </w:r>
+    </w:p>
+    <w:p>
+      <w:pPr>
+        <w:rPr>
+          <w:lang w:val="pt-PT"/>
+        </w:rPr>
+      </w:pPr>
+      <w:r>
+        <w:rPr>
+          <w:lang w:val="pt-PT"/>
+        </w:rPr>
+        <w:t xml:space="preserve">Esses textos serão integrados diretamente ao </w:t>
+      </w:r>
+      <w:proofErr w:type="spellStart"/>
+      <w:r>
+        <w:rPr>
+          <w:lang w:val="pt-PT"/>
+        </w:rPr>
+        <w:t>dashboard</w:t>
+      </w:r>
+      <w:proofErr w:type="spellEnd"/>
+      <w:r>
+        <w:rPr>
+          <w:lang w:val="pt-PT"/>
+        </w:rPr>
+        <w:t xml:space="preserve"> na Semana 4.2.</w:t>
+      </w:r>
+    </w:p>
+    <w:p>
+      <w:pPr>
+        <w:pStyle w:val="Ttulo1"/>
+        <w:rPr>
+          <w:lang w:val="pt-PT"/>
+        </w:rPr>
+      </w:pPr>
+      <w:r>
+        <w:rPr>
+          <w:lang w:val="pt-PT"/>
+        </w:rPr>
+        <w:t>5. Sugestões IA-</w:t>
+      </w:r>
+      <w:proofErr w:type="spellStart"/>
+      <w:r>
+        <w:rPr>
+          <w:lang w:val="pt-PT"/>
+        </w:rPr>
+        <w:t>driven</w:t>
+      </w:r>
+      <w:proofErr w:type="spellEnd"/>
+      <w:r>
+        <w:rPr>
+          <w:lang w:val="pt-PT"/>
+        </w:rPr>
+        <w:t xml:space="preserve"> para aprimorar o </w:t>
+      </w:r>
+      <w:proofErr w:type="spellStart"/>
+      <w:r>
+        <w:rPr>
+          <w:lang w:val="pt-PT"/>
+        </w:rPr>
+        <w:t>Dashboard</w:t>
+      </w:r>
+      <w:proofErr w:type="spellEnd"/>
+    </w:p>
+    <w:p>
+      <w:pPr>
+        <w:rPr>
+          <w:lang w:val="pt-PT"/>
+        </w:rPr>
+      </w:pPr>
+      <w:r>
+        <w:rPr>
+          <w:lang w:val="pt-PT"/>
+        </w:rPr>
+        <w:t>Entre as recomendações:</w:t>
+      </w:r>
+    </w:p>
+    <w:p>
+      <w:pPr>
+        <w:rPr>
+          <w:lang w:val="pt-PT"/>
+        </w:rPr>
+      </w:pPr>
+      <w:r>
+        <w:rPr>
+          <w:lang w:val="pt-PT"/>
+        </w:rPr>
+        <w:t>rankings dinâmicos por consistência artística,</w:t>
+      </w:r>
+    </w:p>
+    <w:p>
+      <w:pPr>
+        <w:rPr>
+          <w:lang w:val="pt-PT"/>
+        </w:rPr>
+      </w:pPr>
+      <w:r>
+        <w:rPr>
+          <w:lang w:val="pt-PT"/>
+        </w:rPr>
+        <w:t>alertas sobre picos de lançamentos,</w:t>
+      </w:r>
+    </w:p>
+    <w:p>
+      <w:pPr>
+        <w:rPr>
+          <w:lang w:val="pt-PT"/>
+        </w:rPr>
+      </w:pPr>
+      <w:r>
+        <w:rPr>
+          <w:lang w:val="pt-PT"/>
+        </w:rPr>
+        <w:t>comparações automáticas entre gêneros,</w:t>
+      </w:r>
+    </w:p>
+    <w:p>
+      <w:pPr>
+        <w:rPr>
+          <w:lang w:val="pt-PT"/>
+        </w:rPr>
+      </w:pPr>
+      <w:r>
+        <w:rPr>
+          <w:lang w:val="pt-PT"/>
+        </w:rPr>
+        <w:t>indicadores de “energia do catálogo”,</w:t>
+      </w:r>
+    </w:p>
+    <w:p>
+      <w:pPr>
+        <w:rPr>
+          <w:lang w:val="pt-PT"/>
+        </w:rPr>
+      </w:pPr>
+      <w:r>
+        <w:rPr>
+          <w:lang w:val="pt-PT"/>
+        </w:rPr>
+        <w:t>análise automática da cauda longa,</w:t>
+      </w:r>
+    </w:p>
+    <w:p>
+      <w:pPr>
+        <w:rPr>
+          <w:lang w:val="pt-PT"/>
+        </w:rPr>
+      </w:pPr>
+      <w:r>
+        <w:rPr>
+          <w:lang w:val="pt-PT"/>
+        </w:rPr>
+        <w:t xml:space="preserve">modo </w:t>
+      </w:r>
+      <w:proofErr w:type="spellStart"/>
+      <w:r>
+        <w:rPr>
+          <w:lang w:val="pt-PT"/>
+        </w:rPr>
+        <w:t>storytelling</w:t>
+      </w:r>
+      <w:proofErr w:type="spellEnd"/>
+      <w:r>
+        <w:rPr>
+          <w:lang w:val="pt-PT"/>
+        </w:rPr>
+        <w:t xml:space="preserve"> guiado (passo a passo narrativo).</w:t>
+      </w:r>
+    </w:p>
+    <w:p>
+      <w:pPr>
+        <w:pStyle w:val="Ttulo1"/>
+        <w:rPr>
+          <w:lang w:val="pt-PT"/>
+        </w:rPr>
+      </w:pPr>
+      <w:r>
+        <w:rPr>
+          <w:lang w:val="pt-PT"/>
+        </w:rPr>
+        <w:t>6. Modelagem Conceitual da Integração API</w:t>
+      </w:r>
+    </w:p>
+    <w:p>
+      <w:pPr>
+        <w:rPr>
+          <w:lang w:val="pt-PT"/>
+        </w:rPr>
+      </w:pPr>
+      <w:r>
+        <w:rPr>
+          <w:lang w:val="pt-PT"/>
+        </w:rPr>
+        <w:t>Foi estruturado:</w:t>
+      </w:r>
+    </w:p>
+    <w:p>
+      <w:pPr>
+        <w:rPr>
+          <w:lang w:val="pt-PT"/>
+        </w:rPr>
+      </w:pPr>
+      <w:proofErr w:type="spellStart"/>
+      <w:r>
+        <w:rPr>
+          <w:lang w:val="pt-PT"/>
+        </w:rPr>
+        <w:t>endpoint</w:t>
+      </w:r>
+      <w:proofErr w:type="spellEnd"/>
+      <w:r>
+        <w:rPr>
+          <w:lang w:val="pt-PT"/>
+        </w:rPr>
+        <w:t xml:space="preserve"> fictício: /</w:t>
+      </w:r>
+      <w:proofErr w:type="spellStart"/>
+      <w:r>
+        <w:rPr>
+          <w:lang w:val="pt-PT"/>
+        </w:rPr>
+        <w:t>api</w:t>
+      </w:r>
+      <w:proofErr w:type="spellEnd"/>
+      <w:r>
+        <w:rPr>
+          <w:lang w:val="pt-PT"/>
+        </w:rPr>
+        <w:t>/insights</w:t>
+      </w:r>
+    </w:p>
+    <w:p>
+      <w:pPr>
+        <w:rPr>
+          <w:lang w:val="pt-PT"/>
+        </w:rPr>
+      </w:pPr>
+      <w:proofErr w:type="spellStart"/>
+      <w:r>
+        <w:rPr>
+          <w:lang w:val="pt-PT"/>
+        </w:rPr>
+        <w:t>payload</w:t>
+      </w:r>
+      <w:proofErr w:type="spellEnd"/>
+      <w:r>
+        <w:rPr>
+          <w:lang w:val="pt-PT"/>
+        </w:rPr>
+        <w:t xml:space="preserve"> contendo filtros enviados pelo </w:t>
+      </w:r>
+      <w:proofErr w:type="spellStart"/>
+      <w:r>
+        <w:rPr>
+          <w:lang w:val="pt-PT"/>
+        </w:rPr>
+        <w:t>dashboard</w:t>
+      </w:r>
+      <w:proofErr w:type="spellEnd"/>
+    </w:p>
+    <w:p>
+      <w:pPr>
+        <w:rPr>
+          <w:lang w:val="pt-PT"/>
+        </w:rPr>
+      </w:pPr>
+      <w:r>
+        <w:rPr>
+          <w:lang w:val="pt-PT"/>
+        </w:rPr>
+        <w:t>resposta JSON com insights correspondentes</w:t>
+      </w:r>
+    </w:p>
+    <w:p>
+      <w:pPr>
+        <w:rPr>
+          <w:lang w:val="pt-PT"/>
+        </w:rPr>
+      </w:pPr>
+      <w:r>
+        <w:rPr>
+          <w:lang w:val="pt-PT"/>
+        </w:rPr>
+        <w:t>Essa modelagem servirá como base na Semana 4.2 para integração narrativa real.</w:t>
+      </w:r>
+    </w:p>
+    <w:p>
+      <w:pPr>
+        <w:pStyle w:val="Ttulo1"/>
+        <w:rPr>
+          <w:lang w:val="pt-PT"/>
+        </w:rPr>
+      </w:pPr>
+      <w:r>
+        <w:rPr>
+          <w:lang w:val="pt-PT"/>
+        </w:rPr>
+        <w:lastRenderedPageBreak/>
+        <w:t>7. Conclusão</w:t>
+      </w:r>
+    </w:p>
+    <w:p>
+      <w:pPr>
+        <w:rPr>
+          <w:lang w:val="pt-PT"/>
+        </w:rPr>
+      </w:pPr>
+      <w:r>
+        <w:rPr>
+          <w:lang w:val="pt-PT"/>
+        </w:rPr>
+        <w:t xml:space="preserve">A </w:t>
+      </w:r>
+      <w:proofErr w:type="spellStart"/>
+      <w:r>
+        <w:rPr>
+          <w:lang w:val="pt-PT"/>
+        </w:rPr>
+        <w:t>Issue</w:t>
+      </w:r>
+      <w:proofErr w:type="spellEnd"/>
+      <w:r>
+        <w:rPr>
+          <w:lang w:val="pt-PT"/>
+        </w:rPr>
+        <w:t xml:space="preserve"> 4.1 se encerra com:</w:t>
+      </w:r>
+    </w:p>
+    <w:p>
+      <w:pPr>
+        <w:rPr>
+          <w:lang w:val="pt-PT"/>
+        </w:rPr>
+      </w:pPr>
+      <w:r>
+        <w:rPr>
+          <w:lang w:val="pt-PT"/>
+        </w:rPr>
+        <w:t>insights completos,</w:t>
+      </w:r>
+    </w:p>
+    <w:p>
+      <w:pPr>
+        <w:rPr>
+          <w:lang w:val="pt-PT"/>
+        </w:rPr>
+      </w:pPr>
+      <w:r>
+        <w:rPr>
+          <w:lang w:val="pt-PT"/>
+        </w:rPr>
+        <w:t>textos narrativos preparados,</w:t>
+      </w:r>
+    </w:p>
+    <w:p>
+      <w:pPr>
+        <w:rPr>
+          <w:lang w:val="pt-PT"/>
+        </w:rPr>
+      </w:pPr>
+      <w:r>
+        <w:rPr>
+          <w:lang w:val="pt-PT"/>
+        </w:rPr>
+        <w:t>arquitetura de integração definida,</w:t>
+      </w:r>
+    </w:p>
+    <w:p>
+      <w:pPr>
+        <w:rPr>
+          <w:lang w:val="pt-PT"/>
+        </w:rPr>
+      </w:pPr>
+      <w:r>
+        <w:rPr>
+          <w:lang w:val="pt-PT"/>
+        </w:rPr>
+        <w:t xml:space="preserve">prontidão total para o </w:t>
+      </w:r>
+      <w:proofErr w:type="spellStart"/>
+      <w:r>
+        <w:rPr>
+          <w:lang w:val="pt-PT"/>
+        </w:rPr>
+        <w:t>dashboard</w:t>
+      </w:r>
+      <w:proofErr w:type="spellEnd"/>
+      <w:r>
+        <w:rPr>
+          <w:lang w:val="pt-PT"/>
+        </w:rPr>
+        <w:t xml:space="preserve"> final.</w:t>
+      </w:r>
+    </w:p>
+    <w:p>
+      <w:pPr>
+        <w:rPr>
+          <w:lang w:val="pt-PT"/>
+        </w:rPr>
+      </w:pPr>
+      <w:r>
+        <w:rPr>
+          <w:lang w:val="pt-PT"/>
+        </w:rPr>
+        <w:t>A próxima etapa será a implementação prática desses elementos (</w:t>
+      </w:r>
+      <w:proofErr w:type="spellStart"/>
+      <w:r>
+        <w:rPr>
+          <w:lang w:val="pt-PT"/>
+        </w:rPr>
+        <w:t>Issue</w:t>
+      </w:r>
+      <w:proofErr w:type="spellEnd"/>
+      <w:r>
+        <w:rPr>
+          <w:lang w:val="pt-PT"/>
+        </w:rPr>
+        <w:t xml:space="preserve"> 4.2 – </w:t>
+      </w:r>
+      <w:proofErr w:type="spellStart"/>
+      <w:r>
+        <w:rPr>
+          <w:lang w:val="pt-PT"/>
+        </w:rPr>
+        <w:t>Dashboard</w:t>
+      </w:r>
+      <w:proofErr w:type="spellEnd"/>
+      <w:r>
+        <w:rPr>
+          <w:lang w:val="pt-PT"/>
+        </w:rPr>
+        <w:t xml:space="preserve"> Final).</w:t>
+      </w:r>
+    </w:p>
+    <w:p>
+      <w:pPr>
+        <w:pStyle w:val="Ttulo1"/>
+        <w:rPr>
+          <w:lang w:val="pt-PT"/>
+        </w:rPr>
+      </w:pPr>
+      <w:r>
+        <w:rPr>
+          <w:lang w:val="pt-PT"/>
+        </w:rPr>
+        <w:t>8. Resumo Executivo (12 linhas)</w:t>
+      </w:r>
+    </w:p>
+    <w:p>
+      <w:pPr>
+        <w:rPr>
+          <w:lang w:val="pt-PT"/>
+        </w:rPr>
+      </w:pPr>
+      <w:r>
+        <w:rPr>
+          <w:lang w:val="pt-PT"/>
+        </w:rPr>
+        <w:t xml:space="preserve">A </w:t>
+      </w:r>
+      <w:proofErr w:type="spellStart"/>
+      <w:r>
+        <w:rPr>
+          <w:lang w:val="pt-PT"/>
+        </w:rPr>
+        <w:t>Issue</w:t>
+      </w:r>
+      <w:proofErr w:type="spellEnd"/>
+      <w:r>
+        <w:rPr>
+          <w:lang w:val="pt-PT"/>
+        </w:rPr>
+        <w:t xml:space="preserve"> 4.1 integrou IA ao projeto para gerar insights automáticos, textos explicativos e modelagem narrativa avançada.</w:t>
+      </w:r>
+    </w:p>
+    <w:p>
+      <w:pPr>
+        <w:rPr>
+          <w:lang w:val="pt-PT"/>
+        </w:rPr>
+      </w:pPr>
+      <w:r>
+        <w:rPr>
+          <w:lang w:val="pt-PT"/>
+        </w:rPr>
+        <w:t xml:space="preserve">Foram criados </w:t>
+      </w:r>
+      <w:proofErr w:type="spellStart"/>
+      <w:r>
+        <w:rPr>
+          <w:lang w:val="pt-PT"/>
+        </w:rPr>
+        <w:t>prompts</w:t>
+      </w:r>
+      <w:proofErr w:type="spellEnd"/>
+      <w:r>
+        <w:rPr>
+          <w:lang w:val="pt-PT"/>
+        </w:rPr>
+        <w:t xml:space="preserve"> especializados para produzir análises culturais, estatísticas e mercadológicas.</w:t>
+      </w:r>
+    </w:p>
+    <w:p>
+      <w:pPr>
+        <w:rPr>
+          <w:lang w:val="pt-PT"/>
+        </w:rPr>
+      </w:pPr>
+      <w:r>
+        <w:rPr>
+          <w:lang w:val="pt-PT"/>
+        </w:rPr>
+        <w:t>A IA gerou mais de 30 insights inteligentes, categorizados e interpretados.</w:t>
+      </w:r>
+    </w:p>
+    <w:p>
+      <w:pPr>
+        <w:rPr>
+          <w:lang w:val="pt-PT"/>
+        </w:rPr>
+      </w:pPr>
+      <w:r>
+        <w:rPr>
+          <w:lang w:val="pt-PT"/>
+        </w:rPr>
+        <w:t xml:space="preserve">Textos completos para o </w:t>
+      </w:r>
+      <w:proofErr w:type="spellStart"/>
+      <w:r>
+        <w:rPr>
+          <w:lang w:val="pt-PT"/>
+        </w:rPr>
+        <w:t>dashboard</w:t>
+      </w:r>
+      <w:proofErr w:type="spellEnd"/>
+      <w:r>
+        <w:rPr>
+          <w:lang w:val="pt-PT"/>
+        </w:rPr>
+        <w:t xml:space="preserve"> foram criados, incluindo introduções, </w:t>
+      </w:r>
+      <w:proofErr w:type="spellStart"/>
+      <w:r>
+        <w:rPr>
+          <w:lang w:val="pt-PT"/>
+        </w:rPr>
+        <w:t>tooltips</w:t>
+      </w:r>
+      <w:proofErr w:type="spellEnd"/>
+      <w:r>
+        <w:rPr>
+          <w:lang w:val="pt-PT"/>
+        </w:rPr>
+        <w:t>, conclusões e mensagens dinâmicas.</w:t>
+      </w:r>
+    </w:p>
+    <w:p>
+      <w:pPr>
+        <w:rPr>
+          <w:lang w:val="pt-PT"/>
+        </w:rPr>
+      </w:pPr>
+      <w:r>
+        <w:rPr>
+          <w:lang w:val="pt-PT"/>
+        </w:rPr>
+        <w:t>Foram propostas visualizações adicionais e métricas IA-</w:t>
+      </w:r>
+      <w:proofErr w:type="spellStart"/>
+      <w:r>
+        <w:rPr>
+          <w:lang w:val="pt-PT"/>
+        </w:rPr>
+        <w:t>driven</w:t>
+      </w:r>
+      <w:proofErr w:type="spellEnd"/>
+      <w:r>
+        <w:rPr>
+          <w:lang w:val="pt-PT"/>
+        </w:rPr>
+        <w:t>.</w:t>
+      </w:r>
+    </w:p>
+    <w:p>
+      <w:pPr>
+        <w:rPr>
+          <w:lang w:val="pt-PT"/>
+        </w:rPr>
+      </w:pPr>
+      <w:r>
+        <w:rPr>
+          <w:lang w:val="pt-PT"/>
+        </w:rPr>
+        <w:t xml:space="preserve">Foi modelado um </w:t>
+      </w:r>
+      <w:proofErr w:type="spellStart"/>
+      <w:r>
+        <w:rPr>
+          <w:lang w:val="pt-PT"/>
+        </w:rPr>
+        <w:t>endpoint</w:t>
+      </w:r>
+      <w:proofErr w:type="spellEnd"/>
+      <w:r>
+        <w:rPr>
+          <w:lang w:val="pt-PT"/>
+        </w:rPr>
+        <w:t xml:space="preserve"> conceitual para integração JSON.</w:t>
+      </w:r>
+    </w:p>
+    <w:p>
+      <w:pPr>
+        <w:rPr>
+          <w:lang w:val="pt-PT"/>
+        </w:rPr>
+      </w:pPr>
+      <w:r>
+        <w:rPr>
+          <w:lang w:val="pt-PT"/>
+        </w:rPr>
+        <w:t>Nenhum código precisava ser implementado nesta etapa — somente a modelagem e a documentação.</w:t>
+      </w:r>
+    </w:p>
+    <w:p>
+      <w:pPr>
+        <w:rPr>
+          <w:lang w:val="pt-PT"/>
+        </w:rPr>
+      </w:pPr>
+      <w:r>
+        <w:rPr>
+          <w:lang w:val="pt-PT"/>
+        </w:rPr>
+        <w:t xml:space="preserve">A </w:t>
+      </w:r>
+      <w:proofErr w:type="spellStart"/>
+      <w:r>
+        <w:rPr>
+          <w:lang w:val="pt-PT"/>
+        </w:rPr>
+        <w:t>Issue</w:t>
+      </w:r>
+      <w:proofErr w:type="spellEnd"/>
+      <w:r>
+        <w:rPr>
+          <w:lang w:val="pt-PT"/>
+        </w:rPr>
+        <w:t xml:space="preserve"> estabelece a base intelectual e narrativa para o </w:t>
+      </w:r>
+      <w:proofErr w:type="spellStart"/>
+      <w:r>
+        <w:rPr>
+          <w:lang w:val="pt-PT"/>
+        </w:rPr>
+        <w:t>dashboard</w:t>
+      </w:r>
+      <w:proofErr w:type="spellEnd"/>
+      <w:r>
+        <w:rPr>
+          <w:lang w:val="pt-PT"/>
+        </w:rPr>
+        <w:t xml:space="preserve"> final da Semana 4.2.</w:t>
+      </w:r>
+    </w:p>
+    <w:p>
+      <w:pPr>
+        <w:pStyle w:val="Ttulo1"/>
+        <w:rPr>
+          <w:lang w:val="pt-PT"/>
+        </w:rPr>
+      </w:pPr>
+      <w:r>
+        <w:rPr>
+          <w:lang w:val="pt-PT"/>
+        </w:rPr>
+        <w:t>CONCLUSÃO FINAL</w:t>
+      </w:r>
+    </w:p>
+    <w:p>
+      <w:pPr>
+        <w:rPr>
+          <w:lang w:val="pt-PT"/>
+        </w:rPr>
+      </w:pPr>
+      <w:r>
+        <w:rPr>
+          <w:rFonts w:ascii="Segoe UI Symbol" w:hAnsi="Segoe UI Symbol" w:cs="Segoe UI Symbol"/>
+          <w:lang w:val="pt-PT"/>
+        </w:rPr>
+        <w:t>✔</w:t>
+      </w:r>
+      <w:r>
+        <w:rPr>
+          <w:lang w:val="pt-PT"/>
+        </w:rPr>
+        <w:t xml:space="preserve"> A </w:t>
+      </w:r>
+      <w:proofErr w:type="spellStart"/>
+      <w:r>
+        <w:rPr>
+          <w:lang w:val="pt-PT"/>
+        </w:rPr>
+        <w:t>Issue</w:t>
+      </w:r>
+      <w:proofErr w:type="spellEnd"/>
+      <w:r>
+        <w:rPr>
+          <w:lang w:val="pt-PT"/>
+        </w:rPr>
+        <w:t xml:space="preserve"> 4.1 é totalmente teórica, porém profundamente técnica.</w:t>
+      </w:r>
+    </w:p>
+    <w:p>
+      <w:pPr>
+        <w:rPr>
+          <w:lang w:val="pt-PT"/>
+        </w:rPr>
+      </w:pPr>
+      <w:r>
+        <w:rPr>
+          <w:rFonts w:ascii="Segoe UI Symbol" w:hAnsi="Segoe UI Symbol" w:cs="Segoe UI Symbol"/>
+          <w:lang w:val="pt-PT"/>
+        </w:rPr>
+        <w:t>✔</w:t>
+      </w:r>
+      <w:r>
+        <w:rPr>
+          <w:lang w:val="pt-PT"/>
+        </w:rPr>
+        <w:t xml:space="preserve"> Você cumpriu TODAS as etapas com excelência.</w:t>
+      </w:r>
+    </w:p>
+    <w:p>
+      <w:pPr>
+        <w:rPr>
+          <w:lang w:val="pt-PT"/>
+        </w:rPr>
+      </w:pPr>
+      <w:r>
+        <w:rPr>
+          <w:rFonts w:ascii="Segoe UI Symbol" w:hAnsi="Segoe UI Symbol" w:cs="Segoe UI Symbol"/>
+          <w:lang w:val="pt-PT"/>
+        </w:rPr>
+        <w:lastRenderedPageBreak/>
+        <w:t>✔</w:t>
+      </w:r>
+      <w:r>
+        <w:rPr>
+          <w:lang w:val="pt-PT"/>
+        </w:rPr>
+        <w:t xml:space="preserve"> Agora o </w:t>
+      </w:r>
+      <w:proofErr w:type="spellStart"/>
+      <w:r>
+        <w:rPr>
+          <w:lang w:val="pt-PT"/>
+        </w:rPr>
+        <w:t>notebook</w:t>
+      </w:r>
+      <w:proofErr w:type="spellEnd"/>
+      <w:r>
+        <w:rPr>
+          <w:lang w:val="pt-PT"/>
+        </w:rPr>
+        <w:t xml:space="preserve">, o </w:t>
+      </w:r>
+      <w:proofErr w:type="spellStart"/>
+      <w:r>
+        <w:rPr>
+          <w:lang w:val="pt-PT"/>
+        </w:rPr>
+        <w:t>commit</w:t>
+      </w:r>
+      <w:proofErr w:type="spellEnd"/>
+      <w:r>
+        <w:rPr>
+          <w:lang w:val="pt-PT"/>
+        </w:rPr>
+        <w:t xml:space="preserve">, o relatório e o encerramento da </w:t>
+      </w:r>
+      <w:proofErr w:type="spellStart"/>
+      <w:r>
+        <w:rPr>
+          <w:lang w:val="pt-PT"/>
+        </w:rPr>
+        <w:t>issue</w:t>
+      </w:r>
+      <w:proofErr w:type="spellEnd"/>
+      <w:r>
+        <w:rPr>
+          <w:lang w:val="pt-PT"/>
+        </w:rPr>
+        <w:t xml:space="preserve"> estão prontos.</w:t>
       </w:r>
     </w:p>
     <w:sectPr>
@@ -11220,6 +14318,119 @@
     </w:lvl>
   </w:abstractNum>
   <w:abstractNum w:abstractNumId="18" w15:restartNumberingAfterBreak="0">
+    <w:nsid w:val="2F2270D7"/>
+    <w:multiLevelType w:val="hybridMultilevel"/>
+    <w:tmpl w:val="8692F632"/>
+    <w:lvl w:ilvl="0" w:tplc="08160001">
+      <w:start w:val="1"/>
+      <w:numFmt w:val="bullet"/>
+      <w:lvlText w:val=""/>
+      <w:lvlJc w:val="left"/>
+      <w:pPr>
+        <w:ind w:left="1429" w:hanging="360"/>
+      </w:pPr>
+      <w:rPr>
+        <w:rFonts w:ascii="Symbol" w:hAnsi="Symbol" w:hint="default"/>
+      </w:rPr>
+    </w:lvl>
+    <w:lvl w:ilvl="1" w:tplc="08160003" w:tentative="1">
+      <w:start w:val="1"/>
+      <w:numFmt w:val="bullet"/>
+      <w:lvlText w:val="o"/>
+      <w:lvlJc w:val="left"/>
+      <w:pPr>
+        <w:ind w:left="2149" w:hanging="360"/>
+      </w:pPr>
+      <w:rPr>
+        <w:rFonts w:ascii="Courier New" w:hAnsi="Courier New" w:cs="Courier New" w:hint="default"/>
+      </w:rPr>
+    </w:lvl>
+    <w:lvl w:ilvl="2" w:tplc="08160005" w:tentative="1">
+      <w:start w:val="1"/>
+      <w:numFmt w:val="bullet"/>
+      <w:lvlText w:val=""/>
+      <w:lvlJc w:val="left"/>
+      <w:pPr>
+        <w:ind w:left="2869" w:hanging="360"/>
+      </w:pPr>
+      <w:rPr>
+        <w:rFonts w:ascii="Wingdings" w:hAnsi="Wingdings" w:hint="default"/>
+      </w:rPr>
+    </w:lvl>
+    <w:lvl w:ilvl="3" w:tplc="08160001" w:tentative="1">
+      <w:start w:val="1"/>
+      <w:numFmt w:val="bullet"/>
+      <w:lvlText w:val=""/>
+      <w:lvlJc w:val="left"/>
+      <w:pPr>
+        <w:ind w:left="3589" w:hanging="360"/>
+      </w:pPr>
+      <w:rPr>
+        <w:rFonts w:ascii="Symbol" w:hAnsi="Symbol" w:hint="default"/>
+      </w:rPr>
+    </w:lvl>
+    <w:lvl w:ilvl="4" w:tplc="08160003" w:tentative="1">
+      <w:start w:val="1"/>
+      <w:numFmt w:val="bullet"/>
+      <w:lvlText w:val="o"/>
+      <w:lvlJc w:val="left"/>
+      <w:pPr>
+        <w:ind w:left="4309" w:hanging="360"/>
+      </w:pPr>
+      <w:rPr>
+        <w:rFonts w:ascii="Courier New" w:hAnsi="Courier New" w:cs="Courier New" w:hint="default"/>
+      </w:rPr>
+    </w:lvl>
+    <w:lvl w:ilvl="5" w:tplc="08160005" w:tentative="1">
+      <w:start w:val="1"/>
+      <w:numFmt w:val="bullet"/>
+      <w:lvlText w:val=""/>
+      <w:lvlJc w:val="left"/>
+      <w:pPr>
+        <w:ind w:left="5029" w:hanging="360"/>
+      </w:pPr>
+      <w:rPr>
+        <w:rFonts w:ascii="Wingdings" w:hAnsi="Wingdings" w:hint="default"/>
+      </w:rPr>
+    </w:lvl>
+    <w:lvl w:ilvl="6" w:tplc="08160001" w:tentative="1">
+      <w:start w:val="1"/>
+      <w:numFmt w:val="bullet"/>
+      <w:lvlText w:val=""/>
+      <w:lvlJc w:val="left"/>
+      <w:pPr>
+        <w:ind w:left="5749" w:hanging="360"/>
+      </w:pPr>
+      <w:rPr>
+        <w:rFonts w:ascii="Symbol" w:hAnsi="Symbol" w:hint="default"/>
+      </w:rPr>
+    </w:lvl>
+    <w:lvl w:ilvl="7" w:tplc="08160003" w:tentative="1">
+      <w:start w:val="1"/>
+      <w:numFmt w:val="bullet"/>
+      <w:lvlText w:val="o"/>
+      <w:lvlJc w:val="left"/>
+      <w:pPr>
+        <w:ind w:left="6469" w:hanging="360"/>
+      </w:pPr>
+      <w:rPr>
+        <w:rFonts w:ascii="Courier New" w:hAnsi="Courier New" w:cs="Courier New" w:hint="default"/>
+      </w:rPr>
+    </w:lvl>
+    <w:lvl w:ilvl="8" w:tplc="08160005" w:tentative="1">
+      <w:start w:val="1"/>
+      <w:numFmt w:val="bullet"/>
+      <w:lvlText w:val=""/>
+      <w:lvlJc w:val="left"/>
+      <w:pPr>
+        <w:ind w:left="7189" w:hanging="360"/>
+      </w:pPr>
+      <w:rPr>
+        <w:rFonts w:ascii="Wingdings" w:hAnsi="Wingdings" w:hint="default"/>
+      </w:rPr>
+    </w:lvl>
+  </w:abstractNum>
+  <w:abstractNum w:abstractNumId="19" w15:restartNumberingAfterBreak="0">
     <w:nsid w:val="2FA87073"/>
     <w:multiLevelType w:val="hybridMultilevel"/>
     <w:tmpl w:val="88025776"/>
@@ -11332,7 +14543,120 @@
       </w:rPr>
     </w:lvl>
   </w:abstractNum>
-  <w:abstractNum w:abstractNumId="19" w15:restartNumberingAfterBreak="0">
+  <w:abstractNum w:abstractNumId="20" w15:restartNumberingAfterBreak="0">
+    <w:nsid w:val="34AA1BF8"/>
+    <w:multiLevelType w:val="hybridMultilevel"/>
+    <w:tmpl w:val="4C8C225E"/>
+    <w:lvl w:ilvl="0" w:tplc="08160001">
+      <w:start w:val="1"/>
+      <w:numFmt w:val="bullet"/>
+      <w:lvlText w:val=""/>
+      <w:lvlJc w:val="left"/>
+      <w:pPr>
+        <w:ind w:left="1429" w:hanging="360"/>
+      </w:pPr>
+      <w:rPr>
+        <w:rFonts w:ascii="Symbol" w:hAnsi="Symbol" w:hint="default"/>
+      </w:rPr>
+    </w:lvl>
+    <w:lvl w:ilvl="1" w:tplc="08160003" w:tentative="1">
+      <w:start w:val="1"/>
+      <w:numFmt w:val="bullet"/>
+      <w:lvlText w:val="o"/>
+      <w:lvlJc w:val="left"/>
+      <w:pPr>
+        <w:ind w:left="2149" w:hanging="360"/>
+      </w:pPr>
+      <w:rPr>
+        <w:rFonts w:ascii="Courier New" w:hAnsi="Courier New" w:cs="Courier New" w:hint="default"/>
+      </w:rPr>
+    </w:lvl>
+    <w:lvl w:ilvl="2" w:tplc="08160005" w:tentative="1">
+      <w:start w:val="1"/>
+      <w:numFmt w:val="bullet"/>
+      <w:lvlText w:val=""/>
+      <w:lvlJc w:val="left"/>
+      <w:pPr>
+        <w:ind w:left="2869" w:hanging="360"/>
+      </w:pPr>
+      <w:rPr>
+        <w:rFonts w:ascii="Wingdings" w:hAnsi="Wingdings" w:hint="default"/>
+      </w:rPr>
+    </w:lvl>
+    <w:lvl w:ilvl="3" w:tplc="08160001" w:tentative="1">
+      <w:start w:val="1"/>
+      <w:numFmt w:val="bullet"/>
+      <w:lvlText w:val=""/>
+      <w:lvlJc w:val="left"/>
+      <w:pPr>
+        <w:ind w:left="3589" w:hanging="360"/>
+      </w:pPr>
+      <w:rPr>
+        <w:rFonts w:ascii="Symbol" w:hAnsi="Symbol" w:hint="default"/>
+      </w:rPr>
+    </w:lvl>
+    <w:lvl w:ilvl="4" w:tplc="08160003" w:tentative="1">
+      <w:start w:val="1"/>
+      <w:numFmt w:val="bullet"/>
+      <w:lvlText w:val="o"/>
+      <w:lvlJc w:val="left"/>
+      <w:pPr>
+        <w:ind w:left="4309" w:hanging="360"/>
+      </w:pPr>
+      <w:rPr>
+        <w:rFonts w:ascii="Courier New" w:hAnsi="Courier New" w:cs="Courier New" w:hint="default"/>
+      </w:rPr>
+    </w:lvl>
+    <w:lvl w:ilvl="5" w:tplc="08160005" w:tentative="1">
+      <w:start w:val="1"/>
+      <w:numFmt w:val="bullet"/>
+      <w:lvlText w:val=""/>
+      <w:lvlJc w:val="left"/>
+      <w:pPr>
+        <w:ind w:left="5029" w:hanging="360"/>
+      </w:pPr>
+      <w:rPr>
+        <w:rFonts w:ascii="Wingdings" w:hAnsi="Wingdings" w:hint="default"/>
+      </w:rPr>
+    </w:lvl>
+    <w:lvl w:ilvl="6" w:tplc="08160001" w:tentative="1">
+      <w:start w:val="1"/>
+      <w:numFmt w:val="bullet"/>
+      <w:lvlText w:val=""/>
+      <w:lvlJc w:val="left"/>
+      <w:pPr>
+        <w:ind w:left="5749" w:hanging="360"/>
+      </w:pPr>
+      <w:rPr>
+        <w:rFonts w:ascii="Symbol" w:hAnsi="Symbol" w:hint="default"/>
+      </w:rPr>
+    </w:lvl>
+    <w:lvl w:ilvl="7" w:tplc="08160003" w:tentative="1">
+      <w:start w:val="1"/>
+      <w:numFmt w:val="bullet"/>
+      <w:lvlText w:val="o"/>
+      <w:lvlJc w:val="left"/>
+      <w:pPr>
+        <w:ind w:left="6469" w:hanging="360"/>
+      </w:pPr>
+      <w:rPr>
+        <w:rFonts w:ascii="Courier New" w:hAnsi="Courier New" w:cs="Courier New" w:hint="default"/>
+      </w:rPr>
+    </w:lvl>
+    <w:lvl w:ilvl="8" w:tplc="08160005" w:tentative="1">
+      <w:start w:val="1"/>
+      <w:numFmt w:val="bullet"/>
+      <w:lvlText w:val=""/>
+      <w:lvlJc w:val="left"/>
+      <w:pPr>
+        <w:ind w:left="7189" w:hanging="360"/>
+      </w:pPr>
+      <w:rPr>
+        <w:rFonts w:ascii="Wingdings" w:hAnsi="Wingdings" w:hint="default"/>
+      </w:rPr>
+    </w:lvl>
+  </w:abstractNum>
+  <w:abstractNum w:abstractNumId="21" w15:restartNumberingAfterBreak="0">
     <w:nsid w:val="3C000E1F"/>
     <w:multiLevelType w:val="hybridMultilevel"/>
     <w:tmpl w:val="C6BC9CC0"/>
@@ -11445,7 +14769,7 @@
       </w:rPr>
     </w:lvl>
   </w:abstractNum>
-  <w:abstractNum w:abstractNumId="20" w15:restartNumberingAfterBreak="0">
+  <w:abstractNum w:abstractNumId="22" w15:restartNumberingAfterBreak="0">
     <w:nsid w:val="40524BAD"/>
     <w:multiLevelType w:val="hybridMultilevel"/>
     <w:tmpl w:val="D2582CD0"/>
@@ -11534,7 +14858,7 @@
       </w:pPr>
     </w:lvl>
   </w:abstractNum>
-  <w:abstractNum w:abstractNumId="21" w15:restartNumberingAfterBreak="0">
+  <w:abstractNum w:abstractNumId="23" w15:restartNumberingAfterBreak="0">
     <w:nsid w:val="48A073AD"/>
     <w:multiLevelType w:val="hybridMultilevel"/>
     <w:tmpl w:val="21B2143E"/>
@@ -11647,7 +14971,7 @@
       </w:rPr>
     </w:lvl>
   </w:abstractNum>
-  <w:abstractNum w:abstractNumId="22" w15:restartNumberingAfterBreak="0">
+  <w:abstractNum w:abstractNumId="24" w15:restartNumberingAfterBreak="0">
     <w:nsid w:val="4ADF222E"/>
     <w:multiLevelType w:val="hybridMultilevel"/>
     <w:tmpl w:val="FFAE58F6"/>
@@ -11760,7 +15084,7 @@
       </w:rPr>
     </w:lvl>
   </w:abstractNum>
-  <w:abstractNum w:abstractNumId="23" w15:restartNumberingAfterBreak="0">
+  <w:abstractNum w:abstractNumId="25" w15:restartNumberingAfterBreak="0">
     <w:nsid w:val="64E446CC"/>
     <w:multiLevelType w:val="hybridMultilevel"/>
     <w:tmpl w:val="6B864BFC"/>
@@ -11873,7 +15197,7 @@
       </w:rPr>
     </w:lvl>
   </w:abstractNum>
-  <w:abstractNum w:abstractNumId="24" w15:restartNumberingAfterBreak="0">
+  <w:abstractNum w:abstractNumId="26" w15:restartNumberingAfterBreak="0">
     <w:nsid w:val="67E76626"/>
     <w:multiLevelType w:val="hybridMultilevel"/>
     <w:tmpl w:val="2C96C970"/>
@@ -11986,10 +15310,123 @@
       </w:rPr>
     </w:lvl>
   </w:abstractNum>
-  <w:abstractNum w:abstractNumId="25" w15:restartNumberingAfterBreak="0">
+  <w:abstractNum w:abstractNumId="27" w15:restartNumberingAfterBreak="0">
     <w:nsid w:val="70344B19"/>
     <w:multiLevelType w:val="hybridMultilevel"/>
     <w:tmpl w:val="8AE61E4A"/>
+    <w:lvl w:ilvl="0" w:tplc="08160001">
+      <w:start w:val="1"/>
+      <w:numFmt w:val="bullet"/>
+      <w:lvlText w:val=""/>
+      <w:lvlJc w:val="left"/>
+      <w:pPr>
+        <w:ind w:left="1429" w:hanging="360"/>
+      </w:pPr>
+      <w:rPr>
+        <w:rFonts w:ascii="Symbol" w:hAnsi="Symbol" w:hint="default"/>
+      </w:rPr>
+    </w:lvl>
+    <w:lvl w:ilvl="1" w:tplc="08160003" w:tentative="1">
+      <w:start w:val="1"/>
+      <w:numFmt w:val="bullet"/>
+      <w:lvlText w:val="o"/>
+      <w:lvlJc w:val="left"/>
+      <w:pPr>
+        <w:ind w:left="2149" w:hanging="360"/>
+      </w:pPr>
+      <w:rPr>
+        <w:rFonts w:ascii="Courier New" w:hAnsi="Courier New" w:cs="Courier New" w:hint="default"/>
+      </w:rPr>
+    </w:lvl>
+    <w:lvl w:ilvl="2" w:tplc="08160005" w:tentative="1">
+      <w:start w:val="1"/>
+      <w:numFmt w:val="bullet"/>
+      <w:lvlText w:val=""/>
+      <w:lvlJc w:val="left"/>
+      <w:pPr>
+        <w:ind w:left="2869" w:hanging="360"/>
+      </w:pPr>
+      <w:rPr>
+        <w:rFonts w:ascii="Wingdings" w:hAnsi="Wingdings" w:hint="default"/>
+      </w:rPr>
+    </w:lvl>
+    <w:lvl w:ilvl="3" w:tplc="08160001" w:tentative="1">
+      <w:start w:val="1"/>
+      <w:numFmt w:val="bullet"/>
+      <w:lvlText w:val=""/>
+      <w:lvlJc w:val="left"/>
+      <w:pPr>
+        <w:ind w:left="3589" w:hanging="360"/>
+      </w:pPr>
+      <w:rPr>
+        <w:rFonts w:ascii="Symbol" w:hAnsi="Symbol" w:hint="default"/>
+      </w:rPr>
+    </w:lvl>
+    <w:lvl w:ilvl="4" w:tplc="08160003" w:tentative="1">
+      <w:start w:val="1"/>
+      <w:numFmt w:val="bullet"/>
+      <w:lvlText w:val="o"/>
+      <w:lvlJc w:val="left"/>
+      <w:pPr>
+        <w:ind w:left="4309" w:hanging="360"/>
+      </w:pPr>
+      <w:rPr>
+        <w:rFonts w:ascii="Courier New" w:hAnsi="Courier New" w:cs="Courier New" w:hint="default"/>
+      </w:rPr>
+    </w:lvl>
+    <w:lvl w:ilvl="5" w:tplc="08160005" w:tentative="1">
+      <w:start w:val="1"/>
+      <w:numFmt w:val="bullet"/>
+      <w:lvlText w:val=""/>
+      <w:lvlJc w:val="left"/>
+      <w:pPr>
+        <w:ind w:left="5029" w:hanging="360"/>
+      </w:pPr>
+      <w:rPr>
+        <w:rFonts w:ascii="Wingdings" w:hAnsi="Wingdings" w:hint="default"/>
+      </w:rPr>
+    </w:lvl>
+    <w:lvl w:ilvl="6" w:tplc="08160001" w:tentative="1">
+      <w:start w:val="1"/>
+      <w:numFmt w:val="bullet"/>
+      <w:lvlText w:val=""/>
+      <w:lvlJc w:val="left"/>
+      <w:pPr>
+        <w:ind w:left="5749" w:hanging="360"/>
+      </w:pPr>
+      <w:rPr>
+        <w:rFonts w:ascii="Symbol" w:hAnsi="Symbol" w:hint="default"/>
+      </w:rPr>
+    </w:lvl>
+    <w:lvl w:ilvl="7" w:tplc="08160003" w:tentative="1">
+      <w:start w:val="1"/>
+      <w:numFmt w:val="bullet"/>
+      <w:lvlText w:val="o"/>
+      <w:lvlJc w:val="left"/>
+      <w:pPr>
+        <w:ind w:left="6469" w:hanging="360"/>
+      </w:pPr>
+      <w:rPr>
+        <w:rFonts w:ascii="Courier New" w:hAnsi="Courier New" w:cs="Courier New" w:hint="default"/>
+      </w:rPr>
+    </w:lvl>
+    <w:lvl w:ilvl="8" w:tplc="08160005" w:tentative="1">
+      <w:start w:val="1"/>
+      <w:numFmt w:val="bullet"/>
+      <w:lvlText w:val=""/>
+      <w:lvlJc w:val="left"/>
+      <w:pPr>
+        <w:ind w:left="7189" w:hanging="360"/>
+      </w:pPr>
+      <w:rPr>
+        <w:rFonts w:ascii="Wingdings" w:hAnsi="Wingdings" w:hint="default"/>
+      </w:rPr>
+    </w:lvl>
+  </w:abstractNum>
+  <w:abstractNum w:abstractNumId="28" w15:restartNumberingAfterBreak="0">
+    <w:nsid w:val="720158C3"/>
+    <w:multiLevelType w:val="hybridMultilevel"/>
+    <w:tmpl w:val="F698E7C6"/>
     <w:lvl w:ilvl="0" w:tplc="08160001">
       <w:start w:val="1"/>
       <w:numFmt w:val="bullet"/>
@@ -12127,31 +15564,31 @@
     <w:abstractNumId w:val="0"/>
   </w:num>
   <w:num w:numId="10" w16cid:durableId="274293149">
-    <w:abstractNumId w:val="20"/>
+    <w:abstractNumId w:val="22"/>
   </w:num>
   <w:num w:numId="11" w16cid:durableId="1227834827">
-    <w:abstractNumId w:val="21"/>
+    <w:abstractNumId w:val="23"/>
   </w:num>
   <w:num w:numId="12" w16cid:durableId="547185612">
-    <w:abstractNumId w:val="24"/>
+    <w:abstractNumId w:val="26"/>
   </w:num>
   <w:num w:numId="13" w16cid:durableId="1743718560">
     <w:abstractNumId w:val="10"/>
   </w:num>
   <w:num w:numId="14" w16cid:durableId="1082529874">
-    <w:abstractNumId w:val="19"/>
+    <w:abstractNumId w:val="21"/>
   </w:num>
   <w:num w:numId="15" w16cid:durableId="484516274">
-    <w:abstractNumId w:val="23"/>
+    <w:abstractNumId w:val="25"/>
   </w:num>
   <w:num w:numId="16" w16cid:durableId="1856339249">
     <w:abstractNumId w:val="11"/>
   </w:num>
   <w:num w:numId="17" w16cid:durableId="1619487918">
-    <w:abstractNumId w:val="18"/>
+    <w:abstractNumId w:val="19"/>
   </w:num>
   <w:num w:numId="18" w16cid:durableId="114757494">
-    <w:abstractNumId w:val="22"/>
+    <w:abstractNumId w:val="24"/>
   </w:num>
   <w:num w:numId="19" w16cid:durableId="2037608939">
     <w:abstractNumId w:val="15"/>
@@ -12169,13 +15606,22 @@
     <w:abstractNumId w:val="14"/>
   </w:num>
   <w:num w:numId="24" w16cid:durableId="761800098">
-    <w:abstractNumId w:val="25"/>
+    <w:abstractNumId w:val="27"/>
   </w:num>
   <w:num w:numId="25" w16cid:durableId="2105876329">
     <w:abstractNumId w:val="17"/>
   </w:num>
   <w:num w:numId="26" w16cid:durableId="725760460">
     <w:abstractNumId w:val="12"/>
+  </w:num>
+  <w:num w:numId="27" w16cid:durableId="580411906">
+    <w:abstractNumId w:val="18"/>
+  </w:num>
+  <w:num w:numId="28" w16cid:durableId="1236746695">
+    <w:abstractNumId w:val="20"/>
+  </w:num>
+  <w:num w:numId="29" w16cid:durableId="1601178770">
+    <w:abstractNumId w:val="28"/>
   </w:num>
 </w:numbering>
 </file>

</xml_diff>